<commit_message>
Updated engineering journal. Information about mechanical platform.
</commit_message>
<xml_diff>
--- a/WRO_2026_Team_Hot_Glue_Engineering_Journal.docx
+++ b/WRO_2026_Team_Hot_Glue_Engineering_Journal.docx
@@ -10,6 +10,7 @@
           <w:docPartUnique/>
         </w:docPartObj>
       </w:sdtPr>
+      <w:sdtEndPr/>
       <w:sdtContent>
         <w:p/>
         <w:tbl>
@@ -45,6 +46,11 @@
                 <w:dataBinding w:prefixMappings="xmlns:ns0='http://schemas.openxmlformats.org/officeDocument/2006/extended-properties'" w:xpath="/ns0:Properties[1]/ns0:Company[1]" w:storeItemID="{6668398D-A668-4E3E-A5EB-62B293D839F1}"/>
                 <w:text/>
               </w:sdtPr>
+              <w:sdtEndPr>
+                <w:rPr>
+                  <w:rStyle w:val="TitleChar"/>
+                </w:rPr>
+              </w:sdtEndPr>
               <w:sdtContent>
                 <w:tc>
                   <w:tcPr>
@@ -96,6 +102,11 @@
                   <w:dataBinding w:prefixMappings="xmlns:ns0='http://schemas.openxmlformats.org/package/2006/metadata/core-properties' xmlns:ns1='http://purl.org/dc/elements/1.1/'" w:xpath="/ns0:coreProperties[1]/ns1:title[1]" w:storeItemID="{6C3C8BC8-F283-45AE-878A-BAB7291924A1}"/>
                   <w:text/>
                 </w:sdtPr>
+                <w:sdtEndPr>
+                  <w:rPr>
+                    <w:rStyle w:val="BookTitle"/>
+                  </w:rPr>
+                </w:sdtEndPr>
                 <w:sdtContent>
                   <w:p>
                     <w:pPr>
@@ -136,6 +147,11 @@
                 <w:dataBinding w:prefixMappings="xmlns:ns0='http://schemas.openxmlformats.org/package/2006/metadata/core-properties' xmlns:ns1='http://purl.org/dc/elements/1.1/'" w:xpath="/ns0:coreProperties[1]/ns1:subject[1]" w:storeItemID="{6C3C8BC8-F283-45AE-878A-BAB7291924A1}"/>
                 <w:text/>
               </w:sdtPr>
+              <w:sdtEndPr>
+                <w:rPr>
+                  <w:rStyle w:val="TitleChar"/>
+                </w:rPr>
+              </w:sdtEndPr>
               <w:sdtContent>
                 <w:tc>
                   <w:tcPr>
@@ -198,13 +214,11 @@
                   <w:dataBinding w:prefixMappings="xmlns:ns0='http://schemas.openxmlformats.org/package/2006/metadata/core-properties' xmlns:ns1='http://purl.org/dc/elements/1.1/'" w:xpath="/ns0:coreProperties[1]/ns1:creator[1]" w:storeItemID="{6C3C8BC8-F283-45AE-878A-BAB7291924A1}"/>
                   <w:text/>
                 </w:sdtPr>
+                <w:sdtEndPr/>
                 <w:sdtContent>
                   <w:p>
                     <w:r>
-                      <w:t>Lukas Mažrimas</w:t>
-                    </w:r>
-                    <w:r>
-                      <w:t xml:space="preserve">, Jokūbas Buta, Jokūbas </w:t>
+                      <w:t xml:space="preserve">Lukas Mažrimas, Jokūbas Buta, Jokūbas </w:t>
                     </w:r>
                     <w:proofErr w:type="spellStart"/>
                     <w:r>
@@ -244,6 +258,12 @@
     </w:sdt>
     <w:sdt>
       <w:sdtPr>
+        <w:rPr>
+          <w:rFonts w:ascii="Arial Nova" w:eastAsiaTheme="minorEastAsia" w:hAnsi="Arial Nova" w:cstheme="minorBidi"/>
+          <w:color w:val="auto"/>
+          <w:szCs w:val="22"/>
+          <w:lang w:eastAsia="ja-JP"/>
+        </w:rPr>
         <w:id w:val="1818917072"/>
         <w:docPartObj>
           <w:docPartGallery w:val="Table of Contents"/>
@@ -252,13 +272,9 @@
       </w:sdtPr>
       <w:sdtEndPr>
         <w:rPr>
-          <w:rFonts w:ascii="Arial Nova" w:eastAsiaTheme="minorEastAsia" w:hAnsi="Arial Nova" w:cstheme="minorBidi"/>
           <w:b/>
           <w:bCs/>
           <w:noProof/>
-          <w:color w:val="auto"/>
-          <w:szCs w:val="22"/>
-          <w:lang w:eastAsia="ja-JP"/>
         </w:rPr>
       </w:sdtEndPr>
       <w:sdtContent>
@@ -297,7 +313,7 @@
           <w:r>
             <w:fldChar w:fldCharType="separate"/>
           </w:r>
-          <w:hyperlink w:anchor="_Toc223879311" w:history="1">
+          <w:hyperlink w:anchor="_Toc226578599" w:history="1">
             <w:r>
               <w:rPr>
                 <w:rStyle w:val="Hyperlink"/>
@@ -324,7 +340,7 @@
                 <w:noProof/>
                 <w:webHidden/>
               </w:rPr>
-              <w:instrText xml:space="preserve"> PAGEREF _Toc223879311 \h </w:instrText>
+              <w:instrText xml:space="preserve"> PAGEREF _Toc226578599 \h </w:instrText>
             </w:r>
             <w:r>
               <w:rPr>
@@ -367,7 +383,7 @@
               <w:sz w:val="22"/>
             </w:rPr>
           </w:pPr>
-          <w:hyperlink w:anchor="_Toc223879312" w:history="1">
+          <w:hyperlink w:anchor="_Toc226578600" w:history="1">
             <w:r>
               <w:rPr>
                 <w:rStyle w:val="Hyperlink"/>
@@ -394,7 +410,7 @@
                 <w:noProof/>
                 <w:webHidden/>
               </w:rPr>
-              <w:instrText xml:space="preserve"> PAGEREF _Toc223879312 \h </w:instrText>
+              <w:instrText xml:space="preserve"> PAGEREF _Toc226578600 \h </w:instrText>
             </w:r>
             <w:r>
               <w:rPr>
@@ -432,10 +448,12 @@
               <w:tab w:val="right" w:leader="dot" w:pos="9736"/>
             </w:tabs>
             <w:rPr>
+              <w:rFonts w:asciiTheme="minorHAnsi" w:hAnsiTheme="minorHAnsi"/>
               <w:noProof/>
+              <w:sz w:val="22"/>
             </w:rPr>
           </w:pPr>
-          <w:hyperlink w:anchor="_Toc223879313" w:history="1">
+          <w:hyperlink w:anchor="_Toc226578601" w:history="1">
             <w:r>
               <w:rPr>
                 <w:rStyle w:val="Hyperlink"/>
@@ -462,7 +480,7 @@
                 <w:noProof/>
                 <w:webHidden/>
               </w:rPr>
-              <w:instrText xml:space="preserve"> PAGEREF _Toc223879313 \h </w:instrText>
+              <w:instrText xml:space="preserve"> PAGEREF _Toc226578601 \h </w:instrText>
             </w:r>
             <w:r>
               <w:rPr>
@@ -500,10 +518,12 @@
               <w:tab w:val="right" w:leader="dot" w:pos="9736"/>
             </w:tabs>
             <w:rPr>
+              <w:rFonts w:asciiTheme="minorHAnsi" w:hAnsiTheme="minorHAnsi"/>
               <w:noProof/>
+              <w:sz w:val="22"/>
             </w:rPr>
           </w:pPr>
-          <w:hyperlink w:anchor="_Toc223879314" w:history="1">
+          <w:hyperlink w:anchor="_Toc226578602" w:history="1">
             <w:r>
               <w:rPr>
                 <w:rStyle w:val="Hyperlink"/>
@@ -530,7 +550,7 @@
                 <w:noProof/>
                 <w:webHidden/>
               </w:rPr>
-              <w:instrText xml:space="preserve"> PAGEREF _Toc223879314 \h </w:instrText>
+              <w:instrText xml:space="preserve"> PAGEREF _Toc226578602 \h </w:instrText>
             </w:r>
             <w:r>
               <w:rPr>
@@ -568,16 +588,18 @@
               <w:tab w:val="right" w:leader="dot" w:pos="9736"/>
             </w:tabs>
             <w:rPr>
+              <w:rFonts w:asciiTheme="minorHAnsi" w:hAnsiTheme="minorHAnsi"/>
               <w:noProof/>
+              <w:sz w:val="22"/>
             </w:rPr>
           </w:pPr>
-          <w:hyperlink w:anchor="_Toc223879315" w:history="1">
+          <w:hyperlink w:anchor="_Toc226578603" w:history="1">
             <w:r>
               <w:rPr>
                 <w:rStyle w:val="Hyperlink"/>
                 <w:noProof/>
               </w:rPr>
-              <w:t>1.3. Design philosophy</w:t>
+              <w:t>1.3. Physical assembly</w:t>
             </w:r>
             <w:r>
               <w:rPr>
@@ -598,7 +620,7 @@
                 <w:noProof/>
                 <w:webHidden/>
               </w:rPr>
-              <w:instrText xml:space="preserve"> PAGEREF _Toc223879315 \h </w:instrText>
+              <w:instrText xml:space="preserve"> PAGEREF _Toc226578603 \h </w:instrText>
             </w:r>
             <w:r>
               <w:rPr>
@@ -619,6 +641,146 @@
                 <w:webHidden/>
               </w:rPr>
               <w:t>4</w:t>
+            </w:r>
+            <w:r>
+              <w:rPr>
+                <w:noProof/>
+                <w:webHidden/>
+              </w:rPr>
+              <w:fldChar w:fldCharType="end"/>
+            </w:r>
+          </w:hyperlink>
+        </w:p>
+        <w:p>
+          <w:pPr>
+            <w:pStyle w:val="TOC2"/>
+            <w:tabs>
+              <w:tab w:val="right" w:leader="dot" w:pos="9736"/>
+            </w:tabs>
+            <w:rPr>
+              <w:rFonts w:asciiTheme="minorHAnsi" w:hAnsiTheme="minorHAnsi"/>
+              <w:noProof/>
+              <w:sz w:val="22"/>
+            </w:rPr>
+          </w:pPr>
+          <w:hyperlink w:anchor="_Toc226578604" w:history="1">
+            <w:r>
+              <w:rPr>
+                <w:rStyle w:val="Hyperlink"/>
+                <w:noProof/>
+              </w:rPr>
+              <w:t>1.4. Software</w:t>
+            </w:r>
+            <w:r>
+              <w:rPr>
+                <w:noProof/>
+                <w:webHidden/>
+              </w:rPr>
+              <w:tab/>
+            </w:r>
+            <w:r>
+              <w:rPr>
+                <w:noProof/>
+                <w:webHidden/>
+              </w:rPr>
+              <w:fldChar w:fldCharType="begin"/>
+            </w:r>
+            <w:r>
+              <w:rPr>
+                <w:noProof/>
+                <w:webHidden/>
+              </w:rPr>
+              <w:instrText xml:space="preserve"> PAGEREF _Toc226578604 \h </w:instrText>
+            </w:r>
+            <w:r>
+              <w:rPr>
+                <w:noProof/>
+                <w:webHidden/>
+              </w:rPr>
+            </w:r>
+            <w:r>
+              <w:rPr>
+                <w:noProof/>
+                <w:webHidden/>
+              </w:rPr>
+              <w:fldChar w:fldCharType="separate"/>
+            </w:r>
+            <w:r>
+              <w:rPr>
+                <w:noProof/>
+                <w:webHidden/>
+              </w:rPr>
+              <w:t>4</w:t>
+            </w:r>
+            <w:r>
+              <w:rPr>
+                <w:noProof/>
+                <w:webHidden/>
+              </w:rPr>
+              <w:fldChar w:fldCharType="end"/>
+            </w:r>
+          </w:hyperlink>
+        </w:p>
+        <w:p>
+          <w:pPr>
+            <w:pStyle w:val="TOC2"/>
+            <w:tabs>
+              <w:tab w:val="right" w:leader="dot" w:pos="9736"/>
+            </w:tabs>
+            <w:rPr>
+              <w:rFonts w:asciiTheme="minorHAnsi" w:hAnsiTheme="minorHAnsi"/>
+              <w:noProof/>
+              <w:sz w:val="22"/>
+            </w:rPr>
+          </w:pPr>
+          <w:hyperlink w:anchor="_Toc226578605" w:history="1">
+            <w:r>
+              <w:rPr>
+                <w:rStyle w:val="Hyperlink"/>
+                <w:noProof/>
+              </w:rPr>
+              <w:t>1.5. Design philosophy</w:t>
+            </w:r>
+            <w:r>
+              <w:rPr>
+                <w:noProof/>
+                <w:webHidden/>
+              </w:rPr>
+              <w:tab/>
+            </w:r>
+            <w:r>
+              <w:rPr>
+                <w:noProof/>
+                <w:webHidden/>
+              </w:rPr>
+              <w:fldChar w:fldCharType="begin"/>
+            </w:r>
+            <w:r>
+              <w:rPr>
+                <w:noProof/>
+                <w:webHidden/>
+              </w:rPr>
+              <w:instrText xml:space="preserve"> PAGEREF _Toc226578605 \h </w:instrText>
+            </w:r>
+            <w:r>
+              <w:rPr>
+                <w:noProof/>
+                <w:webHidden/>
+              </w:rPr>
+            </w:r>
+            <w:r>
+              <w:rPr>
+                <w:noProof/>
+                <w:webHidden/>
+              </w:rPr>
+              <w:fldChar w:fldCharType="separate"/>
+            </w:r>
+            <w:r>
+              <w:rPr>
+                <w:noProof/>
+                <w:webHidden/>
+              </w:rPr>
+              <w:t>5</w:t>
             </w:r>
             <w:r>
               <w:rPr>
@@ -641,7 +803,7 @@
               <w:sz w:val="22"/>
             </w:rPr>
           </w:pPr>
-          <w:hyperlink w:anchor="_Toc223879316" w:history="1">
+          <w:hyperlink w:anchor="_Toc226578606" w:history="1">
             <w:r>
               <w:rPr>
                 <w:rStyle w:val="Hyperlink"/>
@@ -668,7 +830,7 @@
                 <w:noProof/>
                 <w:webHidden/>
               </w:rPr>
-              <w:instrText xml:space="preserve"> PAGEREF _Toc223879316 \h </w:instrText>
+              <w:instrText xml:space="preserve"> PAGEREF _Toc226578606 \h </w:instrText>
             </w:r>
             <w:r>
               <w:rPr>
@@ -688,7 +850,7 @@
                 <w:noProof/>
                 <w:webHidden/>
               </w:rPr>
-              <w:t>5</w:t>
+              <w:t>6</w:t>
             </w:r>
             <w:r>
               <w:rPr>
@@ -706,10 +868,12 @@
               <w:tab w:val="right" w:leader="dot" w:pos="9736"/>
             </w:tabs>
             <w:rPr>
+              <w:rFonts w:asciiTheme="minorHAnsi" w:hAnsiTheme="minorHAnsi"/>
               <w:noProof/>
+              <w:sz w:val="22"/>
             </w:rPr>
           </w:pPr>
-          <w:hyperlink w:anchor="_Toc223879317" w:history="1">
+          <w:hyperlink w:anchor="_Toc226578607" w:history="1">
             <w:r>
               <w:rPr>
                 <w:rStyle w:val="Hyperlink"/>
@@ -736,7 +900,7 @@
                 <w:noProof/>
                 <w:webHidden/>
               </w:rPr>
-              <w:instrText xml:space="preserve"> PAGEREF _Toc223879317 \h </w:instrText>
+              <w:instrText xml:space="preserve"> PAGEREF _Toc226578607 \h </w:instrText>
             </w:r>
             <w:r>
               <w:rPr>
@@ -756,7 +920,7 @@
                 <w:noProof/>
                 <w:webHidden/>
               </w:rPr>
-              <w:t>5</w:t>
+              <w:t>6</w:t>
             </w:r>
             <w:r>
               <w:rPr>
@@ -774,16 +938,18 @@
               <w:tab w:val="right" w:leader="dot" w:pos="9736"/>
             </w:tabs>
             <w:rPr>
+              <w:rFonts w:asciiTheme="minorHAnsi" w:hAnsiTheme="minorHAnsi"/>
               <w:noProof/>
+              <w:sz w:val="22"/>
             </w:rPr>
           </w:pPr>
-          <w:hyperlink w:anchor="_Toc223879318" w:history="1">
+          <w:hyperlink w:anchor="_Toc226578608" w:history="1">
             <w:r>
               <w:rPr>
                 <w:rStyle w:val="Hyperlink"/>
                 <w:noProof/>
               </w:rPr>
-              <w:t>2.2. Steering</w:t>
+              <w:t>2.2. Stock components</w:t>
             </w:r>
             <w:r>
               <w:rPr>
@@ -804,7 +970,7 @@
                 <w:noProof/>
                 <w:webHidden/>
               </w:rPr>
-              <w:instrText xml:space="preserve"> PAGEREF _Toc223879318 \h </w:instrText>
+              <w:instrText xml:space="preserve"> PAGEREF _Toc226578608 \h </w:instrText>
             </w:r>
             <w:r>
               <w:rPr>
@@ -824,7 +990,217 @@
                 <w:noProof/>
                 <w:webHidden/>
               </w:rPr>
-              <w:t>5</w:t>
+              <w:t>6</w:t>
+            </w:r>
+            <w:r>
+              <w:rPr>
+                <w:noProof/>
+                <w:webHidden/>
+              </w:rPr>
+              <w:fldChar w:fldCharType="end"/>
+            </w:r>
+          </w:hyperlink>
+        </w:p>
+        <w:p>
+          <w:pPr>
+            <w:pStyle w:val="TOC2"/>
+            <w:tabs>
+              <w:tab w:val="right" w:leader="dot" w:pos="9736"/>
+            </w:tabs>
+            <w:rPr>
+              <w:rFonts w:asciiTheme="minorHAnsi" w:hAnsiTheme="minorHAnsi"/>
+              <w:noProof/>
+              <w:sz w:val="22"/>
+            </w:rPr>
+          </w:pPr>
+          <w:hyperlink w:anchor="_Toc226578609" w:history="1">
+            <w:r>
+              <w:rPr>
+                <w:rStyle w:val="Hyperlink"/>
+                <w:noProof/>
+              </w:rPr>
+              <w:t>2.3. Steering</w:t>
+            </w:r>
+            <w:r>
+              <w:rPr>
+                <w:noProof/>
+                <w:webHidden/>
+              </w:rPr>
+              <w:tab/>
+            </w:r>
+            <w:r>
+              <w:rPr>
+                <w:noProof/>
+                <w:webHidden/>
+              </w:rPr>
+              <w:fldChar w:fldCharType="begin"/>
+            </w:r>
+            <w:r>
+              <w:rPr>
+                <w:noProof/>
+                <w:webHidden/>
+              </w:rPr>
+              <w:instrText xml:space="preserve"> PAGEREF _Toc226578609 \h </w:instrText>
+            </w:r>
+            <w:r>
+              <w:rPr>
+                <w:noProof/>
+                <w:webHidden/>
+              </w:rPr>
+            </w:r>
+            <w:r>
+              <w:rPr>
+                <w:noProof/>
+                <w:webHidden/>
+              </w:rPr>
+              <w:fldChar w:fldCharType="separate"/>
+            </w:r>
+            <w:r>
+              <w:rPr>
+                <w:noProof/>
+                <w:webHidden/>
+              </w:rPr>
+              <w:t>6</w:t>
+            </w:r>
+            <w:r>
+              <w:rPr>
+                <w:noProof/>
+                <w:webHidden/>
+              </w:rPr>
+              <w:fldChar w:fldCharType="end"/>
+            </w:r>
+          </w:hyperlink>
+        </w:p>
+        <w:p>
+          <w:pPr>
+            <w:pStyle w:val="TOC2"/>
+            <w:tabs>
+              <w:tab w:val="right" w:leader="dot" w:pos="9736"/>
+            </w:tabs>
+            <w:rPr>
+              <w:rFonts w:asciiTheme="minorHAnsi" w:hAnsiTheme="minorHAnsi"/>
+              <w:noProof/>
+              <w:sz w:val="22"/>
+            </w:rPr>
+          </w:pPr>
+          <w:hyperlink w:anchor="_Toc226578610" w:history="1">
+            <w:r>
+              <w:rPr>
+                <w:rStyle w:val="Hyperlink"/>
+                <w:noProof/>
+              </w:rPr>
+              <w:t>2.4. Chassis</w:t>
+            </w:r>
+            <w:r>
+              <w:rPr>
+                <w:noProof/>
+                <w:webHidden/>
+              </w:rPr>
+              <w:tab/>
+            </w:r>
+            <w:r>
+              <w:rPr>
+                <w:noProof/>
+                <w:webHidden/>
+              </w:rPr>
+              <w:fldChar w:fldCharType="begin"/>
+            </w:r>
+            <w:r>
+              <w:rPr>
+                <w:noProof/>
+                <w:webHidden/>
+              </w:rPr>
+              <w:instrText xml:space="preserve"> PAGEREF _Toc226578610 \h </w:instrText>
+            </w:r>
+            <w:r>
+              <w:rPr>
+                <w:noProof/>
+                <w:webHidden/>
+              </w:rPr>
+            </w:r>
+            <w:r>
+              <w:rPr>
+                <w:noProof/>
+                <w:webHidden/>
+              </w:rPr>
+              <w:fldChar w:fldCharType="separate"/>
+            </w:r>
+            <w:r>
+              <w:rPr>
+                <w:noProof/>
+                <w:webHidden/>
+              </w:rPr>
+              <w:t>10</w:t>
+            </w:r>
+            <w:r>
+              <w:rPr>
+                <w:noProof/>
+                <w:webHidden/>
+              </w:rPr>
+              <w:fldChar w:fldCharType="end"/>
+            </w:r>
+          </w:hyperlink>
+        </w:p>
+        <w:p>
+          <w:pPr>
+            <w:pStyle w:val="TOC2"/>
+            <w:tabs>
+              <w:tab w:val="right" w:leader="dot" w:pos="9736"/>
+            </w:tabs>
+            <w:rPr>
+              <w:rFonts w:asciiTheme="minorHAnsi" w:hAnsiTheme="minorHAnsi"/>
+              <w:noProof/>
+              <w:sz w:val="22"/>
+            </w:rPr>
+          </w:pPr>
+          <w:hyperlink w:anchor="_Toc226578611" w:history="1">
+            <w:r>
+              <w:rPr>
+                <w:rStyle w:val="Hyperlink"/>
+                <w:noProof/>
+              </w:rPr>
+              <w:t>2.5. Driven axle</w:t>
+            </w:r>
+            <w:r>
+              <w:rPr>
+                <w:noProof/>
+                <w:webHidden/>
+              </w:rPr>
+              <w:tab/>
+            </w:r>
+            <w:r>
+              <w:rPr>
+                <w:noProof/>
+                <w:webHidden/>
+              </w:rPr>
+              <w:fldChar w:fldCharType="begin"/>
+            </w:r>
+            <w:r>
+              <w:rPr>
+                <w:noProof/>
+                <w:webHidden/>
+              </w:rPr>
+              <w:instrText xml:space="preserve"> PAGEREF _Toc226578611 \h </w:instrText>
+            </w:r>
+            <w:r>
+              <w:rPr>
+                <w:noProof/>
+                <w:webHidden/>
+              </w:rPr>
+            </w:r>
+            <w:r>
+              <w:rPr>
+                <w:noProof/>
+                <w:webHidden/>
+              </w:rPr>
+              <w:fldChar w:fldCharType="separate"/>
+            </w:r>
+            <w:r>
+              <w:rPr>
+                <w:noProof/>
+                <w:webHidden/>
+              </w:rPr>
+              <w:t>10</w:t>
             </w:r>
             <w:r>
               <w:rPr>
@@ -847,7 +1223,7 @@
               <w:sz w:val="22"/>
             </w:rPr>
           </w:pPr>
-          <w:hyperlink w:anchor="_Toc223879319" w:history="1">
+          <w:hyperlink w:anchor="_Toc226578612" w:history="1">
             <w:r>
               <w:rPr>
                 <w:rStyle w:val="Hyperlink"/>
@@ -874,7 +1250,7 @@
                 <w:noProof/>
                 <w:webHidden/>
               </w:rPr>
-              <w:instrText xml:space="preserve"> PAGEREF _Toc223879319 \h </w:instrText>
+              <w:instrText xml:space="preserve"> PAGEREF _Toc226578612 \h </w:instrText>
             </w:r>
             <w:r>
               <w:rPr>
@@ -894,7 +1270,7 @@
                 <w:noProof/>
                 <w:webHidden/>
               </w:rPr>
-              <w:t>6</w:t>
+              <w:t>11</w:t>
             </w:r>
             <w:r>
               <w:rPr>
@@ -917,7 +1293,7 @@
               <w:sz w:val="22"/>
             </w:rPr>
           </w:pPr>
-          <w:hyperlink w:anchor="_Toc223879320" w:history="1">
+          <w:hyperlink w:anchor="_Toc226578613" w:history="1">
             <w:r>
               <w:rPr>
                 <w:rStyle w:val="Hyperlink"/>
@@ -944,7 +1320,7 @@
                 <w:noProof/>
                 <w:webHidden/>
               </w:rPr>
-              <w:instrText xml:space="preserve"> PAGEREF _Toc223879320 \h </w:instrText>
+              <w:instrText xml:space="preserve"> PAGEREF _Toc226578613 \h </w:instrText>
             </w:r>
             <w:r>
               <w:rPr>
@@ -964,7 +1340,7 @@
                 <w:noProof/>
                 <w:webHidden/>
               </w:rPr>
-              <w:t>7</w:t>
+              <w:t>12</w:t>
             </w:r>
             <w:r>
               <w:rPr>
@@ -1005,7 +1381,7 @@
       <w:pPr>
         <w:pStyle w:val="Heading1"/>
       </w:pPr>
-      <w:bookmarkStart w:id="0" w:name="_Toc223879311"/>
+      <w:bookmarkStart w:id="0" w:name="_Toc226578599"/>
       <w:r>
         <w:lastRenderedPageBreak/>
         <w:t>Preface</w:t>
@@ -1014,76 +1390,23 @@
     </w:p>
     <w:p>
       <w:r>
-        <w:t>This document is designed to explain some key aspects of the design of our team’s robot. Before beginning, there is, in our opinion, benefit in explaining some terminology</w:t>
-      </w:r>
-      <w:r>
-        <w:t xml:space="preserve"> and overall document’s structure</w:t>
-      </w:r>
-      <w:r>
-        <w:t xml:space="preserve"> first:</w:t>
-      </w:r>
-    </w:p>
-    <w:p>
-      <w:r>
-        <w:t>During the design process, the robot acquired an informal name, “</w:t>
-      </w:r>
-      <w:proofErr w:type="spellStart"/>
-      <w:r>
-        <w:t>Bobotas</w:t>
-      </w:r>
-      <w:proofErr w:type="spellEnd"/>
-      <w:r>
-        <w:t>”. This came from an inside joke in a different (Lithuanian) language and explaining it would be a long and complicated endeavor. What we want to highlight, though, is that we will use this name translated to English (“</w:t>
-      </w:r>
-      <w:proofErr w:type="spellStart"/>
-      <w:r>
-        <w:t>Bobot</w:t>
-      </w:r>
-      <w:proofErr w:type="spellEnd"/>
-      <w:r>
-        <w:t xml:space="preserve">”) alongside a </w:t>
-      </w:r>
-      <w:r>
-        <w:t>simple</w:t>
-      </w:r>
-      <w:r>
-        <w:t xml:space="preserve"> “robot”</w:t>
-      </w:r>
-      <w:r>
-        <w:t xml:space="preserve"> when referring to our robot. </w:t>
-      </w:r>
-    </w:p>
-    <w:p>
-      <w:r>
-        <w:t>The journal has a couple of distinct chapters, each explaining a different area of the robot’s development. Moreover, the chapters also showcase the chronological order of the development, meaning, that, for example, the mechanical platform was first created and then all the sensors and circuits were tailored to the existing platform.</w:t>
+        <w:t>This document is designed to explain some key aspects of the design of our team’s robot.</w:t>
+      </w:r>
+      <w:r>
+        <w:t xml:space="preserve"> </w:t>
+      </w:r>
+      <w:r>
+        <w:t>The journal has a couple of distinct chapters, each explaining a different area of the robot’s development. Moreover, the chapters showcase the chronological order of the development, meaning that, for example, the mechanical platform was first created and then all the sensors and circuits were tailored to the existing platform.</w:t>
       </w:r>
       <w:r>
         <w:t xml:space="preserve"> The reasoning behind this will be explained in </w:t>
       </w:r>
-      <w:hyperlink w:anchor="_1._Structuring_the" w:history="1">
+      <w:hyperlink w:anchor="_1.2._Design_process" w:history="1">
         <w:r>
           <w:rPr>
             <w:rStyle w:val="Hyperlink"/>
           </w:rPr>
-          <w:t>chap</w:t>
-        </w:r>
-        <w:r>
-          <w:rPr>
-            <w:rStyle w:val="Hyperlink"/>
-          </w:rPr>
-          <w:t>t</w:t>
-        </w:r>
-        <w:r>
-          <w:rPr>
-            <w:rStyle w:val="Hyperlink"/>
-          </w:rPr>
-          <w:t>e</w:t>
-        </w:r>
-        <w:r>
-          <w:rPr>
-            <w:rStyle w:val="Hyperlink"/>
-          </w:rPr>
-          <w:t>r 1</w:t>
+          <w:t>chapter 1</w:t>
         </w:r>
       </w:hyperlink>
       <w:r>
@@ -1100,7 +1423,7 @@
         <w:pStyle w:val="Heading1"/>
       </w:pPr>
       <w:bookmarkStart w:id="1" w:name="_1._Structuring_the"/>
-      <w:bookmarkStart w:id="2" w:name="_Toc223879312"/>
+      <w:bookmarkStart w:id="2" w:name="_Toc226578600"/>
       <w:bookmarkEnd w:id="1"/>
       <w:r>
         <w:lastRenderedPageBreak/>
@@ -1124,7 +1447,7 @@
       <w:pPr>
         <w:pStyle w:val="Heading2"/>
       </w:pPr>
-      <w:bookmarkStart w:id="3" w:name="_Toc223879313"/>
+      <w:bookmarkStart w:id="3" w:name="_Toc226578601"/>
       <w:r>
         <w:t>1.1. Team structure and workflow</w:t>
       </w:r>
@@ -1186,7 +1509,13 @@
     </w:p>
     <w:p>
       <w:r>
-        <w:t xml:space="preserve">There was, of course, a great deal of team effort and solving problems together, but giving primarily one type of work to each team member was beneficial and efficient for a multitude of reasons. First, we all come from different backgrounds and have different types of experience and skillsets. </w:t>
+        <w:t>There was, of course, a great deal of team effort and solving problems together, but giving primarily one type of work to each team member was beneficial and efficient for a multitude of reasons. First</w:t>
+      </w:r>
+      <w:r>
+        <w:t>ly</w:t>
+      </w:r>
+      <w:r>
+        <w:t xml:space="preserve">, we all come from different backgrounds and have different types of experience and skillsets. </w:t>
       </w:r>
       <w:r>
         <w:t>Therefore, i</w:t>
@@ -1195,18 +1524,32 @@
         <w:t xml:space="preserve">t makes sense to have the person, who is best at coding, design most of the software. It also makes sense having all the soldering done by the person who has the most experience with soldering. </w:t>
       </w:r>
       <w:r>
-        <w:t>Moreover, a mechanical platform will be better if made by one most proficient in physics. Second, creating a robot is no simple feat and each of us learned a lot in the process. We found it much easier and better for us to each concentrate on one particular field and do lots of in-depth research in that particular field, rather than us all trying to juggle everything at once.</w:t>
+        <w:t>Moreover, a mechanical platform will be better if made by one most proficient in physics. Second</w:t>
+      </w:r>
+      <w:r>
+        <w:t>ly</w:t>
+      </w:r>
+      <w:r>
+        <w:t xml:space="preserve">, creating a robot is no simple feat and each of us learned a lot </w:t>
+      </w:r>
+      <w:r>
+        <w:t xml:space="preserve">of new things </w:t>
+      </w:r>
+      <w:r>
+        <w:t>in the process. We found it much easier for us to each concentrate on one field and do lots of in-depth research in that particular field, rather than us all trying to juggle everything at once.</w:t>
       </w:r>
     </w:p>
     <w:p>
       <w:pPr>
         <w:pStyle w:val="Heading2"/>
       </w:pPr>
-      <w:bookmarkStart w:id="4" w:name="_Toc223879314"/>
+      <w:bookmarkStart w:id="4" w:name="_1.2._Design_process"/>
+      <w:bookmarkStart w:id="5" w:name="_Toc226578602"/>
+      <w:bookmarkEnd w:id="4"/>
       <w:r>
         <w:t>1.2. Design process</w:t>
       </w:r>
-      <w:bookmarkEnd w:id="4"/>
+      <w:bookmarkEnd w:id="5"/>
     </w:p>
     <w:p>
       <w:r>
@@ -1223,26 +1566,17 @@
           <w:rPr>
             <w:rStyle w:val="Hyperlink"/>
           </w:rPr>
-          <w:t>chapter</w:t>
-        </w:r>
-        <w:r>
-          <w:rPr>
-            <w:rStyle w:val="Hyperlink"/>
-          </w:rPr>
-          <w:t xml:space="preserve"> </w:t>
-        </w:r>
-        <w:r>
-          <w:rPr>
-            <w:rStyle w:val="Hyperlink"/>
-          </w:rPr>
-          <w:t>3</w:t>
+          <w:t>chapter 3</w:t>
         </w:r>
       </w:hyperlink>
       <w:r>
         <w:t xml:space="preserve">, but knowing all the components in advance allowed for a better overall design and </w:t>
       </w:r>
       <w:r>
-        <w:t>allowed us time to prepare and find good hardware and software solutions for the particular “stock” components.</w:t>
+        <w:t>gave us</w:t>
+      </w:r>
+      <w:r>
+        <w:t xml:space="preserve"> time to prepare and find good hardware and software solutions for the particular “stock” components.</w:t>
       </w:r>
     </w:p>
     <w:p>
@@ -1253,11 +1587,23 @@
         <w:t>a simple and linear development path</w:t>
       </w:r>
       <w:r>
-        <w:t xml:space="preserve">: chose and buy the sensors, then make a mechanical platform, then make all the </w:t>
+        <w:t>: cho</w:t>
+      </w:r>
+      <w:r>
+        <w:t>o</w:t>
+      </w:r>
+      <w:r>
+        <w:t>se and buy the sensors</w:t>
+      </w:r>
+      <w:r>
+        <w:t xml:space="preserve"> and other “stock” parts</w:t>
+      </w:r>
+      <w:r>
+        <w:t xml:space="preserve">, make a mechanical </w:t>
       </w:r>
       <w:r>
         <w:lastRenderedPageBreak/>
-        <w:t>circuits and mount them and the sensors on the chassis,</w:t>
+        <w:t>platform, then make all the circuits and mount them and the sensors on the chassis,</w:t>
       </w:r>
       <w:r>
         <w:t xml:space="preserve"> </w:t>
@@ -1278,24 +1624,290 @@
         <w:t>to</w:t>
       </w:r>
       <w:r>
-        <w:t xml:space="preserve"> work around existing limitations</w:t>
-      </w:r>
-      <w:r>
-        <w:t>.</w:t>
+        <w:t xml:space="preserve"> work around existing limitations.</w:t>
       </w:r>
       <w:r>
         <w:t xml:space="preserve"> We tried as best we can to mitigate these issues by brainstorming and agreeing on the general concept and design decisions in advance.</w:t>
+      </w:r>
+      <w:r>
+        <w:t xml:space="preserve"> Of course, there was still a lot of testing done during every stage of development, and many hotfixes to previous designs were made. The general concepts, however, remained unchanged.</w:t>
       </w:r>
     </w:p>
     <w:p>
       <w:pPr>
         <w:pStyle w:val="Heading2"/>
       </w:pPr>
-      <w:bookmarkStart w:id="5" w:name="_Toc223879315"/>
-      <w:r>
-        <w:t>1.3. Design philosophy</w:t>
-      </w:r>
-      <w:bookmarkEnd w:id="5"/>
+      <w:bookmarkStart w:id="6" w:name="_Toc226578603"/>
+      <w:r>
+        <w:t>1.3. Physical assembly</w:t>
+      </w:r>
+      <w:bookmarkEnd w:id="6"/>
+    </w:p>
+    <w:p>
+      <w:r>
+        <w:t>Designing a robot is only half of the equation – it must also be built and tested in the real world. This was made possible “</w:t>
+      </w:r>
+      <w:proofErr w:type="spellStart"/>
+      <w:r>
+        <w:fldChar w:fldCharType="begin"/>
+      </w:r>
+      <w:r>
+        <w:instrText xml:space="preserve"> HYPERLINK "https://steam.ku.lt/lt/apie-steam-centra" </w:instrText>
+      </w:r>
+      <w:r>
+        <w:fldChar w:fldCharType="separate"/>
+      </w:r>
+      <w:r>
+        <w:rPr>
+          <w:rStyle w:val="Hyperlink"/>
+          <w:i/>
+          <w:iCs/>
+        </w:rPr>
+        <w:t>Klaipėdos</w:t>
+      </w:r>
+      <w:proofErr w:type="spellEnd"/>
+      <w:r>
+        <w:rPr>
+          <w:rStyle w:val="Hyperlink"/>
+          <w:i/>
+          <w:iCs/>
+        </w:rPr>
+        <w:t xml:space="preserve"> </w:t>
+      </w:r>
+      <w:proofErr w:type="spellStart"/>
+      <w:r>
+        <w:rPr>
+          <w:rStyle w:val="Hyperlink"/>
+          <w:i/>
+          <w:iCs/>
+        </w:rPr>
+        <w:t>universiteto</w:t>
+      </w:r>
+      <w:proofErr w:type="spellEnd"/>
+      <w:r>
+        <w:rPr>
+          <w:rStyle w:val="Hyperlink"/>
+          <w:i/>
+          <w:iCs/>
+        </w:rPr>
+        <w:t xml:space="preserve"> </w:t>
+      </w:r>
+      <w:proofErr w:type="spellStart"/>
+      <w:r>
+        <w:rPr>
+          <w:rStyle w:val="Hyperlink"/>
+          <w:i/>
+          <w:iCs/>
+        </w:rPr>
+        <w:t>metodinis</w:t>
+      </w:r>
+      <w:proofErr w:type="spellEnd"/>
+      <w:r>
+        <w:rPr>
+          <w:rStyle w:val="Hyperlink"/>
+          <w:i/>
+          <w:iCs/>
+        </w:rPr>
+        <w:t xml:space="preserve"> STEAM </w:t>
+      </w:r>
+      <w:proofErr w:type="spellStart"/>
+      <w:r>
+        <w:rPr>
+          <w:rStyle w:val="Hyperlink"/>
+          <w:i/>
+          <w:iCs/>
+        </w:rPr>
+        <w:t>atviros</w:t>
+      </w:r>
+      <w:proofErr w:type="spellEnd"/>
+      <w:r>
+        <w:rPr>
+          <w:rStyle w:val="Hyperlink"/>
+          <w:i/>
+          <w:iCs/>
+        </w:rPr>
+        <w:t xml:space="preserve"> </w:t>
+      </w:r>
+      <w:proofErr w:type="spellStart"/>
+      <w:r>
+        <w:rPr>
+          <w:rStyle w:val="Hyperlink"/>
+          <w:i/>
+          <w:iCs/>
+        </w:rPr>
+        <w:t>prieigos</w:t>
+      </w:r>
+      <w:proofErr w:type="spellEnd"/>
+      <w:r>
+        <w:rPr>
+          <w:rStyle w:val="Hyperlink"/>
+          <w:i/>
+          <w:iCs/>
+        </w:rPr>
+        <w:t xml:space="preserve"> </w:t>
+      </w:r>
+      <w:proofErr w:type="spellStart"/>
+      <w:r>
+        <w:rPr>
+          <w:rStyle w:val="Hyperlink"/>
+          <w:i/>
+          <w:iCs/>
+        </w:rPr>
+        <w:t>centras</w:t>
+      </w:r>
+      <w:proofErr w:type="spellEnd"/>
+      <w:r>
+        <w:rPr>
+          <w:rStyle w:val="Hyperlink"/>
+          <w:i/>
+          <w:iCs/>
+        </w:rPr>
+        <w:fldChar w:fldCharType="end"/>
+      </w:r>
+      <w:r>
+        <w:t xml:space="preserve">”. They provided </w:t>
+      </w:r>
+      <w:r>
+        <w:t xml:space="preserve">us with the ability to meet </w:t>
+      </w:r>
+      <w:r>
+        <w:t>in one place and also lent us some of tools, necessary for the robot assembly (screwdrivers, screws, glue and other). Most of CAD designing and 3D printing was done at home, while all of the assembly, testing and design discussions were done during team meetings in the STEAM center.</w:t>
+      </w:r>
+    </w:p>
+    <w:p>
+      <w:pPr>
+        <w:pStyle w:val="Heading2"/>
+      </w:pPr>
+      <w:bookmarkStart w:id="7" w:name="_Toc226578604"/>
+      <w:r>
+        <w:t>1.</w:t>
+      </w:r>
+      <w:r>
+        <w:t>4.</w:t>
+      </w:r>
+      <w:r>
+        <w:t xml:space="preserve"> </w:t>
+      </w:r>
+      <w:bookmarkEnd w:id="7"/>
+      <w:r>
+        <w:t>Design software</w:t>
+      </w:r>
+    </w:p>
+    <w:p>
+      <w:r>
+        <w:t>In this paragraph we list all the software that we used to facilitate our workflow:</w:t>
+      </w:r>
+    </w:p>
+    <w:p>
+      <w:r>
+        <w:rPr>
+          <w:b/>
+          <w:bCs/>
+        </w:rPr>
+        <w:t>CAD design:</w:t>
+      </w:r>
+      <w:r>
+        <w:t xml:space="preserve"> </w:t>
+      </w:r>
+      <w:hyperlink r:id="rId9" w:history="1">
+        <w:r>
+          <w:rPr>
+            <w:rStyle w:val="Hyperlink"/>
+          </w:rPr>
+          <w:t>Autodesk Fusion</w:t>
+        </w:r>
+      </w:hyperlink>
+      <w:r>
+        <w:t>(education license) – free for students</w:t>
+      </w:r>
+      <w:r>
+        <w:t xml:space="preserve"> </w:t>
+      </w:r>
+      <w:r>
+        <w:t>(our team), powerful, feature rich, easy to use and customize</w:t>
+      </w:r>
+      <w:r>
+        <w:t>.</w:t>
+      </w:r>
+      <w:r>
+        <w:t xml:space="preserve"> </w:t>
+      </w:r>
+      <w:r>
+        <w:t xml:space="preserve">It also </w:t>
+      </w:r>
+      <w:r>
+        <w:t>has</w:t>
+      </w:r>
+      <w:r>
+        <w:t xml:space="preserve"> a</w:t>
+      </w:r>
+      <w:r>
+        <w:t xml:space="preserve"> cloud synchronization</w:t>
+      </w:r>
+      <w:r>
+        <w:t xml:space="preserve"> system, that helped us effortlessly share files and make on-the-go adjustments anywhere with internet access, including the STEAM center of KU, where we would meet to work on the robot together.</w:t>
+      </w:r>
+    </w:p>
+    <w:p>
+      <w:pPr>
+        <w:rPr>
+          <w:b/>
+          <w:bCs/>
+        </w:rPr>
+      </w:pPr>
+      <w:r>
+        <w:rPr>
+          <w:b/>
+          <w:bCs/>
+        </w:rPr>
+        <w:t>Programming:</w:t>
+      </w:r>
+    </w:p>
+    <w:p/>
+    <w:p>
+      <w:r>
+        <w:rPr>
+          <w:b/>
+          <w:bCs/>
+        </w:rPr>
+        <w:t xml:space="preserve">3D printer slicing: </w:t>
+      </w:r>
+      <w:hyperlink r:id="rId10" w:history="1">
+        <w:proofErr w:type="spellStart"/>
+        <w:r>
+          <w:rPr>
+            <w:rStyle w:val="Hyperlink"/>
+          </w:rPr>
+          <w:t>Ultimaker</w:t>
+        </w:r>
+        <w:proofErr w:type="spellEnd"/>
+        <w:r>
+          <w:rPr>
+            <w:rStyle w:val="Hyperlink"/>
+          </w:rPr>
+          <w:t xml:space="preserve"> Cura</w:t>
+        </w:r>
+      </w:hyperlink>
+      <w:r>
+        <w:t xml:space="preserve"> – free and open-source software, customizable and works with any FDM 3D printer.</w:t>
+      </w:r>
+    </w:p>
+    <w:p/>
+    <w:p>
+      <w:pPr>
+        <w:pStyle w:val="Heading2"/>
+      </w:pPr>
+      <w:bookmarkStart w:id="8" w:name="_Toc226578605"/>
+      <w:r>
+        <w:t>1.</w:t>
+      </w:r>
+      <w:r>
+        <w:t>5</w:t>
+      </w:r>
+      <w:r>
+        <w:t>. Design philosophy</w:t>
+      </w:r>
+      <w:bookmarkEnd w:id="8"/>
     </w:p>
     <w:p>
       <w:r>
@@ -1362,32 +1974,660 @@
       <w:pPr>
         <w:pStyle w:val="Heading1"/>
       </w:pPr>
-      <w:bookmarkStart w:id="6" w:name="_Toc223879316"/>
+      <w:bookmarkStart w:id="9" w:name="_2._List_of"/>
+      <w:bookmarkStart w:id="10" w:name="_Toc226578606"/>
+      <w:bookmarkEnd w:id="9"/>
       <w:r>
         <w:lastRenderedPageBreak/>
         <w:t xml:space="preserve">2. </w:t>
       </w:r>
-      <w:r>
-        <w:t>Mechanical platform</w:t>
-      </w:r>
-      <w:bookmarkEnd w:id="6"/>
+      <w:bookmarkEnd w:id="10"/>
+      <w:r>
+        <w:t>List of stock components used</w:t>
+      </w:r>
+    </w:p>
+    <w:p>
+      <w:r>
+        <w:t>The reasoning behind each choice will be explained later</w:t>
+      </w:r>
+      <w:r>
+        <w:t xml:space="preserve"> </w:t>
+      </w:r>
+      <w:r>
+        <w:t>(see provided links)</w:t>
+      </w:r>
+    </w:p>
+    <w:tbl>
+      <w:tblPr>
+        <w:tblStyle w:val="TableGrid"/>
+        <w:tblW w:w="10201" w:type="dxa"/>
+        <w:tblLook w:val="04A0" w:firstRow="1" w:lastRow="0" w:firstColumn="1" w:lastColumn="0" w:noHBand="0" w:noVBand="1"/>
+      </w:tblPr>
+      <w:tblGrid>
+        <w:gridCol w:w="1413"/>
+        <w:gridCol w:w="3118"/>
+        <w:gridCol w:w="2268"/>
+        <w:gridCol w:w="3402"/>
+      </w:tblGrid>
+      <w:tr>
+        <w:tc>
+          <w:tcPr>
+            <w:tcW w:w="1413" w:type="dxa"/>
+            <w:vAlign w:val="center"/>
+          </w:tcPr>
+          <w:p>
+            <w:pPr>
+              <w:jc w:val="center"/>
+              <w:rPr>
+                <w:i/>
+                <w:iCs/>
+              </w:rPr>
+            </w:pPr>
+            <w:r>
+              <w:rPr>
+                <w:i/>
+                <w:iCs/>
+              </w:rPr>
+              <w:t>Part</w:t>
+            </w:r>
+          </w:p>
+        </w:tc>
+        <w:tc>
+          <w:tcPr>
+            <w:tcW w:w="3118" w:type="dxa"/>
+            <w:vAlign w:val="center"/>
+          </w:tcPr>
+          <w:p>
+            <w:pPr>
+              <w:jc w:val="center"/>
+              <w:rPr>
+                <w:noProof/>
+              </w:rPr>
+            </w:pPr>
+          </w:p>
+          <w:p>
+            <w:pPr>
+              <w:jc w:val="center"/>
+              <w:rPr>
+                <w:i/>
+                <w:iCs/>
+              </w:rPr>
+            </w:pPr>
+            <w:r>
+              <w:rPr>
+                <w:i/>
+                <w:iCs/>
+              </w:rPr>
+              <w:t>Visuals</w:t>
+            </w:r>
+          </w:p>
+        </w:tc>
+        <w:tc>
+          <w:tcPr>
+            <w:tcW w:w="2268" w:type="dxa"/>
+            <w:vAlign w:val="center"/>
+          </w:tcPr>
+          <w:p>
+            <w:pPr>
+              <w:jc w:val="center"/>
+              <w:rPr>
+                <w:i/>
+                <w:iCs/>
+              </w:rPr>
+            </w:pPr>
+            <w:r>
+              <w:rPr>
+                <w:i/>
+                <w:iCs/>
+              </w:rPr>
+              <w:t>Part code</w:t>
+            </w:r>
+          </w:p>
+        </w:tc>
+        <w:tc>
+          <w:tcPr>
+            <w:tcW w:w="3402" w:type="dxa"/>
+            <w:vAlign w:val="center"/>
+          </w:tcPr>
+          <w:p>
+            <w:pPr>
+              <w:jc w:val="center"/>
+              <w:rPr>
+                <w:i/>
+                <w:iCs/>
+              </w:rPr>
+            </w:pPr>
+            <w:r>
+              <w:rPr>
+                <w:i/>
+                <w:iCs/>
+              </w:rPr>
+              <w:t>Reason for choosing</w:t>
+            </w:r>
+          </w:p>
+        </w:tc>
+      </w:tr>
+      <w:tr>
+        <w:tc>
+          <w:tcPr>
+            <w:tcW w:w="1413" w:type="dxa"/>
+            <w:vAlign w:val="center"/>
+          </w:tcPr>
+          <w:p>
+            <w:pPr>
+              <w:jc w:val="center"/>
+            </w:pPr>
+            <w:r>
+              <w:t>Front wheel tire</w:t>
+            </w:r>
+          </w:p>
+        </w:tc>
+        <w:tc>
+          <w:tcPr>
+            <w:tcW w:w="3118" w:type="dxa"/>
+            <w:vAlign w:val="center"/>
+          </w:tcPr>
+          <w:p>
+            <w:pPr>
+              <w:jc w:val="center"/>
+            </w:pPr>
+            <w:r>
+              <w:rPr>
+                <w:noProof/>
+              </w:rPr>
+              <w:drawing>
+                <wp:inline distT="0" distB="0" distL="0" distR="0" wp14:anchorId="69FA784B" wp14:editId="7AE9D3B0">
+                  <wp:extent cx="1076400" cy="1080000"/>
+                  <wp:effectExtent l="0" t="0" r="0" b="6350"/>
+                  <wp:docPr id="1" name="Picture 1"/>
+                  <wp:cNvGraphicFramePr>
+                    <a:graphicFrameLocks xmlns:a="http://schemas.openxmlformats.org/drawingml/2006/main" noChangeAspect="1"/>
+                  </wp:cNvGraphicFramePr>
+                  <a:graphic xmlns:a="http://schemas.openxmlformats.org/drawingml/2006/main">
+                    <a:graphicData uri="http://schemas.openxmlformats.org/drawingml/2006/picture">
+                      <pic:pic xmlns:pic="http://schemas.openxmlformats.org/drawingml/2006/picture">
+                        <pic:nvPicPr>
+                          <pic:cNvPr id="0" name="Picture 2"/>
+                          <pic:cNvPicPr>
+                            <a:picLocks noChangeAspect="1" noChangeArrowheads="1"/>
+                          </pic:cNvPicPr>
+                        </pic:nvPicPr>
+                        <pic:blipFill rotWithShape="1">
+                          <a:blip r:embed="rId11" cstate="print">
+                            <a:extLst>
+                              <a:ext uri="{28A0092B-C50C-407E-A947-70E740481C1C}">
+                                <a14:useLocalDpi xmlns:a14="http://schemas.microsoft.com/office/drawing/2010/main" val="0"/>
+                              </a:ext>
+                            </a:extLst>
+                          </a:blip>
+                          <a:srcRect l="73990" t="31392" r="193" b="34140"/>
+                          <a:stretch/>
+                        </pic:blipFill>
+                        <pic:spPr bwMode="auto">
+                          <a:xfrm>
+                            <a:off x="0" y="0"/>
+                            <a:ext cx="1076400" cy="1080000"/>
+                          </a:xfrm>
+                          <a:prstGeom prst="rect">
+                            <a:avLst/>
+                          </a:prstGeom>
+                          <a:noFill/>
+                          <a:ln>
+                            <a:noFill/>
+                          </a:ln>
+                          <a:extLst>
+                            <a:ext uri="{53640926-AAD7-44D8-BBD7-CCE9431645EC}">
+                              <a14:shadowObscured xmlns:a14="http://schemas.microsoft.com/office/drawing/2010/main"/>
+                            </a:ext>
+                          </a:extLst>
+                        </pic:spPr>
+                      </pic:pic>
+                    </a:graphicData>
+                  </a:graphic>
+                </wp:inline>
+              </w:drawing>
+            </w:r>
+          </w:p>
+        </w:tc>
+        <w:tc>
+          <w:tcPr>
+            <w:tcW w:w="2268" w:type="dxa"/>
+            <w:vAlign w:val="center"/>
+          </w:tcPr>
+          <w:p>
+            <w:pPr>
+              <w:jc w:val="center"/>
+            </w:pPr>
+            <w:r>
+              <w:t>Tire 43.2 x 22 ZR</w:t>
+            </w:r>
+            <w:r>
+              <w:t xml:space="preserve"> (</w:t>
+            </w:r>
+            <w:hyperlink r:id="rId12" w:anchor="T=C" w:history="1">
+              <w:r>
+                <w:rPr>
+                  <w:rStyle w:val="Hyperlink"/>
+                </w:rPr>
+                <w:t>44309</w:t>
+              </w:r>
+            </w:hyperlink>
+            <w:r>
+              <w:t>)</w:t>
+            </w:r>
+          </w:p>
+        </w:tc>
+        <w:tc>
+          <w:tcPr>
+            <w:tcW w:w="3402" w:type="dxa"/>
+            <w:vAlign w:val="center"/>
+          </w:tcPr>
+          <w:p>
+            <w:pPr>
+              <w:jc w:val="center"/>
+            </w:pPr>
+            <w:hyperlink w:anchor="_3.2._Steering" w:history="1">
+              <w:r>
+                <w:rPr>
+                  <w:rStyle w:val="Hyperlink"/>
+                </w:rPr>
+                <w:t>See chapter 3</w:t>
+              </w:r>
+            </w:hyperlink>
+          </w:p>
+        </w:tc>
+      </w:tr>
+      <w:tr>
+        <w:tc>
+          <w:tcPr>
+            <w:tcW w:w="1413" w:type="dxa"/>
+            <w:vAlign w:val="center"/>
+          </w:tcPr>
+          <w:p>
+            <w:pPr>
+              <w:jc w:val="center"/>
+            </w:pPr>
+            <w:r>
+              <w:t xml:space="preserve">Chassis </w:t>
+            </w:r>
+          </w:p>
+        </w:tc>
+        <w:tc>
+          <w:tcPr>
+            <w:tcW w:w="3118" w:type="dxa"/>
+            <w:vAlign w:val="center"/>
+          </w:tcPr>
+          <w:p>
+            <w:pPr>
+              <w:jc w:val="center"/>
+            </w:pPr>
+            <w:r>
+              <w:rPr>
+                <w:noProof/>
+              </w:rPr>
+              <w:drawing>
+                <wp:inline distT="0" distB="0" distL="0" distR="0" wp14:anchorId="07833E5A" wp14:editId="05A15518">
+                  <wp:extent cx="1342800" cy="1080000"/>
+                  <wp:effectExtent l="0" t="0" r="0" b="6350"/>
+                  <wp:docPr id="2" name="Picture 2"/>
+                  <wp:cNvGraphicFramePr>
+                    <a:graphicFrameLocks xmlns:a="http://schemas.openxmlformats.org/drawingml/2006/main" noChangeAspect="1"/>
+                  </wp:cNvGraphicFramePr>
+                  <a:graphic xmlns:a="http://schemas.openxmlformats.org/drawingml/2006/main">
+                    <a:graphicData uri="http://schemas.openxmlformats.org/drawingml/2006/picture">
+                      <pic:pic xmlns:pic="http://schemas.openxmlformats.org/drawingml/2006/picture">
+                        <pic:nvPicPr>
+                          <pic:cNvPr id="0" name="Picture 3"/>
+                          <pic:cNvPicPr>
+                            <a:picLocks noChangeAspect="1" noChangeArrowheads="1"/>
+                          </pic:cNvPicPr>
+                        </pic:nvPicPr>
+                        <pic:blipFill>
+                          <a:blip r:embed="rId13" cstate="print">
+                            <a:extLst>
+                              <a:ext uri="{28A0092B-C50C-407E-A947-70E740481C1C}">
+                                <a14:useLocalDpi xmlns:a14="http://schemas.microsoft.com/office/drawing/2010/main" val="0"/>
+                              </a:ext>
+                            </a:extLst>
+                          </a:blip>
+                          <a:srcRect/>
+                          <a:stretch>
+                            <a:fillRect/>
+                          </a:stretch>
+                        </pic:blipFill>
+                        <pic:spPr bwMode="auto">
+                          <a:xfrm>
+                            <a:off x="0" y="0"/>
+                            <a:ext cx="1342800" cy="1080000"/>
+                          </a:xfrm>
+                          <a:prstGeom prst="rect">
+                            <a:avLst/>
+                          </a:prstGeom>
+                          <a:noFill/>
+                          <a:ln>
+                            <a:noFill/>
+                          </a:ln>
+                        </pic:spPr>
+                      </pic:pic>
+                    </a:graphicData>
+                  </a:graphic>
+                </wp:inline>
+              </w:drawing>
+            </w:r>
+          </w:p>
+        </w:tc>
+        <w:tc>
+          <w:tcPr>
+            <w:tcW w:w="2268" w:type="dxa"/>
+            <w:vAlign w:val="center"/>
+          </w:tcPr>
+          <w:p>
+            <w:pPr>
+              <w:jc w:val="center"/>
+            </w:pPr>
+            <w:hyperlink r:id="rId14" w:anchor="nav-specification" w:history="1">
+              <w:r>
+                <w:rPr>
+                  <w:rStyle w:val="Hyperlink"/>
+                </w:rPr>
+                <w:t xml:space="preserve">Metal chassis for </w:t>
+              </w:r>
+              <w:proofErr w:type="spellStart"/>
+              <w:r>
+                <w:rPr>
+                  <w:rStyle w:val="Hyperlink"/>
+                </w:rPr>
+                <w:t>Makeblock</w:t>
+              </w:r>
+              <w:proofErr w:type="spellEnd"/>
+              <w:r>
+                <w:rPr>
+                  <w:rStyle w:val="Hyperlink"/>
+                </w:rPr>
+                <w:t xml:space="preserve"> mBot2</w:t>
+              </w:r>
+            </w:hyperlink>
+          </w:p>
+        </w:tc>
+        <w:tc>
+          <w:tcPr>
+            <w:tcW w:w="3402" w:type="dxa"/>
+            <w:vAlign w:val="center"/>
+          </w:tcPr>
+          <w:p>
+            <w:pPr>
+              <w:jc w:val="center"/>
+            </w:pPr>
+            <w:hyperlink w:anchor="_3.3._Chassis" w:history="1">
+              <w:r>
+                <w:rPr>
+                  <w:rStyle w:val="Hyperlink"/>
+                </w:rPr>
+                <w:t>See chapter 3</w:t>
+              </w:r>
+            </w:hyperlink>
+          </w:p>
+        </w:tc>
+      </w:tr>
+      <w:tr>
+        <w:tc>
+          <w:tcPr>
+            <w:tcW w:w="1413" w:type="dxa"/>
+            <w:vAlign w:val="center"/>
+          </w:tcPr>
+          <w:p>
+            <w:pPr>
+              <w:jc w:val="center"/>
+            </w:pPr>
+          </w:p>
+        </w:tc>
+        <w:tc>
+          <w:tcPr>
+            <w:tcW w:w="3118" w:type="dxa"/>
+            <w:vAlign w:val="center"/>
+          </w:tcPr>
+          <w:p>
+            <w:pPr>
+              <w:jc w:val="center"/>
+            </w:pPr>
+          </w:p>
+        </w:tc>
+        <w:tc>
+          <w:tcPr>
+            <w:tcW w:w="2268" w:type="dxa"/>
+            <w:vAlign w:val="center"/>
+          </w:tcPr>
+          <w:p>
+            <w:pPr>
+              <w:jc w:val="center"/>
+            </w:pPr>
+          </w:p>
+        </w:tc>
+        <w:tc>
+          <w:tcPr>
+            <w:tcW w:w="3402" w:type="dxa"/>
+            <w:vAlign w:val="center"/>
+          </w:tcPr>
+          <w:p>
+            <w:pPr>
+              <w:jc w:val="center"/>
+            </w:pPr>
+          </w:p>
+        </w:tc>
+      </w:tr>
+      <w:tr>
+        <w:tc>
+          <w:tcPr>
+            <w:tcW w:w="1413" w:type="dxa"/>
+            <w:vAlign w:val="center"/>
+          </w:tcPr>
+          <w:p>
+            <w:pPr>
+              <w:jc w:val="center"/>
+            </w:pPr>
+          </w:p>
+        </w:tc>
+        <w:tc>
+          <w:tcPr>
+            <w:tcW w:w="3118" w:type="dxa"/>
+            <w:vAlign w:val="center"/>
+          </w:tcPr>
+          <w:p>
+            <w:pPr>
+              <w:jc w:val="center"/>
+            </w:pPr>
+          </w:p>
+        </w:tc>
+        <w:tc>
+          <w:tcPr>
+            <w:tcW w:w="2268" w:type="dxa"/>
+            <w:vAlign w:val="center"/>
+          </w:tcPr>
+          <w:p>
+            <w:pPr>
+              <w:jc w:val="center"/>
+            </w:pPr>
+          </w:p>
+        </w:tc>
+        <w:tc>
+          <w:tcPr>
+            <w:tcW w:w="3402" w:type="dxa"/>
+            <w:vAlign w:val="center"/>
+          </w:tcPr>
+          <w:p>
+            <w:pPr>
+              <w:jc w:val="center"/>
+            </w:pPr>
+          </w:p>
+        </w:tc>
+      </w:tr>
+      <w:tr>
+        <w:tc>
+          <w:tcPr>
+            <w:tcW w:w="1413" w:type="dxa"/>
+            <w:vAlign w:val="center"/>
+          </w:tcPr>
+          <w:p>
+            <w:pPr>
+              <w:jc w:val="center"/>
+            </w:pPr>
+          </w:p>
+        </w:tc>
+        <w:tc>
+          <w:tcPr>
+            <w:tcW w:w="3118" w:type="dxa"/>
+            <w:vAlign w:val="center"/>
+          </w:tcPr>
+          <w:p>
+            <w:pPr>
+              <w:jc w:val="center"/>
+            </w:pPr>
+          </w:p>
+        </w:tc>
+        <w:tc>
+          <w:tcPr>
+            <w:tcW w:w="2268" w:type="dxa"/>
+            <w:vAlign w:val="center"/>
+          </w:tcPr>
+          <w:p>
+            <w:pPr>
+              <w:jc w:val="center"/>
+            </w:pPr>
+          </w:p>
+        </w:tc>
+        <w:tc>
+          <w:tcPr>
+            <w:tcW w:w="3402" w:type="dxa"/>
+            <w:vAlign w:val="center"/>
+          </w:tcPr>
+          <w:p>
+            <w:pPr>
+              <w:jc w:val="center"/>
+            </w:pPr>
+          </w:p>
+        </w:tc>
+      </w:tr>
+      <w:tr>
+        <w:tc>
+          <w:tcPr>
+            <w:tcW w:w="1413" w:type="dxa"/>
+            <w:vAlign w:val="center"/>
+          </w:tcPr>
+          <w:p>
+            <w:pPr>
+              <w:jc w:val="center"/>
+            </w:pPr>
+          </w:p>
+        </w:tc>
+        <w:tc>
+          <w:tcPr>
+            <w:tcW w:w="3118" w:type="dxa"/>
+            <w:vAlign w:val="center"/>
+          </w:tcPr>
+          <w:p>
+            <w:pPr>
+              <w:jc w:val="center"/>
+            </w:pPr>
+          </w:p>
+        </w:tc>
+        <w:tc>
+          <w:tcPr>
+            <w:tcW w:w="2268" w:type="dxa"/>
+            <w:vAlign w:val="center"/>
+          </w:tcPr>
+          <w:p>
+            <w:pPr>
+              <w:jc w:val="center"/>
+            </w:pPr>
+          </w:p>
+        </w:tc>
+        <w:tc>
+          <w:tcPr>
+            <w:tcW w:w="3402" w:type="dxa"/>
+            <w:vAlign w:val="center"/>
+          </w:tcPr>
+          <w:p>
+            <w:pPr>
+              <w:jc w:val="center"/>
+            </w:pPr>
+          </w:p>
+        </w:tc>
+      </w:tr>
+      <w:tr>
+        <w:tc>
+          <w:tcPr>
+            <w:tcW w:w="1413" w:type="dxa"/>
+            <w:vAlign w:val="center"/>
+          </w:tcPr>
+          <w:p>
+            <w:pPr>
+              <w:jc w:val="center"/>
+            </w:pPr>
+          </w:p>
+        </w:tc>
+        <w:tc>
+          <w:tcPr>
+            <w:tcW w:w="3118" w:type="dxa"/>
+            <w:vAlign w:val="center"/>
+          </w:tcPr>
+          <w:p>
+            <w:pPr>
+              <w:jc w:val="center"/>
+            </w:pPr>
+          </w:p>
+        </w:tc>
+        <w:tc>
+          <w:tcPr>
+            <w:tcW w:w="2268" w:type="dxa"/>
+            <w:vAlign w:val="center"/>
+          </w:tcPr>
+          <w:p>
+            <w:pPr>
+              <w:jc w:val="center"/>
+            </w:pPr>
+          </w:p>
+        </w:tc>
+        <w:tc>
+          <w:tcPr>
+            <w:tcW w:w="3402" w:type="dxa"/>
+            <w:vAlign w:val="center"/>
+          </w:tcPr>
+          <w:p>
+            <w:pPr>
+              <w:jc w:val="center"/>
+            </w:pPr>
+          </w:p>
+        </w:tc>
+      </w:tr>
+    </w:tbl>
+    <w:p/>
+    <w:p>
+      <w:pPr>
+        <w:pStyle w:val="Heading1"/>
+      </w:pPr>
+      <w:r>
+        <w:t>3. Mechanical platform</w:t>
+      </w:r>
     </w:p>
     <w:p>
       <w:pPr>
         <w:pStyle w:val="Heading2"/>
       </w:pPr>
-      <w:bookmarkStart w:id="7" w:name="_Toc223879317"/>
-      <w:r>
-        <w:t>2.1. Overview</w:t>
-      </w:r>
-      <w:bookmarkEnd w:id="7"/>
+      <w:bookmarkStart w:id="11" w:name="_Toc226578607"/>
+      <w:r>
+        <w:t>3</w:t>
+      </w:r>
+      <w:r>
+        <w:t>.1. Overview</w:t>
+      </w:r>
+      <w:bookmarkEnd w:id="11"/>
     </w:p>
     <w:p>
       <w:r>
         <w:t>The mechanical platform consists of three main areas: steering system, driving axle and the chassis that connects them. We agreed to make a conventional rear-wheel-drive system: front wheels are designated to steering, and rear wheels are driven.</w:t>
       </w:r>
       <w:r>
-        <w:t xml:space="preserve"> This type of package can be seen all throughout the automotive industry, as it is easy to package and simple</w:t>
+        <w:t xml:space="preserve"> This type of package is simple</w:t>
       </w:r>
       <w:r>
         <w:t xml:space="preserve"> and effective.</w:t>
@@ -1397,13 +2637,1829 @@
       <w:pPr>
         <w:pStyle w:val="Heading2"/>
       </w:pPr>
-      <w:bookmarkStart w:id="8" w:name="_Toc223879318"/>
-      <w:r>
-        <w:t>2.2. Steering</w:t>
-      </w:r>
-      <w:bookmarkEnd w:id="8"/>
+      <w:bookmarkStart w:id="12" w:name="_3.2._Steering"/>
+      <w:bookmarkStart w:id="13" w:name="_Toc226578609"/>
+      <w:bookmarkEnd w:id="12"/>
+      <w:r>
+        <w:t>3</w:t>
+      </w:r>
+      <w:r>
+        <w:t>.</w:t>
+      </w:r>
+      <w:r>
+        <w:t>2</w:t>
+      </w:r>
+      <w:r>
+        <w:t>. Steering</w:t>
+      </w:r>
+      <w:bookmarkEnd w:id="13"/>
+    </w:p>
+    <w:p>
+      <w:r>
+        <w:t xml:space="preserve">The </w:t>
+      </w:r>
+      <w:r>
+        <w:t>princip</w:t>
+      </w:r>
+      <w:r>
+        <w:t>al</w:t>
+      </w:r>
+      <w:r>
+        <w:t xml:space="preserve"> </w:t>
+      </w:r>
+      <w:r>
+        <w:t xml:space="preserve">requirements that we had for our steering were compactness and high steering angles. High steering angles allow </w:t>
+      </w:r>
+      <w:r>
+        <w:lastRenderedPageBreak/>
+        <w:t>for smaller turning radius, which is of utmost importance</w:t>
+      </w:r>
+      <w:r>
+        <w:t xml:space="preserve"> in the challenge for optimal navigation </w:t>
+      </w:r>
+      <w:r>
+        <w:t>around</w:t>
+      </w:r>
+      <w:r>
+        <w:t xml:space="preserve"> circuit and good parking performance. Compactness allows for a smaller overall footprint of the robot and also leaves space for future drivetrain, sensor and electronics placement.</w:t>
+      </w:r>
+    </w:p>
+    <w:p>
+      <w:r>
+        <w:t xml:space="preserve">Below are the design iterations of the steering system and </w:t>
+      </w:r>
+      <w:r>
+        <w:t>their descriptions</w:t>
+      </w:r>
+      <w:r>
+        <w:t>:</w:t>
+      </w:r>
+    </w:p>
+    <w:tbl>
+      <w:tblPr>
+        <w:tblStyle w:val="TableGrid"/>
+        <w:tblW w:w="10060" w:type="dxa"/>
+        <w:tblLook w:val="04A0" w:firstRow="1" w:lastRow="0" w:firstColumn="1" w:lastColumn="0" w:noHBand="0" w:noVBand="1"/>
+      </w:tblPr>
+      <w:tblGrid>
+        <w:gridCol w:w="1410"/>
+        <w:gridCol w:w="3912"/>
+        <w:gridCol w:w="4738"/>
+      </w:tblGrid>
+      <w:tr>
+        <w:tc>
+          <w:tcPr>
+            <w:tcW w:w="1410" w:type="dxa"/>
+            <w:vAlign w:val="center"/>
+          </w:tcPr>
+          <w:p>
+            <w:pPr>
+              <w:jc w:val="center"/>
+              <w:rPr>
+                <w:i/>
+                <w:iCs/>
+              </w:rPr>
+            </w:pPr>
+            <w:r>
+              <w:rPr>
+                <w:i/>
+                <w:iCs/>
+              </w:rPr>
+              <w:t>Iteration</w:t>
+            </w:r>
+          </w:p>
+        </w:tc>
+        <w:tc>
+          <w:tcPr>
+            <w:tcW w:w="3912" w:type="dxa"/>
+            <w:vAlign w:val="center"/>
+          </w:tcPr>
+          <w:p>
+            <w:pPr>
+              <w:jc w:val="center"/>
+              <w:rPr>
+                <w:i/>
+                <w:iCs/>
+              </w:rPr>
+            </w:pPr>
+            <w:r>
+              <w:rPr>
+                <w:i/>
+                <w:iCs/>
+              </w:rPr>
+              <w:t>Visuals</w:t>
+            </w:r>
+          </w:p>
+        </w:tc>
+        <w:tc>
+          <w:tcPr>
+            <w:tcW w:w="4738" w:type="dxa"/>
+            <w:vAlign w:val="center"/>
+          </w:tcPr>
+          <w:p>
+            <w:pPr>
+              <w:jc w:val="center"/>
+              <w:rPr>
+                <w:i/>
+                <w:iCs/>
+              </w:rPr>
+            </w:pPr>
+            <w:r>
+              <w:rPr>
+                <w:i/>
+                <w:iCs/>
+              </w:rPr>
+              <w:t>Description</w:t>
+            </w:r>
+          </w:p>
+        </w:tc>
+      </w:tr>
+      <w:tr>
+        <w:trPr>
+          <w:trHeight w:val="2439"/>
+        </w:trPr>
+        <w:tc>
+          <w:tcPr>
+            <w:tcW w:w="1410" w:type="dxa"/>
+            <w:vAlign w:val="center"/>
+          </w:tcPr>
+          <w:p>
+            <w:pPr>
+              <w:jc w:val="center"/>
+              <w:rPr>
+                <w:b/>
+                <w:bCs/>
+              </w:rPr>
+            </w:pPr>
+            <w:r>
+              <w:rPr>
+                <w:b/>
+                <w:bCs/>
+              </w:rPr>
+              <w:t>V1</w:t>
+            </w:r>
+          </w:p>
+        </w:tc>
+        <w:tc>
+          <w:tcPr>
+            <w:tcW w:w="3912" w:type="dxa"/>
+            <w:vAlign w:val="center"/>
+          </w:tcPr>
+          <w:p>
+            <w:pPr>
+              <w:jc w:val="center"/>
+            </w:pPr>
+            <w:r>
+              <w:rPr>
+                <w:noProof/>
+              </w:rPr>
+              <w:drawing>
+                <wp:inline distT="0" distB="0" distL="0" distR="0" wp14:anchorId="44DDCC3B" wp14:editId="0BF0D0F3">
+                  <wp:extent cx="1681200" cy="1440000"/>
+                  <wp:effectExtent l="0" t="0" r="0" b="8255"/>
+                  <wp:docPr id="3" name="Picture 3"/>
+                  <wp:cNvGraphicFramePr>
+                    <a:graphicFrameLocks xmlns:a="http://schemas.openxmlformats.org/drawingml/2006/main" noChangeAspect="1"/>
+                  </wp:cNvGraphicFramePr>
+                  <a:graphic xmlns:a="http://schemas.openxmlformats.org/drawingml/2006/main">
+                    <a:graphicData uri="http://schemas.openxmlformats.org/drawingml/2006/picture">
+                      <pic:pic xmlns:pic="http://schemas.openxmlformats.org/drawingml/2006/picture">
+                        <pic:nvPicPr>
+                          <pic:cNvPr id="0" name="Picture 2"/>
+                          <pic:cNvPicPr>
+                            <a:picLocks noChangeAspect="1" noChangeArrowheads="1"/>
+                          </pic:cNvPicPr>
+                        </pic:nvPicPr>
+                        <pic:blipFill rotWithShape="1">
+                          <a:blip r:embed="rId15" cstate="print">
+                            <a:extLst>
+                              <a:ext uri="{28A0092B-C50C-407E-A947-70E740481C1C}">
+                                <a14:useLocalDpi xmlns:a14="http://schemas.microsoft.com/office/drawing/2010/main" val="0"/>
+                              </a:ext>
+                            </a:extLst>
+                          </a:blip>
+                          <a:srcRect r="3488"/>
+                          <a:stretch/>
+                        </pic:blipFill>
+                        <pic:spPr bwMode="auto">
+                          <a:xfrm>
+                            <a:off x="0" y="0"/>
+                            <a:ext cx="1681200" cy="1440000"/>
+                          </a:xfrm>
+                          <a:prstGeom prst="rect">
+                            <a:avLst/>
+                          </a:prstGeom>
+                          <a:noFill/>
+                          <a:ln>
+                            <a:noFill/>
+                          </a:ln>
+                          <a:extLst>
+                            <a:ext uri="{53640926-AAD7-44D8-BBD7-CCE9431645EC}">
+                              <a14:shadowObscured xmlns:a14="http://schemas.microsoft.com/office/drawing/2010/main"/>
+                            </a:ext>
+                          </a:extLst>
+                        </pic:spPr>
+                      </pic:pic>
+                    </a:graphicData>
+                  </a:graphic>
+                </wp:inline>
+              </w:drawing>
+            </w:r>
+            <w:r>
+              <w:rPr>
+                <w:noProof/>
+              </w:rPr>
+              <w:drawing>
+                <wp:inline distT="0" distB="0" distL="0" distR="0" wp14:anchorId="0E4AD433" wp14:editId="77150511">
+                  <wp:extent cx="1508400" cy="1440000"/>
+                  <wp:effectExtent l="0" t="0" r="0" b="8255"/>
+                  <wp:docPr id="4" name="Picture 4"/>
+                  <wp:cNvGraphicFramePr>
+                    <a:graphicFrameLocks xmlns:a="http://schemas.openxmlformats.org/drawingml/2006/main" noChangeAspect="1"/>
+                  </wp:cNvGraphicFramePr>
+                  <a:graphic xmlns:a="http://schemas.openxmlformats.org/drawingml/2006/main">
+                    <a:graphicData uri="http://schemas.openxmlformats.org/drawingml/2006/picture">
+                      <pic:pic xmlns:pic="http://schemas.openxmlformats.org/drawingml/2006/picture">
+                        <pic:nvPicPr>
+                          <pic:cNvPr id="0" name="Picture 3"/>
+                          <pic:cNvPicPr>
+                            <a:picLocks noChangeAspect="1" noChangeArrowheads="1"/>
+                          </pic:cNvPicPr>
+                        </pic:nvPicPr>
+                        <pic:blipFill rotWithShape="1">
+                          <a:blip r:embed="rId16" cstate="print">
+                            <a:extLst>
+                              <a:ext uri="{28A0092B-C50C-407E-A947-70E740481C1C}">
+                                <a14:useLocalDpi xmlns:a14="http://schemas.microsoft.com/office/drawing/2010/main" val="0"/>
+                              </a:ext>
+                            </a:extLst>
+                          </a:blip>
+                          <a:srcRect l="2879"/>
+                          <a:stretch/>
+                        </pic:blipFill>
+                        <pic:spPr bwMode="auto">
+                          <a:xfrm>
+                            <a:off x="0" y="0"/>
+                            <a:ext cx="1508400" cy="1440000"/>
+                          </a:xfrm>
+                          <a:prstGeom prst="rect">
+                            <a:avLst/>
+                          </a:prstGeom>
+                          <a:noFill/>
+                          <a:ln>
+                            <a:noFill/>
+                          </a:ln>
+                          <a:extLst>
+                            <a:ext uri="{53640926-AAD7-44D8-BBD7-CCE9431645EC}">
+                              <a14:shadowObscured xmlns:a14="http://schemas.microsoft.com/office/drawing/2010/main"/>
+                            </a:ext>
+                          </a:extLst>
+                        </pic:spPr>
+                      </pic:pic>
+                    </a:graphicData>
+                  </a:graphic>
+                </wp:inline>
+              </w:drawing>
+            </w:r>
+          </w:p>
+        </w:tc>
+        <w:tc>
+          <w:tcPr>
+            <w:tcW w:w="4738" w:type="dxa"/>
+            <w:vAlign w:val="center"/>
+          </w:tcPr>
+          <w:p>
+            <w:pPr>
+              <w:jc w:val="center"/>
+            </w:pPr>
+            <w:r>
+              <w:t>The very first design. A very simple concept</w:t>
+            </w:r>
+            <w:r>
+              <w:t>, in which the entire front axle is being turned around a pivot. Scrapped due to excessive space needed and instability of the platform when the entire front axle is at an angle with the rest of the body.</w:t>
+            </w:r>
+          </w:p>
+        </w:tc>
+      </w:tr>
+      <w:tr>
+        <w:tc>
+          <w:tcPr>
+            <w:tcW w:w="1410" w:type="dxa"/>
+            <w:vAlign w:val="center"/>
+          </w:tcPr>
+          <w:p>
+            <w:pPr>
+              <w:jc w:val="center"/>
+              <w:rPr>
+                <w:b/>
+                <w:bCs/>
+              </w:rPr>
+            </w:pPr>
+            <w:r>
+              <w:rPr>
+                <w:b/>
+                <w:bCs/>
+              </w:rPr>
+              <w:t>V2</w:t>
+            </w:r>
+          </w:p>
+        </w:tc>
+        <w:tc>
+          <w:tcPr>
+            <w:tcW w:w="3912" w:type="dxa"/>
+            <w:vAlign w:val="center"/>
+          </w:tcPr>
+          <w:p>
+            <w:pPr>
+              <w:jc w:val="center"/>
+            </w:pPr>
+            <w:r>
+              <w:rPr>
+                <w:noProof/>
+              </w:rPr>
+              <w:drawing>
+                <wp:inline distT="0" distB="0" distL="0" distR="0" wp14:anchorId="62E9BF74" wp14:editId="3C62B2FC">
+                  <wp:extent cx="1936800" cy="1440000"/>
+                  <wp:effectExtent l="0" t="0" r="6350" b="8255"/>
+                  <wp:docPr id="12" name="Picture 12"/>
+                  <wp:cNvGraphicFramePr>
+                    <a:graphicFrameLocks xmlns:a="http://schemas.openxmlformats.org/drawingml/2006/main" noChangeAspect="1"/>
+                  </wp:cNvGraphicFramePr>
+                  <a:graphic xmlns:a="http://schemas.openxmlformats.org/drawingml/2006/main">
+                    <a:graphicData uri="http://schemas.openxmlformats.org/drawingml/2006/picture">
+                      <pic:pic xmlns:pic="http://schemas.openxmlformats.org/drawingml/2006/picture">
+                        <pic:nvPicPr>
+                          <pic:cNvPr id="0" name="Picture 11"/>
+                          <pic:cNvPicPr>
+                            <a:picLocks noChangeAspect="1" noChangeArrowheads="1"/>
+                          </pic:cNvPicPr>
+                        </pic:nvPicPr>
+                        <pic:blipFill>
+                          <a:blip r:embed="rId17" cstate="print">
+                            <a:extLst>
+                              <a:ext uri="{28A0092B-C50C-407E-A947-70E740481C1C}">
+                                <a14:useLocalDpi xmlns:a14="http://schemas.microsoft.com/office/drawing/2010/main" val="0"/>
+                              </a:ext>
+                            </a:extLst>
+                          </a:blip>
+                          <a:srcRect/>
+                          <a:stretch>
+                            <a:fillRect/>
+                          </a:stretch>
+                        </pic:blipFill>
+                        <pic:spPr bwMode="auto">
+                          <a:xfrm>
+                            <a:off x="0" y="0"/>
+                            <a:ext cx="1936800" cy="1440000"/>
+                          </a:xfrm>
+                          <a:prstGeom prst="rect">
+                            <a:avLst/>
+                          </a:prstGeom>
+                          <a:noFill/>
+                          <a:ln>
+                            <a:noFill/>
+                          </a:ln>
+                        </pic:spPr>
+                      </pic:pic>
+                    </a:graphicData>
+                  </a:graphic>
+                </wp:inline>
+              </w:drawing>
+            </w:r>
+            <w:r>
+              <w:rPr>
+                <w:noProof/>
+              </w:rPr>
+              <w:drawing>
+                <wp:inline distT="0" distB="0" distL="0" distR="0" wp14:anchorId="70A17D8E" wp14:editId="11A55B1E">
+                  <wp:extent cx="2346960" cy="1439545"/>
+                  <wp:effectExtent l="0" t="0" r="0" b="8255"/>
+                  <wp:docPr id="8" name="Picture 8"/>
+                  <wp:cNvGraphicFramePr>
+                    <a:graphicFrameLocks xmlns:a="http://schemas.openxmlformats.org/drawingml/2006/main" noChangeAspect="1"/>
+                  </wp:cNvGraphicFramePr>
+                  <a:graphic xmlns:a="http://schemas.openxmlformats.org/drawingml/2006/main">
+                    <a:graphicData uri="http://schemas.openxmlformats.org/drawingml/2006/picture">
+                      <pic:pic xmlns:pic="http://schemas.openxmlformats.org/drawingml/2006/picture">
+                        <pic:nvPicPr>
+                          <pic:cNvPr id="0" name="Picture 7"/>
+                          <pic:cNvPicPr>
+                            <a:picLocks noChangeAspect="1" noChangeArrowheads="1"/>
+                          </pic:cNvPicPr>
+                        </pic:nvPicPr>
+                        <pic:blipFill rotWithShape="1">
+                          <a:blip r:embed="rId18" cstate="print">
+                            <a:extLst>
+                              <a:ext uri="{28A0092B-C50C-407E-A947-70E740481C1C}">
+                                <a14:useLocalDpi xmlns:a14="http://schemas.microsoft.com/office/drawing/2010/main" val="0"/>
+                              </a:ext>
+                            </a:extLst>
+                          </a:blip>
+                          <a:srcRect l="10428" r="8034"/>
+                          <a:stretch/>
+                        </pic:blipFill>
+                        <pic:spPr bwMode="auto">
+                          <a:xfrm>
+                            <a:off x="0" y="0"/>
+                            <a:ext cx="2346960" cy="1439545"/>
+                          </a:xfrm>
+                          <a:prstGeom prst="rect">
+                            <a:avLst/>
+                          </a:prstGeom>
+                          <a:noFill/>
+                          <a:ln>
+                            <a:noFill/>
+                          </a:ln>
+                          <a:extLst>
+                            <a:ext uri="{53640926-AAD7-44D8-BBD7-CCE9431645EC}">
+                              <a14:shadowObscured xmlns:a14="http://schemas.microsoft.com/office/drawing/2010/main"/>
+                            </a:ext>
+                          </a:extLst>
+                        </pic:spPr>
+                      </pic:pic>
+                    </a:graphicData>
+                  </a:graphic>
+                </wp:inline>
+              </w:drawing>
+            </w:r>
+          </w:p>
+        </w:tc>
+        <w:tc>
+          <w:tcPr>
+            <w:tcW w:w="4738" w:type="dxa"/>
+            <w:vAlign w:val="center"/>
+          </w:tcPr>
+          <w:p>
+            <w:pPr>
+              <w:jc w:val="center"/>
+            </w:pPr>
+            <w:r>
+              <w:t xml:space="preserve">The </w:t>
+            </w:r>
+            <w:r>
+              <w:t>concept</w:t>
+            </w:r>
+            <w:r>
+              <w:t xml:space="preserve"> of this version was to pivot the wheel hubs around their respective axis, and rotate them simultaneously with a shared rack. Scrapped due to high friction and general bulkiness of the design.</w:t>
+            </w:r>
+          </w:p>
+        </w:tc>
+      </w:tr>
+      <w:tr>
+        <w:tc>
+          <w:tcPr>
+            <w:tcW w:w="1410" w:type="dxa"/>
+            <w:vAlign w:val="center"/>
+          </w:tcPr>
+          <w:p>
+            <w:pPr>
+              <w:jc w:val="center"/>
+              <w:rPr>
+                <w:b/>
+                <w:bCs/>
+              </w:rPr>
+            </w:pPr>
+          </w:p>
+          <w:p>
+            <w:pPr>
+              <w:jc w:val="center"/>
+              <w:rPr>
+                <w:b/>
+                <w:bCs/>
+              </w:rPr>
+            </w:pPr>
+            <w:r>
+              <w:rPr>
+                <w:b/>
+                <w:bCs/>
+              </w:rPr>
+              <w:t>V3</w:t>
+            </w:r>
+          </w:p>
+        </w:tc>
+        <w:tc>
+          <w:tcPr>
+            <w:tcW w:w="3912" w:type="dxa"/>
+            <w:vAlign w:val="center"/>
+          </w:tcPr>
+          <w:p>
+            <w:pPr>
+              <w:jc w:val="center"/>
+            </w:pPr>
+            <w:r>
+              <w:rPr>
+                <w:noProof/>
+              </w:rPr>
+              <w:drawing>
+                <wp:inline distT="0" distB="0" distL="0" distR="0" wp14:anchorId="12BDCDFD" wp14:editId="1694144B">
+                  <wp:extent cx="1835785" cy="1439545"/>
+                  <wp:effectExtent l="0" t="0" r="0" b="8255"/>
+                  <wp:docPr id="7" name="Picture 7"/>
+                  <wp:cNvGraphicFramePr>
+                    <a:graphicFrameLocks xmlns:a="http://schemas.openxmlformats.org/drawingml/2006/main" noChangeAspect="1"/>
+                  </wp:cNvGraphicFramePr>
+                  <a:graphic xmlns:a="http://schemas.openxmlformats.org/drawingml/2006/main">
+                    <a:graphicData uri="http://schemas.openxmlformats.org/drawingml/2006/picture">
+                      <pic:pic xmlns:pic="http://schemas.openxmlformats.org/drawingml/2006/picture">
+                        <pic:nvPicPr>
+                          <pic:cNvPr id="0" name="Picture 6"/>
+                          <pic:cNvPicPr>
+                            <a:picLocks noChangeAspect="1" noChangeArrowheads="1"/>
+                          </pic:cNvPicPr>
+                        </pic:nvPicPr>
+                        <pic:blipFill>
+                          <a:blip r:embed="rId19" cstate="print">
+                            <a:extLst>
+                              <a:ext uri="{28A0092B-C50C-407E-A947-70E740481C1C}">
+                                <a14:useLocalDpi xmlns:a14="http://schemas.microsoft.com/office/drawing/2010/main" val="0"/>
+                              </a:ext>
+                            </a:extLst>
+                          </a:blip>
+                          <a:srcRect/>
+                          <a:stretch>
+                            <a:fillRect/>
+                          </a:stretch>
+                        </pic:blipFill>
+                        <pic:spPr bwMode="auto">
+                          <a:xfrm>
+                            <a:off x="0" y="0"/>
+                            <a:ext cx="1835785" cy="1439545"/>
+                          </a:xfrm>
+                          <a:prstGeom prst="rect">
+                            <a:avLst/>
+                          </a:prstGeom>
+                          <a:noFill/>
+                          <a:ln>
+                            <a:noFill/>
+                          </a:ln>
+                        </pic:spPr>
+                      </pic:pic>
+                    </a:graphicData>
+                  </a:graphic>
+                </wp:inline>
+              </w:drawing>
+            </w:r>
+            <w:r>
+              <w:rPr>
+                <w:noProof/>
+              </w:rPr>
+              <w:drawing>
+                <wp:inline distT="0" distB="0" distL="0" distR="0" wp14:anchorId="70FC35A8" wp14:editId="27E578B5">
+                  <wp:extent cx="2098800" cy="1440000"/>
+                  <wp:effectExtent l="0" t="0" r="0" b="8255"/>
+                  <wp:docPr id="13" name="Picture 13"/>
+                  <wp:cNvGraphicFramePr>
+                    <a:graphicFrameLocks xmlns:a="http://schemas.openxmlformats.org/drawingml/2006/main" noChangeAspect="1"/>
+                  </wp:cNvGraphicFramePr>
+                  <a:graphic xmlns:a="http://schemas.openxmlformats.org/drawingml/2006/main">
+                    <a:graphicData uri="http://schemas.openxmlformats.org/drawingml/2006/picture">
+                      <pic:pic xmlns:pic="http://schemas.openxmlformats.org/drawingml/2006/picture">
+                        <pic:nvPicPr>
+                          <pic:cNvPr id="0" name="Picture 12"/>
+                          <pic:cNvPicPr>
+                            <a:picLocks noChangeAspect="1" noChangeArrowheads="1"/>
+                          </pic:cNvPicPr>
+                        </pic:nvPicPr>
+                        <pic:blipFill rotWithShape="1">
+                          <a:blip r:embed="rId20" cstate="print">
+                            <a:extLst>
+                              <a:ext uri="{28A0092B-C50C-407E-A947-70E740481C1C}">
+                                <a14:useLocalDpi xmlns:a14="http://schemas.microsoft.com/office/drawing/2010/main" val="0"/>
+                              </a:ext>
+                            </a:extLst>
+                          </a:blip>
+                          <a:srcRect l="12693" t="-17823" r="4312" b="-1"/>
+                          <a:stretch/>
+                        </pic:blipFill>
+                        <pic:spPr bwMode="auto">
+                          <a:xfrm>
+                            <a:off x="0" y="0"/>
+                            <a:ext cx="2098800" cy="1440000"/>
+                          </a:xfrm>
+                          <a:prstGeom prst="rect">
+                            <a:avLst/>
+                          </a:prstGeom>
+                          <a:blipFill>
+                            <a:blip r:embed="rId21"/>
+                            <a:stretch>
+                              <a:fillRect/>
+                            </a:stretch>
+                          </a:blipFill>
+                          <a:ln>
+                            <a:noFill/>
+                          </a:ln>
+                          <a:extLst>
+                            <a:ext uri="{53640926-AAD7-44D8-BBD7-CCE9431645EC}">
+                              <a14:shadowObscured xmlns:a14="http://schemas.microsoft.com/office/drawing/2010/main"/>
+                            </a:ext>
+                          </a:extLst>
+                        </pic:spPr>
+                      </pic:pic>
+                    </a:graphicData>
+                  </a:graphic>
+                </wp:inline>
+              </w:drawing>
+            </w:r>
+          </w:p>
+        </w:tc>
+        <w:tc>
+          <w:tcPr>
+            <w:tcW w:w="4738" w:type="dxa"/>
+            <w:vAlign w:val="center"/>
+          </w:tcPr>
+          <w:p>
+            <w:pPr>
+              <w:jc w:val="center"/>
+            </w:pPr>
+            <w:r>
+              <w:t>An evolution of the V2 design. Bevel gears were added to have a possibility of connecting a servo motor. Scrapped due to the complications of integrating a servo motor well, as well as the steering angle not being sufficient.</w:t>
+            </w:r>
+          </w:p>
+        </w:tc>
+      </w:tr>
+      <w:tr>
+        <w:tc>
+          <w:tcPr>
+            <w:tcW w:w="1410" w:type="dxa"/>
+            <w:vAlign w:val="center"/>
+          </w:tcPr>
+          <w:p>
+            <w:pPr>
+              <w:jc w:val="center"/>
+              <w:rPr>
+                <w:b/>
+                <w:bCs/>
+              </w:rPr>
+            </w:pPr>
+            <w:r>
+              <w:rPr>
+                <w:b/>
+                <w:bCs/>
+              </w:rPr>
+              <w:t>V4</w:t>
+            </w:r>
+          </w:p>
+        </w:tc>
+        <w:tc>
+          <w:tcPr>
+            <w:tcW w:w="3912" w:type="dxa"/>
+          </w:tcPr>
+          <w:p>
+            <w:pPr>
+              <w:jc w:val="center"/>
+            </w:pPr>
+            <w:r>
+              <w:rPr>
+                <w:noProof/>
+              </w:rPr>
+              <w:drawing>
+                <wp:inline distT="0" distB="0" distL="0" distR="0" wp14:anchorId="37C4AA42" wp14:editId="0EC4860A">
+                  <wp:extent cx="1742400" cy="1440000"/>
+                  <wp:effectExtent l="0" t="0" r="0" b="8255"/>
+                  <wp:docPr id="9" name="Picture 9"/>
+                  <wp:cNvGraphicFramePr>
+                    <a:graphicFrameLocks xmlns:a="http://schemas.openxmlformats.org/drawingml/2006/main" noChangeAspect="1"/>
+                  </wp:cNvGraphicFramePr>
+                  <a:graphic xmlns:a="http://schemas.openxmlformats.org/drawingml/2006/main">
+                    <a:graphicData uri="http://schemas.openxmlformats.org/drawingml/2006/picture">
+                      <pic:pic xmlns:pic="http://schemas.openxmlformats.org/drawingml/2006/picture">
+                        <pic:nvPicPr>
+                          <pic:cNvPr id="0" name="Picture 8"/>
+                          <pic:cNvPicPr>
+                            <a:picLocks noChangeAspect="1" noChangeArrowheads="1"/>
+                          </pic:cNvPicPr>
+                        </pic:nvPicPr>
+                        <pic:blipFill rotWithShape="1">
+                          <a:blip r:embed="rId22" cstate="print">
+                            <a:extLst>
+                              <a:ext uri="{28A0092B-C50C-407E-A947-70E740481C1C}">
+                                <a14:useLocalDpi xmlns:a14="http://schemas.microsoft.com/office/drawing/2010/main" val="0"/>
+                              </a:ext>
+                            </a:extLst>
+                          </a:blip>
+                          <a:srcRect l="8545" t="11382" r="11284" b="11314"/>
+                          <a:stretch/>
+                        </pic:blipFill>
+                        <pic:spPr bwMode="auto">
+                          <a:xfrm>
+                            <a:off x="0" y="0"/>
+                            <a:ext cx="1742400" cy="1440000"/>
+                          </a:xfrm>
+                          <a:prstGeom prst="rect">
+                            <a:avLst/>
+                          </a:prstGeom>
+                          <a:noFill/>
+                          <a:ln>
+                            <a:noFill/>
+                          </a:ln>
+                          <a:extLst>
+                            <a:ext uri="{53640926-AAD7-44D8-BBD7-CCE9431645EC}">
+                              <a14:shadowObscured xmlns:a14="http://schemas.microsoft.com/office/drawing/2010/main"/>
+                            </a:ext>
+                          </a:extLst>
+                        </pic:spPr>
+                      </pic:pic>
+                    </a:graphicData>
+                  </a:graphic>
+                </wp:inline>
+              </w:drawing>
+            </w:r>
+            <w:r>
+              <w:rPr>
+                <w:noProof/>
+              </w:rPr>
+              <w:drawing>
+                <wp:inline distT="0" distB="0" distL="0" distR="0" wp14:anchorId="0A757289" wp14:editId="6FF98DF0">
+                  <wp:extent cx="1918800" cy="1440000"/>
+                  <wp:effectExtent l="0" t="0" r="5715" b="8255"/>
+                  <wp:docPr id="10" name="Picture 10"/>
+                  <wp:cNvGraphicFramePr>
+                    <a:graphicFrameLocks xmlns:a="http://schemas.openxmlformats.org/drawingml/2006/main" noChangeAspect="1"/>
+                  </wp:cNvGraphicFramePr>
+                  <a:graphic xmlns:a="http://schemas.openxmlformats.org/drawingml/2006/main">
+                    <a:graphicData uri="http://schemas.openxmlformats.org/drawingml/2006/picture">
+                      <pic:pic xmlns:pic="http://schemas.openxmlformats.org/drawingml/2006/picture">
+                        <pic:nvPicPr>
+                          <pic:cNvPr id="0" name="Picture 9"/>
+                          <pic:cNvPicPr>
+                            <a:picLocks noChangeAspect="1" noChangeArrowheads="1"/>
+                          </pic:cNvPicPr>
+                        </pic:nvPicPr>
+                        <pic:blipFill rotWithShape="1">
+                          <a:blip r:embed="rId23" cstate="print">
+                            <a:extLst>
+                              <a:ext uri="{28A0092B-C50C-407E-A947-70E740481C1C}">
+                                <a14:useLocalDpi xmlns:a14="http://schemas.microsoft.com/office/drawing/2010/main" val="0"/>
+                              </a:ext>
+                            </a:extLst>
+                          </a:blip>
+                          <a:srcRect l="13899" t="-590" r="11747" b="209"/>
+                          <a:stretch/>
+                        </pic:blipFill>
+                        <pic:spPr bwMode="auto">
+                          <a:xfrm>
+                            <a:off x="0" y="0"/>
+                            <a:ext cx="1918800" cy="1440000"/>
+                          </a:xfrm>
+                          <a:prstGeom prst="rect">
+                            <a:avLst/>
+                          </a:prstGeom>
+                          <a:noFill/>
+                          <a:ln>
+                            <a:noFill/>
+                          </a:ln>
+                          <a:extLst>
+                            <a:ext uri="{53640926-AAD7-44D8-BBD7-CCE9431645EC}">
+                              <a14:shadowObscured xmlns:a14="http://schemas.microsoft.com/office/drawing/2010/main"/>
+                            </a:ext>
+                          </a:extLst>
+                        </pic:spPr>
+                      </pic:pic>
+                    </a:graphicData>
+                  </a:graphic>
+                </wp:inline>
+              </w:drawing>
+            </w:r>
+          </w:p>
+        </w:tc>
+        <w:tc>
+          <w:tcPr>
+            <w:tcW w:w="4738" w:type="dxa"/>
+          </w:tcPr>
+          <w:p>
+            <w:r>
+              <w:t xml:space="preserve">Brand new concept: have a worm gear connect to a lever arm, that would in turn move control arms that connect to wheel hubs. This design allowed sufficient space for the servo motor. Scrapped due to poor steering angle and the design being too many moving parts taking up too much space. </w:t>
+            </w:r>
+          </w:p>
+        </w:tc>
+      </w:tr>
+      <w:tr>
+        <w:tc>
+          <w:tcPr>
+            <w:tcW w:w="1410" w:type="dxa"/>
+            <w:vAlign w:val="center"/>
+          </w:tcPr>
+          <w:p>
+            <w:pPr>
+              <w:jc w:val="center"/>
+              <w:rPr>
+                <w:b/>
+                <w:bCs/>
+              </w:rPr>
+            </w:pPr>
+            <w:r>
+              <w:rPr>
+                <w:b/>
+                <w:bCs/>
+              </w:rPr>
+              <w:t>V5</w:t>
+            </w:r>
+          </w:p>
+        </w:tc>
+        <w:tc>
+          <w:tcPr>
+            <w:tcW w:w="3912" w:type="dxa"/>
+          </w:tcPr>
+          <w:p>
+            <w:pPr>
+              <w:jc w:val="center"/>
+            </w:pPr>
+            <w:r>
+              <w:rPr>
+                <w:noProof/>
+              </w:rPr>
+              <w:drawing>
+                <wp:inline distT="0" distB="0" distL="0" distR="0" wp14:anchorId="25090A84" wp14:editId="6D288937">
+                  <wp:extent cx="1764000" cy="1440000"/>
+                  <wp:effectExtent l="0" t="0" r="8255" b="8255"/>
+                  <wp:docPr id="14" name="Picture 14"/>
+                  <wp:cNvGraphicFramePr>
+                    <a:graphicFrameLocks xmlns:a="http://schemas.openxmlformats.org/drawingml/2006/main" noChangeAspect="1"/>
+                  </wp:cNvGraphicFramePr>
+                  <a:graphic xmlns:a="http://schemas.openxmlformats.org/drawingml/2006/main">
+                    <a:graphicData uri="http://schemas.openxmlformats.org/drawingml/2006/picture">
+                      <pic:pic xmlns:pic="http://schemas.openxmlformats.org/drawingml/2006/picture">
+                        <pic:nvPicPr>
+                          <pic:cNvPr id="0" name="Picture 13"/>
+                          <pic:cNvPicPr>
+                            <a:picLocks noChangeAspect="1" noChangeArrowheads="1"/>
+                          </pic:cNvPicPr>
+                        </pic:nvPicPr>
+                        <pic:blipFill>
+                          <a:blip r:embed="rId24" cstate="print">
+                            <a:extLst>
+                              <a:ext uri="{28A0092B-C50C-407E-A947-70E740481C1C}">
+                                <a14:useLocalDpi xmlns:a14="http://schemas.microsoft.com/office/drawing/2010/main" val="0"/>
+                              </a:ext>
+                            </a:extLst>
+                          </a:blip>
+                          <a:srcRect/>
+                          <a:stretch>
+                            <a:fillRect/>
+                          </a:stretch>
+                        </pic:blipFill>
+                        <pic:spPr bwMode="auto">
+                          <a:xfrm>
+                            <a:off x="0" y="0"/>
+                            <a:ext cx="1764000" cy="1440000"/>
+                          </a:xfrm>
+                          <a:prstGeom prst="rect">
+                            <a:avLst/>
+                          </a:prstGeom>
+                          <a:noFill/>
+                          <a:ln>
+                            <a:noFill/>
+                          </a:ln>
+                        </pic:spPr>
+                      </pic:pic>
+                    </a:graphicData>
+                  </a:graphic>
+                </wp:inline>
+              </w:drawing>
+            </w:r>
+            <w:r>
+              <w:rPr>
+                <w:noProof/>
+              </w:rPr>
+              <w:drawing>
+                <wp:inline distT="0" distB="0" distL="0" distR="0" wp14:anchorId="1AB66838" wp14:editId="1253B059">
+                  <wp:extent cx="2253600" cy="1440000"/>
+                  <wp:effectExtent l="0" t="0" r="0" b="8255"/>
+                  <wp:docPr id="15" name="Picture 15"/>
+                  <wp:cNvGraphicFramePr>
+                    <a:graphicFrameLocks xmlns:a="http://schemas.openxmlformats.org/drawingml/2006/main" noChangeAspect="1"/>
+                  </wp:cNvGraphicFramePr>
+                  <a:graphic xmlns:a="http://schemas.openxmlformats.org/drawingml/2006/main">
+                    <a:graphicData uri="http://schemas.openxmlformats.org/drawingml/2006/picture">
+                      <pic:pic xmlns:pic="http://schemas.openxmlformats.org/drawingml/2006/picture">
+                        <pic:nvPicPr>
+                          <pic:cNvPr id="0" name="Picture 14"/>
+                          <pic:cNvPicPr>
+                            <a:picLocks noChangeAspect="1" noChangeArrowheads="1"/>
+                          </pic:cNvPicPr>
+                        </pic:nvPicPr>
+                        <pic:blipFill rotWithShape="1">
+                          <a:blip r:embed="rId25" cstate="print">
+                            <a:extLst>
+                              <a:ext uri="{28A0092B-C50C-407E-A947-70E740481C1C}">
+                                <a14:useLocalDpi xmlns:a14="http://schemas.microsoft.com/office/drawing/2010/main" val="0"/>
+                              </a:ext>
+                            </a:extLst>
+                          </a:blip>
+                          <a:srcRect l="9397" r="6030"/>
+                          <a:stretch/>
+                        </pic:blipFill>
+                        <pic:spPr bwMode="auto">
+                          <a:xfrm>
+                            <a:off x="0" y="0"/>
+                            <a:ext cx="2253600" cy="1440000"/>
+                          </a:xfrm>
+                          <a:prstGeom prst="rect">
+                            <a:avLst/>
+                          </a:prstGeom>
+                          <a:noFill/>
+                          <a:ln>
+                            <a:noFill/>
+                          </a:ln>
+                          <a:extLst>
+                            <a:ext uri="{53640926-AAD7-44D8-BBD7-CCE9431645EC}">
+                              <a14:shadowObscured xmlns:a14="http://schemas.microsoft.com/office/drawing/2010/main"/>
+                            </a:ext>
+                          </a:extLst>
+                        </pic:spPr>
+                      </pic:pic>
+                    </a:graphicData>
+                  </a:graphic>
+                </wp:inline>
+              </w:drawing>
+            </w:r>
+          </w:p>
+        </w:tc>
+        <w:tc>
+          <w:tcPr>
+            <w:tcW w:w="4738" w:type="dxa"/>
+          </w:tcPr>
+          <w:p>
+            <w:pPr>
+              <w:jc w:val="center"/>
+            </w:pPr>
+            <w:r>
+              <w:t>An attempt at a rack and pinion design concept. Now the steering system was more compact and had less general friction. Through extreme control arm attachment points high steering angles were achieved. Scrapped due to non-existent stability when steering</w:t>
+            </w:r>
+            <w:r>
+              <w:t xml:space="preserve"> </w:t>
+            </w:r>
+            <w:r>
+              <w:t>(</w:t>
+            </w:r>
+            <w:r>
+              <w:t xml:space="preserve">a </w:t>
+            </w:r>
+            <w:r>
+              <w:t>direct consequence of control arm attachment), and poor robustness of the system</w:t>
+            </w:r>
+            <w:r>
+              <w:t xml:space="preserve"> </w:t>
+            </w:r>
+            <w:r>
+              <w:lastRenderedPageBreak/>
+              <w:t>(control arm attachment “ears” would break off)</w:t>
+            </w:r>
+            <w:r>
+              <w:t>.</w:t>
+            </w:r>
+          </w:p>
+          <w:p>
+            <w:pPr>
+              <w:jc w:val="center"/>
+            </w:pPr>
+            <w:r>
+              <w:t>Custom wheel rims for the tires in use were created</w:t>
+            </w:r>
+            <w:r>
+              <w:t xml:space="preserve"> </w:t>
+            </w:r>
+            <w:r>
+              <w:t>(this part would be used in later designs as well)</w:t>
+            </w:r>
+          </w:p>
+        </w:tc>
+      </w:tr>
+      <w:tr>
+        <w:tc>
+          <w:tcPr>
+            <w:tcW w:w="1410" w:type="dxa"/>
+            <w:vAlign w:val="center"/>
+          </w:tcPr>
+          <w:p>
+            <w:pPr>
+              <w:jc w:val="center"/>
+              <w:rPr>
+                <w:b/>
+                <w:bCs/>
+              </w:rPr>
+            </w:pPr>
+            <w:r>
+              <w:rPr>
+                <w:b/>
+                <w:bCs/>
+              </w:rPr>
+              <w:lastRenderedPageBreak/>
+              <w:t>V6</w:t>
+            </w:r>
+          </w:p>
+        </w:tc>
+        <w:tc>
+          <w:tcPr>
+            <w:tcW w:w="3912" w:type="dxa"/>
+          </w:tcPr>
+          <w:p>
+            <w:pPr>
+              <w:jc w:val="center"/>
+            </w:pPr>
+            <w:r>
+              <w:rPr>
+                <w:noProof/>
+              </w:rPr>
+              <w:drawing>
+                <wp:inline distT="0" distB="0" distL="0" distR="0" wp14:anchorId="07BA4A57" wp14:editId="6E465C82">
+                  <wp:extent cx="1519200" cy="1440000"/>
+                  <wp:effectExtent l="0" t="0" r="5080" b="8255"/>
+                  <wp:docPr id="16" name="Picture 16"/>
+                  <wp:cNvGraphicFramePr>
+                    <a:graphicFrameLocks xmlns:a="http://schemas.openxmlformats.org/drawingml/2006/main" noChangeAspect="1"/>
+                  </wp:cNvGraphicFramePr>
+                  <a:graphic xmlns:a="http://schemas.openxmlformats.org/drawingml/2006/main">
+                    <a:graphicData uri="http://schemas.openxmlformats.org/drawingml/2006/picture">
+                      <pic:pic xmlns:pic="http://schemas.openxmlformats.org/drawingml/2006/picture">
+                        <pic:nvPicPr>
+                          <pic:cNvPr id="0" name="Picture 15"/>
+                          <pic:cNvPicPr>
+                            <a:picLocks noChangeAspect="1" noChangeArrowheads="1"/>
+                          </pic:cNvPicPr>
+                        </pic:nvPicPr>
+                        <pic:blipFill>
+                          <a:blip r:embed="rId26" cstate="print">
+                            <a:extLst>
+                              <a:ext uri="{28A0092B-C50C-407E-A947-70E740481C1C}">
+                                <a14:useLocalDpi xmlns:a14="http://schemas.microsoft.com/office/drawing/2010/main" val="0"/>
+                              </a:ext>
+                            </a:extLst>
+                          </a:blip>
+                          <a:srcRect/>
+                          <a:stretch>
+                            <a:fillRect/>
+                          </a:stretch>
+                        </pic:blipFill>
+                        <pic:spPr bwMode="auto">
+                          <a:xfrm>
+                            <a:off x="0" y="0"/>
+                            <a:ext cx="1519200" cy="1440000"/>
+                          </a:xfrm>
+                          <a:prstGeom prst="rect">
+                            <a:avLst/>
+                          </a:prstGeom>
+                          <a:noFill/>
+                          <a:ln>
+                            <a:noFill/>
+                          </a:ln>
+                        </pic:spPr>
+                      </pic:pic>
+                    </a:graphicData>
+                  </a:graphic>
+                </wp:inline>
+              </w:drawing>
+            </w:r>
+            <w:r>
+              <w:rPr>
+                <w:noProof/>
+              </w:rPr>
+              <w:drawing>
+                <wp:inline distT="0" distB="0" distL="0" distR="0" wp14:anchorId="1C3690F8" wp14:editId="07A5BF6B">
+                  <wp:extent cx="1465200" cy="1440000"/>
+                  <wp:effectExtent l="0" t="0" r="1905" b="8255"/>
+                  <wp:docPr id="17" name="Picture 17"/>
+                  <wp:cNvGraphicFramePr>
+                    <a:graphicFrameLocks xmlns:a="http://schemas.openxmlformats.org/drawingml/2006/main" noChangeAspect="1"/>
+                  </wp:cNvGraphicFramePr>
+                  <a:graphic xmlns:a="http://schemas.openxmlformats.org/drawingml/2006/main">
+                    <a:graphicData uri="http://schemas.openxmlformats.org/drawingml/2006/picture">
+                      <pic:pic xmlns:pic="http://schemas.openxmlformats.org/drawingml/2006/picture">
+                        <pic:nvPicPr>
+                          <pic:cNvPr id="0" name="Picture 16"/>
+                          <pic:cNvPicPr>
+                            <a:picLocks noChangeAspect="1" noChangeArrowheads="1"/>
+                          </pic:cNvPicPr>
+                        </pic:nvPicPr>
+                        <pic:blipFill>
+                          <a:blip r:embed="rId27" cstate="print">
+                            <a:extLst>
+                              <a:ext uri="{28A0092B-C50C-407E-A947-70E740481C1C}">
+                                <a14:useLocalDpi xmlns:a14="http://schemas.microsoft.com/office/drawing/2010/main" val="0"/>
+                              </a:ext>
+                            </a:extLst>
+                          </a:blip>
+                          <a:srcRect/>
+                          <a:stretch>
+                            <a:fillRect/>
+                          </a:stretch>
+                        </pic:blipFill>
+                        <pic:spPr bwMode="auto">
+                          <a:xfrm>
+                            <a:off x="0" y="0"/>
+                            <a:ext cx="1465200" cy="1440000"/>
+                          </a:xfrm>
+                          <a:prstGeom prst="rect">
+                            <a:avLst/>
+                          </a:prstGeom>
+                          <a:noFill/>
+                          <a:ln>
+                            <a:noFill/>
+                          </a:ln>
+                        </pic:spPr>
+                      </pic:pic>
+                    </a:graphicData>
+                  </a:graphic>
+                </wp:inline>
+              </w:drawing>
+            </w:r>
+          </w:p>
+        </w:tc>
+        <w:tc>
+          <w:tcPr>
+            <w:tcW w:w="4738" w:type="dxa"/>
+          </w:tcPr>
+          <w:p>
+            <w:pPr>
+              <w:jc w:val="center"/>
+            </w:pPr>
+            <w:r>
+              <w:t>A test of a (yet another) new concept. The concept is as follows: have 3 spur gears connected together. The middle one attached to the servo and being driven. The gears on the side have wheel hubs on them and attach to the wheels. All three gears move in sync. This concept was evolved further into the V7 variant.</w:t>
+            </w:r>
+          </w:p>
+        </w:tc>
+      </w:tr>
+      <w:tr>
+        <w:tc>
+          <w:tcPr>
+            <w:tcW w:w="1410" w:type="dxa"/>
+            <w:vAlign w:val="center"/>
+          </w:tcPr>
+          <w:p>
+            <w:pPr>
+              <w:jc w:val="center"/>
+              <w:rPr>
+                <w:b/>
+                <w:bCs/>
+              </w:rPr>
+            </w:pPr>
+            <w:r>
+              <w:rPr>
+                <w:b/>
+                <w:bCs/>
+              </w:rPr>
+              <w:t>V7</w:t>
+            </w:r>
+          </w:p>
+        </w:tc>
+        <w:tc>
+          <w:tcPr>
+            <w:tcW w:w="3912" w:type="dxa"/>
+          </w:tcPr>
+          <w:p>
+            <w:pPr>
+              <w:jc w:val="center"/>
+            </w:pPr>
+            <w:r>
+              <w:rPr>
+                <w:noProof/>
+              </w:rPr>
+              <w:drawing>
+                <wp:inline distT="0" distB="0" distL="0" distR="0" wp14:anchorId="7F823B6C" wp14:editId="422EAB06">
+                  <wp:extent cx="1267200" cy="1440000"/>
+                  <wp:effectExtent l="0" t="0" r="0" b="8255"/>
+                  <wp:docPr id="18" name="Picture 18"/>
+                  <wp:cNvGraphicFramePr>
+                    <a:graphicFrameLocks xmlns:a="http://schemas.openxmlformats.org/drawingml/2006/main" noChangeAspect="1"/>
+                  </wp:cNvGraphicFramePr>
+                  <a:graphic xmlns:a="http://schemas.openxmlformats.org/drawingml/2006/main">
+                    <a:graphicData uri="http://schemas.openxmlformats.org/drawingml/2006/picture">
+                      <pic:pic xmlns:pic="http://schemas.openxmlformats.org/drawingml/2006/picture">
+                        <pic:nvPicPr>
+                          <pic:cNvPr id="0" name="Picture 17"/>
+                          <pic:cNvPicPr>
+                            <a:picLocks noChangeAspect="1" noChangeArrowheads="1"/>
+                          </pic:cNvPicPr>
+                        </pic:nvPicPr>
+                        <pic:blipFill>
+                          <a:blip r:embed="rId28" cstate="print">
+                            <a:extLst>
+                              <a:ext uri="{28A0092B-C50C-407E-A947-70E740481C1C}">
+                                <a14:useLocalDpi xmlns:a14="http://schemas.microsoft.com/office/drawing/2010/main" val="0"/>
+                              </a:ext>
+                            </a:extLst>
+                          </a:blip>
+                          <a:srcRect/>
+                          <a:stretch>
+                            <a:fillRect/>
+                          </a:stretch>
+                        </pic:blipFill>
+                        <pic:spPr bwMode="auto">
+                          <a:xfrm>
+                            <a:off x="0" y="0"/>
+                            <a:ext cx="1267200" cy="1440000"/>
+                          </a:xfrm>
+                          <a:prstGeom prst="rect">
+                            <a:avLst/>
+                          </a:prstGeom>
+                          <a:noFill/>
+                          <a:ln>
+                            <a:noFill/>
+                          </a:ln>
+                        </pic:spPr>
+                      </pic:pic>
+                    </a:graphicData>
+                  </a:graphic>
+                </wp:inline>
+              </w:drawing>
+            </w:r>
+            <w:r>
+              <w:rPr>
+                <w:noProof/>
+              </w:rPr>
+              <w:drawing>
+                <wp:inline distT="0" distB="0" distL="0" distR="0" wp14:anchorId="3E052873" wp14:editId="3FD2D987">
+                  <wp:extent cx="1594485" cy="1439545"/>
+                  <wp:effectExtent l="0" t="0" r="5715" b="8255"/>
+                  <wp:docPr id="19" name="Picture 19"/>
+                  <wp:cNvGraphicFramePr>
+                    <a:graphicFrameLocks xmlns:a="http://schemas.openxmlformats.org/drawingml/2006/main" noChangeAspect="1"/>
+                  </wp:cNvGraphicFramePr>
+                  <a:graphic xmlns:a="http://schemas.openxmlformats.org/drawingml/2006/main">
+                    <a:graphicData uri="http://schemas.openxmlformats.org/drawingml/2006/picture">
+                      <pic:pic xmlns:pic="http://schemas.openxmlformats.org/drawingml/2006/picture">
+                        <pic:nvPicPr>
+                          <pic:cNvPr id="0" name="Picture 18"/>
+                          <pic:cNvPicPr>
+                            <a:picLocks noChangeAspect="1" noChangeArrowheads="1"/>
+                          </pic:cNvPicPr>
+                        </pic:nvPicPr>
+                        <pic:blipFill>
+                          <a:blip r:embed="rId29" cstate="print">
+                            <a:extLst>
+                              <a:ext uri="{28A0092B-C50C-407E-A947-70E740481C1C}">
+                                <a14:useLocalDpi xmlns:a14="http://schemas.microsoft.com/office/drawing/2010/main" val="0"/>
+                              </a:ext>
+                            </a:extLst>
+                          </a:blip>
+                          <a:srcRect/>
+                          <a:stretch>
+                            <a:fillRect/>
+                          </a:stretch>
+                        </pic:blipFill>
+                        <pic:spPr bwMode="auto">
+                          <a:xfrm>
+                            <a:off x="0" y="0"/>
+                            <a:ext cx="1594485" cy="1439545"/>
+                          </a:xfrm>
+                          <a:prstGeom prst="rect">
+                            <a:avLst/>
+                          </a:prstGeom>
+                          <a:noFill/>
+                          <a:ln>
+                            <a:noFill/>
+                          </a:ln>
+                        </pic:spPr>
+                      </pic:pic>
+                    </a:graphicData>
+                  </a:graphic>
+                </wp:inline>
+              </w:drawing>
+            </w:r>
+          </w:p>
+        </w:tc>
+        <w:tc>
+          <w:tcPr>
+            <w:tcW w:w="4738" w:type="dxa"/>
+          </w:tcPr>
+          <w:p>
+            <w:pPr>
+              <w:jc w:val="center"/>
+            </w:pPr>
+            <w:r>
+              <w:t xml:space="preserve">A full, working adaptation of V6 concept. Features a mounting point for the servo motor. Wheel hubs designed for minimum footprint and optimal leverages. The exact dimensions </w:t>
+            </w:r>
+            <w:r>
+              <w:t xml:space="preserve">and mounting hole </w:t>
+            </w:r>
+            <w:r>
+              <w:t xml:space="preserve">were tailored to the </w:t>
+            </w:r>
+            <w:hyperlink w:anchor="_2.3._Chassis" w:history="1">
+              <w:r>
+                <w:rPr>
+                  <w:rStyle w:val="Hyperlink"/>
+                </w:rPr>
+                <w:t>cha</w:t>
+              </w:r>
+              <w:r>
+                <w:rPr>
+                  <w:rStyle w:val="Hyperlink"/>
+                </w:rPr>
+                <w:t>s</w:t>
+              </w:r>
+              <w:r>
+                <w:rPr>
+                  <w:rStyle w:val="Hyperlink"/>
+                </w:rPr>
+                <w:t>sis</w:t>
+              </w:r>
+            </w:hyperlink>
+            <w:r>
+              <w:t xml:space="preserve"> that we decided to use.</w:t>
+            </w:r>
+            <w:r>
+              <w:t xml:space="preserve"> Custom wheel rims adjusted to fit wheel hubs. </w:t>
+            </w:r>
+            <w:r>
+              <w:t xml:space="preserve"> </w:t>
+            </w:r>
+          </w:p>
+        </w:tc>
+      </w:tr>
+    </w:tbl>
+    <w:p/>
+    <w:p>
+      <w:r>
+        <w:t xml:space="preserve">During the design process of the steering system, at iteration </w:t>
+      </w:r>
+      <w:r>
+        <w:rPr>
+          <w:b/>
+          <w:bCs/>
+        </w:rPr>
+        <w:t>V5</w:t>
+      </w:r>
+      <w:r>
+        <w:t xml:space="preserve">, the tire specification to be used was decided. We wanted simple tires, that are abundant on the market. For steering, wide tires were required, as there had to be sufficient grip for sharp turning </w:t>
+      </w:r>
+      <w:r>
+        <w:lastRenderedPageBreak/>
+        <w:t>maneuvers. Also, the tires had to have a small vertical footprint. That is because the front wheels weren’t going to be driven, so the wheel size was inconsequential in this regard, but smaller wheels allowed for a more compact design, which is one of the princip</w:t>
+      </w:r>
+      <w:r>
+        <w:t>al</w:t>
+      </w:r>
+      <w:r>
+        <w:t xml:space="preserve"> requirements of our steering system.</w:t>
+      </w:r>
+    </w:p>
+    <w:p>
+      <w:r>
+        <w:t>We considered various LEGO® tires, as all of us had plenty of them at home (so, the effective cost of using one would be 0), and they were made out of a sufficiently grippy material for our purposes.</w:t>
+      </w:r>
+    </w:p>
+    <w:p>
+      <w:r>
+        <w:t xml:space="preserve">After trying out multiple variants, we found that, out of the models that we had, </w:t>
+      </w:r>
+      <w:hyperlink w:anchor="_2._List_of" w:history="1">
+        <w:r>
+          <w:rPr>
+            <w:rStyle w:val="Hyperlink"/>
+          </w:rPr>
+          <w:t>tire 43.2 x 22 ZR</w:t>
+        </w:r>
+      </w:hyperlink>
+      <w:r>
+        <w:t xml:space="preserve"> fit our needs best. </w:t>
+      </w:r>
+    </w:p>
+    <w:p>
+      <w:r>
+        <w:t>It became clear immediately, that the stock wheel rims wouldn’t work for us, as we needed round holes, whereas the LEGO</w:t>
+      </w:r>
+      <w:r>
+        <w:t>®</w:t>
+      </w:r>
+      <w:r>
+        <w:t xml:space="preserve"> rims all have cross shaped holes. Because of that, we designed our own hubs.</w:t>
+      </w:r>
+    </w:p>
+    <w:p>
+      <w:r>
+        <w:t>The custom wheel hubs also underwent significant evolution</w:t>
+      </w:r>
+      <w:r>
+        <w:t>, that we showcase here:</w:t>
+      </w:r>
+    </w:p>
+    <w:tbl>
+      <w:tblPr>
+        <w:tblStyle w:val="TableGrid"/>
+        <w:tblW w:w="10060" w:type="dxa"/>
+        <w:tblLook w:val="04A0" w:firstRow="1" w:lastRow="0" w:firstColumn="1" w:lastColumn="0" w:noHBand="0" w:noVBand="1"/>
+      </w:tblPr>
+      <w:tblGrid>
+        <w:gridCol w:w="2689"/>
+        <w:gridCol w:w="3801"/>
+        <w:gridCol w:w="3570"/>
+      </w:tblGrid>
+      <w:tr>
+        <w:tc>
+          <w:tcPr>
+            <w:tcW w:w="2689" w:type="dxa"/>
+            <w:vAlign w:val="center"/>
+          </w:tcPr>
+          <w:p>
+            <w:pPr>
+              <w:jc w:val="center"/>
+              <w:rPr>
+                <w:i/>
+                <w:iCs/>
+              </w:rPr>
+            </w:pPr>
+            <w:r>
+              <w:rPr>
+                <w:i/>
+                <w:iCs/>
+              </w:rPr>
+              <w:t>Designed for steering version</w:t>
+            </w:r>
+          </w:p>
+        </w:tc>
+        <w:tc>
+          <w:tcPr>
+            <w:tcW w:w="3801" w:type="dxa"/>
+            <w:vAlign w:val="center"/>
+          </w:tcPr>
+          <w:p>
+            <w:pPr>
+              <w:jc w:val="center"/>
+              <w:rPr>
+                <w:i/>
+                <w:iCs/>
+              </w:rPr>
+            </w:pPr>
+            <w:r>
+              <w:rPr>
+                <w:i/>
+                <w:iCs/>
+              </w:rPr>
+              <w:t>Visuals</w:t>
+            </w:r>
+          </w:p>
+        </w:tc>
+        <w:tc>
+          <w:tcPr>
+            <w:tcW w:w="3570" w:type="dxa"/>
+            <w:vAlign w:val="center"/>
+          </w:tcPr>
+          <w:p>
+            <w:pPr>
+              <w:jc w:val="center"/>
+              <w:rPr>
+                <w:i/>
+                <w:iCs/>
+              </w:rPr>
+            </w:pPr>
+            <w:r>
+              <w:rPr>
+                <w:i/>
+                <w:iCs/>
+              </w:rPr>
+              <w:t>Constraining features</w:t>
+            </w:r>
+          </w:p>
+        </w:tc>
+      </w:tr>
+      <w:tr>
+        <w:tc>
+          <w:tcPr>
+            <w:tcW w:w="2689" w:type="dxa"/>
+            <w:vAlign w:val="center"/>
+          </w:tcPr>
+          <w:p>
+            <w:pPr>
+              <w:jc w:val="center"/>
+              <w:rPr>
+                <w:b/>
+                <w:bCs/>
+              </w:rPr>
+            </w:pPr>
+            <w:r>
+              <w:rPr>
+                <w:b/>
+                <w:bCs/>
+              </w:rPr>
+              <w:t>V5</w:t>
+            </w:r>
+          </w:p>
+        </w:tc>
+        <w:tc>
+          <w:tcPr>
+            <w:tcW w:w="3801" w:type="dxa"/>
+            <w:vAlign w:val="center"/>
+          </w:tcPr>
+          <w:p>
+            <w:pPr>
+              <w:jc w:val="center"/>
+            </w:pPr>
+            <w:r>
+              <w:rPr>
+                <w:noProof/>
+              </w:rPr>
+              <w:drawing>
+                <wp:inline distT="0" distB="0" distL="0" distR="0" wp14:anchorId="5C120F4B" wp14:editId="1E84F945">
+                  <wp:extent cx="1393200" cy="1440000"/>
+                  <wp:effectExtent l="0" t="0" r="0" b="8255"/>
+                  <wp:docPr id="20" name="Picture 20"/>
+                  <wp:cNvGraphicFramePr>
+                    <a:graphicFrameLocks xmlns:a="http://schemas.openxmlformats.org/drawingml/2006/main" noChangeAspect="1"/>
+                  </wp:cNvGraphicFramePr>
+                  <a:graphic xmlns:a="http://schemas.openxmlformats.org/drawingml/2006/main">
+                    <a:graphicData uri="http://schemas.openxmlformats.org/drawingml/2006/picture">
+                      <pic:pic xmlns:pic="http://schemas.openxmlformats.org/drawingml/2006/picture">
+                        <pic:nvPicPr>
+                          <pic:cNvPr id="0" name="Picture 19"/>
+                          <pic:cNvPicPr>
+                            <a:picLocks noChangeAspect="1" noChangeArrowheads="1"/>
+                          </pic:cNvPicPr>
+                        </pic:nvPicPr>
+                        <pic:blipFill>
+                          <a:blip r:embed="rId30" cstate="print">
+                            <a:extLst>
+                              <a:ext uri="{28A0092B-C50C-407E-A947-70E740481C1C}">
+                                <a14:useLocalDpi xmlns:a14="http://schemas.microsoft.com/office/drawing/2010/main" val="0"/>
+                              </a:ext>
+                            </a:extLst>
+                          </a:blip>
+                          <a:srcRect/>
+                          <a:stretch>
+                            <a:fillRect/>
+                          </a:stretch>
+                        </pic:blipFill>
+                        <pic:spPr bwMode="auto">
+                          <a:xfrm>
+                            <a:off x="0" y="0"/>
+                            <a:ext cx="1393200" cy="1440000"/>
+                          </a:xfrm>
+                          <a:prstGeom prst="rect">
+                            <a:avLst/>
+                          </a:prstGeom>
+                          <a:noFill/>
+                          <a:ln>
+                            <a:noFill/>
+                          </a:ln>
+                        </pic:spPr>
+                      </pic:pic>
+                    </a:graphicData>
+                  </a:graphic>
+                </wp:inline>
+              </w:drawing>
+            </w:r>
+          </w:p>
+        </w:tc>
+        <w:tc>
+          <w:tcPr>
+            <w:tcW w:w="3570" w:type="dxa"/>
+            <w:vAlign w:val="center"/>
+          </w:tcPr>
+          <w:p>
+            <w:pPr>
+              <w:jc w:val="center"/>
+            </w:pPr>
+            <w:r>
+              <w:t>Mount on the side, of the rotating assembly, have minimum weight.</w:t>
+            </w:r>
+          </w:p>
+        </w:tc>
+      </w:tr>
+      <w:tr>
+        <w:tc>
+          <w:tcPr>
+            <w:tcW w:w="2689" w:type="dxa"/>
+            <w:vAlign w:val="center"/>
+          </w:tcPr>
+          <w:p>
+            <w:pPr>
+              <w:jc w:val="center"/>
+              <w:rPr>
+                <w:b/>
+                <w:bCs/>
+              </w:rPr>
+            </w:pPr>
+            <w:r>
+              <w:rPr>
+                <w:b/>
+                <w:bCs/>
+              </w:rPr>
+              <w:t>V7</w:t>
+            </w:r>
+          </w:p>
+        </w:tc>
+        <w:tc>
+          <w:tcPr>
+            <w:tcW w:w="3801" w:type="dxa"/>
+            <w:vAlign w:val="center"/>
+          </w:tcPr>
+          <w:p>
+            <w:pPr>
+              <w:jc w:val="center"/>
+            </w:pPr>
+            <w:r>
+              <w:rPr>
+                <w:noProof/>
+              </w:rPr>
+              <w:drawing>
+                <wp:inline distT="0" distB="0" distL="0" distR="0" wp14:anchorId="00F570C1" wp14:editId="7C7DC786">
+                  <wp:extent cx="1403985" cy="1439545"/>
+                  <wp:effectExtent l="0" t="0" r="5715" b="8255"/>
+                  <wp:docPr id="21" name="Picture 21"/>
+                  <wp:cNvGraphicFramePr>
+                    <a:graphicFrameLocks xmlns:a="http://schemas.openxmlformats.org/drawingml/2006/main" noChangeAspect="1"/>
+                  </wp:cNvGraphicFramePr>
+                  <a:graphic xmlns:a="http://schemas.openxmlformats.org/drawingml/2006/main">
+                    <a:graphicData uri="http://schemas.openxmlformats.org/drawingml/2006/picture">
+                      <pic:pic xmlns:pic="http://schemas.openxmlformats.org/drawingml/2006/picture">
+                        <pic:nvPicPr>
+                          <pic:cNvPr id="0" name="Picture 20"/>
+                          <pic:cNvPicPr>
+                            <a:picLocks noChangeAspect="1" noChangeArrowheads="1"/>
+                          </pic:cNvPicPr>
+                        </pic:nvPicPr>
+                        <pic:blipFill>
+                          <a:blip r:embed="rId31" cstate="print">
+                            <a:extLst>
+                              <a:ext uri="{28A0092B-C50C-407E-A947-70E740481C1C}">
+                                <a14:useLocalDpi xmlns:a14="http://schemas.microsoft.com/office/drawing/2010/main" val="0"/>
+                              </a:ext>
+                            </a:extLst>
+                          </a:blip>
+                          <a:srcRect/>
+                          <a:stretch>
+                            <a:fillRect/>
+                          </a:stretch>
+                        </pic:blipFill>
+                        <pic:spPr bwMode="auto">
+                          <a:xfrm>
+                            <a:off x="0" y="0"/>
+                            <a:ext cx="1403985" cy="1439545"/>
+                          </a:xfrm>
+                          <a:prstGeom prst="rect">
+                            <a:avLst/>
+                          </a:prstGeom>
+                          <a:noFill/>
+                          <a:ln>
+                            <a:noFill/>
+                          </a:ln>
+                        </pic:spPr>
+                      </pic:pic>
+                    </a:graphicData>
+                  </a:graphic>
+                </wp:inline>
+              </w:drawing>
+            </w:r>
+          </w:p>
+        </w:tc>
+        <w:tc>
+          <w:tcPr>
+            <w:tcW w:w="3570" w:type="dxa"/>
+            <w:vAlign w:val="center"/>
+          </w:tcPr>
+          <w:p>
+            <w:pPr>
+              <w:jc w:val="center"/>
+              <w:rPr>
+                <w:lang w:val="lt-LT"/>
+              </w:rPr>
+            </w:pPr>
+            <w:r>
+              <w:t xml:space="preserve">Mount in the middle of </w:t>
+            </w:r>
+            <w:r>
+              <w:t>the</w:t>
+            </w:r>
+            <w:r>
+              <w:t xml:space="preserve"> rotating fork</w:t>
+            </w:r>
+            <w:r>
+              <w:t>, center the wheel, and have minimum weight</w:t>
+            </w:r>
+          </w:p>
+        </w:tc>
+      </w:tr>
+    </w:tbl>
+    <w:p/>
+    <w:p/>
+    <w:p>
+      <w:pPr>
+        <w:pStyle w:val="Heading2"/>
+      </w:pPr>
+      <w:bookmarkStart w:id="14" w:name="_2.3._Chassis"/>
+      <w:bookmarkStart w:id="15" w:name="_3.3._Chassis"/>
+      <w:bookmarkStart w:id="16" w:name="_Toc226578610"/>
+      <w:bookmarkEnd w:id="14"/>
+      <w:bookmarkEnd w:id="15"/>
+      <w:r>
+        <w:lastRenderedPageBreak/>
+        <w:t>3</w:t>
+      </w:r>
+      <w:r>
+        <w:t>.</w:t>
+      </w:r>
+      <w:r>
+        <w:t>3</w:t>
+      </w:r>
+      <w:r>
+        <w:t>. Chassis</w:t>
+      </w:r>
+      <w:bookmarkEnd w:id="16"/>
+    </w:p>
+    <w:p>
+      <w:r>
+        <w:t xml:space="preserve">The choice of a chassis </w:t>
+      </w:r>
+      <w:r>
+        <w:t xml:space="preserve">was affected not only by engineering needs, but also </w:t>
+      </w:r>
+      <w:r>
+        <w:t xml:space="preserve">other </w:t>
+      </w:r>
+      <w:r>
+        <w:t>surroundin</w:t>
+      </w:r>
+      <w:r>
+        <w:t>g factors</w:t>
+      </w:r>
+      <w:r>
+        <w:t xml:space="preserve"> at the time. Our school has a </w:t>
+      </w:r>
+      <w:r>
+        <w:t>big</w:t>
+      </w:r>
+      <w:r>
+        <w:t xml:space="preserve"> </w:t>
+      </w:r>
+      <w:r>
+        <w:t>fleet</w:t>
+      </w:r>
+      <w:r>
+        <w:t xml:space="preserve"> of </w:t>
+      </w:r>
+      <w:proofErr w:type="spellStart"/>
+      <w:r>
+        <w:t>Makeblock</w:t>
+      </w:r>
+      <w:proofErr w:type="spellEnd"/>
+      <w:r>
+        <w:t xml:space="preserve"> mBot2® robots. </w:t>
+      </w:r>
+      <w:r>
+        <w:t>During the time of construction of our robot, one of them broke down</w:t>
+      </w:r>
+      <w:r>
+        <w:t xml:space="preserve"> completely</w:t>
+      </w:r>
+      <w:r>
+        <w:t xml:space="preserve">. After an inspection, the school wrote it off as unusable. Thus, we got an opportunity to make use of its part if we wanted to. Indeed, the </w:t>
+      </w:r>
+      <w:r>
+        <w:t>mBot2®</w:t>
+      </w:r>
+      <w:r>
+        <w:t xml:space="preserve"> was of use to us. Firstly, it is made of metal, so it will not break during any use case. Secondly, it has, many perforations for mounting various sensors and attachments</w:t>
+      </w:r>
+      <w:r>
+        <w:t>, so it allows for good design flexibility</w:t>
+      </w:r>
+      <w:r>
+        <w:t>. Also, there is an economical and environmental benefit as well, because using this chassis didn’t cost us any money, and didn’t allow a perfectly usable metal component be put to waste.</w:t>
+      </w:r>
+      <w:r>
+        <w:t xml:space="preserve"> That is how we chose our main chassis.</w:t>
+      </w:r>
+    </w:p>
+    <w:p>
+      <w:pPr>
+        <w:pStyle w:val="Heading2"/>
+      </w:pPr>
+      <w:bookmarkStart w:id="17" w:name="_Toc226578611"/>
+      <w:r>
+        <w:t>3</w:t>
+      </w:r>
+      <w:r>
+        <w:t>.</w:t>
+      </w:r>
+      <w:r>
+        <w:t>4</w:t>
+      </w:r>
+      <w:r>
+        <w:t>. Driven axle</w:t>
+      </w:r>
+      <w:bookmarkEnd w:id="17"/>
     </w:p>
     <w:p/>
+    <w:p>
+      <w:pPr>
+        <w:pStyle w:val="Heading2"/>
+      </w:pPr>
+      <w:r>
+        <w:t>3</w:t>
+      </w:r>
+      <w:r>
+        <w:t>.</w:t>
+      </w:r>
+      <w:r>
+        <w:t>5</w:t>
+      </w:r>
+      <w:r>
+        <w:t xml:space="preserve">. </w:t>
+      </w:r>
+      <w:r>
+        <w:t>Overall design summary, tradeoffs</w:t>
+      </w:r>
+    </w:p>
     <w:p>
       <w:r>
         <w:br w:type="page"/>
@@ -1413,17 +4469,20 @@
       <w:pPr>
         <w:pStyle w:val="Heading1"/>
       </w:pPr>
-      <w:bookmarkStart w:id="9" w:name="_3._Circuit_design"/>
-      <w:bookmarkStart w:id="10" w:name="_Toc223879319"/>
-      <w:bookmarkEnd w:id="9"/>
+      <w:bookmarkStart w:id="18" w:name="_3._Circuit_design"/>
+      <w:bookmarkStart w:id="19" w:name="_Toc226578612"/>
+      <w:bookmarkEnd w:id="18"/>
       <w:r>
         <w:lastRenderedPageBreak/>
-        <w:t xml:space="preserve">3. </w:t>
+        <w:t>4</w:t>
+      </w:r>
+      <w:r>
+        <w:t xml:space="preserve">. </w:t>
       </w:r>
       <w:r>
         <w:t>Circuit design and sensors</w:t>
       </w:r>
-      <w:bookmarkEnd w:id="10"/>
+      <w:bookmarkEnd w:id="19"/>
     </w:p>
     <w:p/>
     <w:p>
@@ -1435,10 +4494,13 @@
       <w:pPr>
         <w:pStyle w:val="Heading1"/>
       </w:pPr>
-      <w:bookmarkStart w:id="11" w:name="_Toc223879320"/>
+      <w:bookmarkStart w:id="20" w:name="_Toc226578613"/>
       <w:r>
         <w:lastRenderedPageBreak/>
-        <w:t>4.</w:t>
+        <w:t>5</w:t>
+      </w:r>
+      <w:r>
+        <w:t>.</w:t>
       </w:r>
       <w:r>
         <w:t xml:space="preserve"> </w:t>
@@ -1446,11 +4508,11 @@
       <w:r>
         <w:t>Software</w:t>
       </w:r>
-      <w:bookmarkEnd w:id="11"/>
+      <w:bookmarkEnd w:id="20"/>
     </w:p>
     <w:p/>
     <w:sectPr>
-      <w:footerReference w:type="default" r:id="rId9"/>
+      <w:footerReference w:type="default" r:id="rId32"/>
       <w:pgSz w:w="11906" w:h="16838"/>
       <w:pgMar w:top="1440" w:right="1080" w:bottom="1440" w:left="1080" w:header="567" w:footer="567" w:gutter="0"/>
       <w:pgNumType w:start="0"/>
@@ -2206,6 +5268,7 @@
   <w:style w:type="character" w:default="1" w:styleId="DefaultParagraphFont">
     <w:name w:val="Default Paragraph Font"/>
     <w:uiPriority w:val="1"/>
+    <w:semiHidden/>
     <w:unhideWhenUsed/>
   </w:style>
   <w:style w:type="table" w:default="1" w:styleId="TableNormal">
@@ -2469,6 +5532,339 @@
       <w:ind w:left="320"/>
     </w:pPr>
   </w:style>
+  <w:style w:type="paragraph" w:styleId="Caption">
+    <w:name w:val="caption"/>
+    <w:basedOn w:val="Normal"/>
+    <w:next w:val="Normal"/>
+    <w:uiPriority w:val="35"/>
+    <w:unhideWhenUsed/>
+    <w:qFormat/>
+    <w:rsid w:val="002269FE"/>
+    <w:pPr>
+      <w:spacing w:after="200" w:line="240" w:lineRule="auto"/>
+    </w:pPr>
+    <w:rPr>
+      <w:i/>
+      <w:iCs/>
+      <w:color w:val="44546A" w:themeColor="text2"/>
+      <w:sz w:val="18"/>
+      <w:szCs w:val="18"/>
+    </w:rPr>
+  </w:style>
+  <w:style w:type="table" w:styleId="TableGrid">
+    <w:name w:val="Table Grid"/>
+    <w:basedOn w:val="TableNormal"/>
+    <w:uiPriority w:val="39"/>
+    <w:rsid w:val="00900767"/>
+    <w:pPr>
+      <w:spacing w:after="0" w:line="240" w:lineRule="auto"/>
+    </w:pPr>
+    <w:tblPr>
+      <w:tblBorders>
+        <w:top w:val="single" w:sz="4" w:space="0" w:color="auto"/>
+        <w:left w:val="single" w:sz="4" w:space="0" w:color="auto"/>
+        <w:bottom w:val="single" w:sz="4" w:space="0" w:color="auto"/>
+        <w:right w:val="single" w:sz="4" w:space="0" w:color="auto"/>
+        <w:insideH w:val="single" w:sz="4" w:space="0" w:color="auto"/>
+        <w:insideV w:val="single" w:sz="4" w:space="0" w:color="auto"/>
+      </w:tblBorders>
+    </w:tblPr>
+  </w:style>
+  <w:style w:type="table" w:styleId="PlainTable5">
+    <w:name w:val="Plain Table 5"/>
+    <w:basedOn w:val="TableNormal"/>
+    <w:uiPriority w:val="45"/>
+    <w:rsid w:val="005763A5"/>
+    <w:pPr>
+      <w:spacing w:after="0" w:line="240" w:lineRule="auto"/>
+    </w:pPr>
+    <w:tblPr>
+      <w:tblStyleRowBandSize w:val="1"/>
+      <w:tblStyleColBandSize w:val="1"/>
+    </w:tblPr>
+    <w:tblStylePr w:type="firstRow">
+      <w:rPr>
+        <w:rFonts w:asciiTheme="majorHAnsi" w:eastAsiaTheme="majorEastAsia" w:hAnsiTheme="majorHAnsi" w:cstheme="majorBidi"/>
+        <w:i/>
+        <w:iCs/>
+        <w:sz w:val="26"/>
+      </w:rPr>
+      <w:tblPr/>
+      <w:tcPr>
+        <w:tcBorders>
+          <w:bottom w:val="single" w:sz="4" w:space="0" w:color="7F7F7F" w:themeColor="text1" w:themeTint="80"/>
+        </w:tcBorders>
+        <w:shd w:val="clear" w:color="auto" w:fill="FFFFFF" w:themeFill="background1"/>
+      </w:tcPr>
+    </w:tblStylePr>
+    <w:tblStylePr w:type="lastRow">
+      <w:rPr>
+        <w:rFonts w:asciiTheme="majorHAnsi" w:eastAsiaTheme="majorEastAsia" w:hAnsiTheme="majorHAnsi" w:cstheme="majorBidi"/>
+        <w:i/>
+        <w:iCs/>
+        <w:sz w:val="26"/>
+      </w:rPr>
+      <w:tblPr/>
+      <w:tcPr>
+        <w:tcBorders>
+          <w:top w:val="single" w:sz="4" w:space="0" w:color="7F7F7F" w:themeColor="text1" w:themeTint="80"/>
+        </w:tcBorders>
+        <w:shd w:val="clear" w:color="auto" w:fill="FFFFFF" w:themeFill="background1"/>
+      </w:tcPr>
+    </w:tblStylePr>
+    <w:tblStylePr w:type="firstCol">
+      <w:pPr>
+        <w:jc w:val="right"/>
+      </w:pPr>
+      <w:rPr>
+        <w:rFonts w:asciiTheme="majorHAnsi" w:eastAsiaTheme="majorEastAsia" w:hAnsiTheme="majorHAnsi" w:cstheme="majorBidi"/>
+        <w:i/>
+        <w:iCs/>
+        <w:sz w:val="26"/>
+      </w:rPr>
+      <w:tblPr/>
+      <w:tcPr>
+        <w:tcBorders>
+          <w:right w:val="single" w:sz="4" w:space="0" w:color="7F7F7F" w:themeColor="text1" w:themeTint="80"/>
+        </w:tcBorders>
+        <w:shd w:val="clear" w:color="auto" w:fill="FFFFFF" w:themeFill="background1"/>
+      </w:tcPr>
+    </w:tblStylePr>
+    <w:tblStylePr w:type="lastCol">
+      <w:rPr>
+        <w:rFonts w:asciiTheme="majorHAnsi" w:eastAsiaTheme="majorEastAsia" w:hAnsiTheme="majorHAnsi" w:cstheme="majorBidi"/>
+        <w:i/>
+        <w:iCs/>
+        <w:sz w:val="26"/>
+      </w:rPr>
+      <w:tblPr/>
+      <w:tcPr>
+        <w:tcBorders>
+          <w:left w:val="single" w:sz="4" w:space="0" w:color="7F7F7F" w:themeColor="text1" w:themeTint="80"/>
+        </w:tcBorders>
+        <w:shd w:val="clear" w:color="auto" w:fill="FFFFFF" w:themeFill="background1"/>
+      </w:tcPr>
+    </w:tblStylePr>
+    <w:tblStylePr w:type="band1Vert">
+      <w:tblPr/>
+      <w:tcPr>
+        <w:shd w:val="clear" w:color="auto" w:fill="F2F2F2" w:themeFill="background1" w:themeFillShade="F2"/>
+      </w:tcPr>
+    </w:tblStylePr>
+    <w:tblStylePr w:type="band1Horz">
+      <w:tblPr/>
+      <w:tcPr>
+        <w:shd w:val="clear" w:color="auto" w:fill="F2F2F2" w:themeFill="background1" w:themeFillShade="F2"/>
+      </w:tcPr>
+    </w:tblStylePr>
+    <w:tblStylePr w:type="neCell">
+      <w:tblPr/>
+      <w:tcPr>
+        <w:tcBorders>
+          <w:left w:val="nil"/>
+        </w:tcBorders>
+      </w:tcPr>
+    </w:tblStylePr>
+    <w:tblStylePr w:type="nwCell">
+      <w:tblPr/>
+      <w:tcPr>
+        <w:tcBorders>
+          <w:right w:val="nil"/>
+        </w:tcBorders>
+      </w:tcPr>
+    </w:tblStylePr>
+    <w:tblStylePr w:type="seCell">
+      <w:tblPr/>
+      <w:tcPr>
+        <w:tcBorders>
+          <w:left w:val="nil"/>
+        </w:tcBorders>
+      </w:tcPr>
+    </w:tblStylePr>
+    <w:tblStylePr w:type="swCell">
+      <w:tblPr/>
+      <w:tcPr>
+        <w:tcBorders>
+          <w:right w:val="nil"/>
+        </w:tcBorders>
+      </w:tcPr>
+    </w:tblStylePr>
+  </w:style>
+  <w:style w:type="table" w:styleId="PlainTable3">
+    <w:name w:val="Plain Table 3"/>
+    <w:basedOn w:val="TableNormal"/>
+    <w:uiPriority w:val="43"/>
+    <w:rsid w:val="005763A5"/>
+    <w:pPr>
+      <w:spacing w:after="0" w:line="240" w:lineRule="auto"/>
+    </w:pPr>
+    <w:tblPr>
+      <w:tblStyleRowBandSize w:val="1"/>
+      <w:tblStyleColBandSize w:val="1"/>
+    </w:tblPr>
+    <w:tblStylePr w:type="firstRow">
+      <w:rPr>
+        <w:b/>
+        <w:bCs/>
+        <w:caps/>
+      </w:rPr>
+      <w:tblPr/>
+      <w:tcPr>
+        <w:tcBorders>
+          <w:bottom w:val="single" w:sz="4" w:space="0" w:color="7F7F7F" w:themeColor="text1" w:themeTint="80"/>
+        </w:tcBorders>
+      </w:tcPr>
+    </w:tblStylePr>
+    <w:tblStylePr w:type="lastRow">
+      <w:rPr>
+        <w:b/>
+        <w:bCs/>
+        <w:caps/>
+      </w:rPr>
+      <w:tblPr/>
+      <w:tcPr>
+        <w:tcBorders>
+          <w:top w:val="nil"/>
+        </w:tcBorders>
+      </w:tcPr>
+    </w:tblStylePr>
+    <w:tblStylePr w:type="firstCol">
+      <w:rPr>
+        <w:b/>
+        <w:bCs/>
+        <w:caps/>
+      </w:rPr>
+      <w:tblPr/>
+      <w:tcPr>
+        <w:tcBorders>
+          <w:right w:val="single" w:sz="4" w:space="0" w:color="7F7F7F" w:themeColor="text1" w:themeTint="80"/>
+        </w:tcBorders>
+      </w:tcPr>
+    </w:tblStylePr>
+    <w:tblStylePr w:type="lastCol">
+      <w:rPr>
+        <w:b/>
+        <w:bCs/>
+        <w:caps/>
+      </w:rPr>
+      <w:tblPr/>
+      <w:tcPr>
+        <w:tcBorders>
+          <w:left w:val="nil"/>
+        </w:tcBorders>
+      </w:tcPr>
+    </w:tblStylePr>
+    <w:tblStylePr w:type="band1Vert">
+      <w:tblPr/>
+      <w:tcPr>
+        <w:shd w:val="clear" w:color="auto" w:fill="F2F2F2" w:themeFill="background1" w:themeFillShade="F2"/>
+      </w:tcPr>
+    </w:tblStylePr>
+    <w:tblStylePr w:type="band1Horz">
+      <w:tblPr/>
+      <w:tcPr>
+        <w:shd w:val="clear" w:color="auto" w:fill="F2F2F2" w:themeFill="background1" w:themeFillShade="F2"/>
+      </w:tcPr>
+    </w:tblStylePr>
+    <w:tblStylePr w:type="neCell">
+      <w:tblPr/>
+      <w:tcPr>
+        <w:tcBorders>
+          <w:left w:val="nil"/>
+        </w:tcBorders>
+      </w:tcPr>
+    </w:tblStylePr>
+    <w:tblStylePr w:type="nwCell">
+      <w:tblPr/>
+      <w:tcPr>
+        <w:tcBorders>
+          <w:right w:val="nil"/>
+        </w:tcBorders>
+      </w:tcPr>
+    </w:tblStylePr>
+  </w:style>
+  <w:style w:type="table" w:styleId="PlainTable1">
+    <w:name w:val="Plain Table 1"/>
+    <w:basedOn w:val="TableNormal"/>
+    <w:uiPriority w:val="41"/>
+    <w:rsid w:val="005763A5"/>
+    <w:pPr>
+      <w:spacing w:after="0" w:line="240" w:lineRule="auto"/>
+    </w:pPr>
+    <w:tblPr>
+      <w:tblStyleRowBandSize w:val="1"/>
+      <w:tblStyleColBandSize w:val="1"/>
+      <w:tblBorders>
+        <w:top w:val="single" w:sz="4" w:space="0" w:color="BFBFBF" w:themeColor="background1" w:themeShade="BF"/>
+        <w:left w:val="single" w:sz="4" w:space="0" w:color="BFBFBF" w:themeColor="background1" w:themeShade="BF"/>
+        <w:bottom w:val="single" w:sz="4" w:space="0" w:color="BFBFBF" w:themeColor="background1" w:themeShade="BF"/>
+        <w:right w:val="single" w:sz="4" w:space="0" w:color="BFBFBF" w:themeColor="background1" w:themeShade="BF"/>
+        <w:insideH w:val="single" w:sz="4" w:space="0" w:color="BFBFBF" w:themeColor="background1" w:themeShade="BF"/>
+        <w:insideV w:val="single" w:sz="4" w:space="0" w:color="BFBFBF" w:themeColor="background1" w:themeShade="BF"/>
+      </w:tblBorders>
+    </w:tblPr>
+    <w:tblStylePr w:type="firstRow">
+      <w:rPr>
+        <w:b/>
+        <w:bCs/>
+      </w:rPr>
+    </w:tblStylePr>
+    <w:tblStylePr w:type="lastRow">
+      <w:rPr>
+        <w:b/>
+        <w:bCs/>
+      </w:rPr>
+      <w:tblPr/>
+      <w:tcPr>
+        <w:tcBorders>
+          <w:top w:val="double" w:sz="4" w:space="0" w:color="BFBFBF" w:themeColor="background1" w:themeShade="BF"/>
+        </w:tcBorders>
+      </w:tcPr>
+    </w:tblStylePr>
+    <w:tblStylePr w:type="firstCol">
+      <w:rPr>
+        <w:b/>
+        <w:bCs/>
+      </w:rPr>
+    </w:tblStylePr>
+    <w:tblStylePr w:type="lastCol">
+      <w:rPr>
+        <w:b/>
+        <w:bCs/>
+      </w:rPr>
+    </w:tblStylePr>
+    <w:tblStylePr w:type="band1Vert">
+      <w:tblPr/>
+      <w:tcPr>
+        <w:shd w:val="clear" w:color="auto" w:fill="F2F2F2" w:themeFill="background1" w:themeFillShade="F2"/>
+      </w:tcPr>
+    </w:tblStylePr>
+    <w:tblStylePr w:type="band1Horz">
+      <w:tblPr/>
+      <w:tcPr>
+        <w:shd w:val="clear" w:color="auto" w:fill="F2F2F2" w:themeFill="background1" w:themeFillShade="F2"/>
+      </w:tcPr>
+    </w:tblStylePr>
+  </w:style>
+  <w:style w:type="table" w:styleId="TableGridLight">
+    <w:name w:val="Grid Table Light"/>
+    <w:basedOn w:val="TableNormal"/>
+    <w:uiPriority w:val="40"/>
+    <w:rsid w:val="005763A5"/>
+    <w:pPr>
+      <w:spacing w:after="0" w:line="240" w:lineRule="auto"/>
+    </w:pPr>
+    <w:tblPr>
+      <w:tblBorders>
+        <w:top w:val="single" w:sz="4" w:space="0" w:color="BFBFBF" w:themeColor="background1" w:themeShade="BF"/>
+        <w:left w:val="single" w:sz="4" w:space="0" w:color="BFBFBF" w:themeColor="background1" w:themeShade="BF"/>
+        <w:bottom w:val="single" w:sz="4" w:space="0" w:color="BFBFBF" w:themeColor="background1" w:themeShade="BF"/>
+        <w:right w:val="single" w:sz="4" w:space="0" w:color="BFBFBF" w:themeColor="background1" w:themeShade="BF"/>
+        <w:insideH w:val="single" w:sz="4" w:space="0" w:color="BFBFBF" w:themeColor="background1" w:themeShade="BF"/>
+        <w:insideV w:val="single" w:sz="4" w:space="0" w:color="BFBFBF" w:themeColor="background1" w:themeShade="BF"/>
+      </w:tblBorders>
+    </w:tblPr>
+  </w:style>
 </w:styles>
 </file>
 
@@ -2611,14 +6007,14 @@
     <w:charset w:val="00"/>
     <w:family w:val="roman"/>
     <w:pitch w:val="variable"/>
-    <w:sig w:usb0="E0002AFF" w:usb1="C0007843" w:usb2="00000009" w:usb3="00000000" w:csb0="000001FF" w:csb1="00000000"/>
+    <w:sig w:usb0="E0002EFF" w:usb1="C000785B" w:usb2="00000009" w:usb3="00000000" w:csb0="000001FF" w:csb1="00000000"/>
   </w:font>
   <w:font w:name="Calibri">
     <w:panose1 w:val="020F0502020204030204"/>
     <w:charset w:val="BA"/>
     <w:family w:val="swiss"/>
     <w:pitch w:val="variable"/>
-    <w:sig w:usb0="E0002AFF" w:usb1="4000ACFF" w:usb2="00000001" w:usb3="00000000" w:csb0="000001FF" w:csb1="00000000"/>
+    <w:sig w:usb0="E4002EFF" w:usb1="C200247B" w:usb2="00000009" w:usb3="00000000" w:csb0="000001FF" w:csb1="00000000"/>
   </w:font>
   <w:font w:name="Yu Mincho">
     <w:altName w:val="游明朝"/>
@@ -2630,16 +6026,17 @@
   </w:font>
   <w:font w:name="Arial">
     <w:panose1 w:val="020B0604020202020204"/>
-    <w:charset w:val="BA"/>
-    <w:family w:val="swiss"/>
-    <w:pitch w:val="variable"/>
-    <w:sig w:usb0="E0002AFF" w:usb1="C0007843" w:usb2="00000009" w:usb3="00000000" w:csb0="000001FF" w:csb1="00000000"/>
-  </w:font>
-  <w:font w:name="Arial Nova">
     <w:charset w:val="00"/>
     <w:family w:val="swiss"/>
     <w:pitch w:val="variable"/>
-    <w:sig w:usb0="2000028F" w:usb1="00000002" w:usb2="00000000" w:usb3="00000000" w:csb0="0000019F" w:csb1="00000000"/>
+    <w:sig w:usb0="E0002EFF" w:usb1="C000785B" w:usb2="00000009" w:usb3="00000000" w:csb0="000001FF" w:csb1="00000000"/>
+  </w:font>
+  <w:font w:name="Arial Nova">
+    <w:altName w:val="Arial Nova"/>
+    <w:charset w:val="00"/>
+    <w:family w:val="swiss"/>
+    <w:pitch w:val="variable"/>
+    <w:sig w:usb0="0000028F" w:usb1="00000002" w:usb2="00000000" w:usb3="00000000" w:csb0="0000019F" w:csb1="00000000"/>
   </w:font>
   <w:font w:name="Yu Gothic Light">
     <w:altName w:val="游ゴシック Light"/>
@@ -2654,7 +6051,7 @@
     <w:charset w:val="BA"/>
     <w:family w:val="swiss"/>
     <w:pitch w:val="variable"/>
-    <w:sig w:usb0="A0002AEF" w:usb1="4000207B" w:usb2="00000000" w:usb3="00000000" w:csb0="000001FF" w:csb1="00000000"/>
+    <w:sig w:usb0="E4002EFF" w:usb1="C200247B" w:usb2="00000009" w:usb3="00000000" w:csb0="000001FF" w:csb1="00000000"/>
   </w:font>
   <w:font w:name="Arial Black">
     <w:panose1 w:val="020B0A04020102020204"/>
@@ -2682,8 +6079,15 @@
   </w:compat>
   <w:rsids>
     <w:rsidRoot w:val="00A419A3"/>
+    <w:rsid w:val="001128BE"/>
+    <w:rsid w:val="002C06E3"/>
+    <w:rsid w:val="006A017D"/>
+    <w:rsid w:val="00835DEA"/>
+    <w:rsid w:val="008E581B"/>
+    <w:rsid w:val="009514D4"/>
     <w:rsid w:val="00A419A3"/>
     <w:rsid w:val="00BB4168"/>
+    <w:rsid w:val="00F77FB5"/>
   </w:rsids>
   <m:mathPr>
     <m:mathFont m:val="Cambria Math"/>
@@ -3148,22 +6552,6 @@
     <w:name w:val="25ACD28374674DA29B4516C0291F6A87"/>
     <w:rsid w:val="00A419A3"/>
   </w:style>
-  <w:style w:type="paragraph" w:customStyle="1" w:styleId="C803F299F7274CCCB9DD14DBC32A0A1C">
-    <w:name w:val="C803F299F7274CCCB9DD14DBC32A0A1C"/>
-    <w:rsid w:val="00A419A3"/>
-  </w:style>
-  <w:style w:type="paragraph" w:customStyle="1" w:styleId="5D8E9888F4114C719250129F1F779C90">
-    <w:name w:val="5D8E9888F4114C719250129F1F779C90"/>
-    <w:rsid w:val="00A419A3"/>
-  </w:style>
-  <w:style w:type="paragraph" w:customStyle="1" w:styleId="BD19EB6EA83146F1A2029FDCCCD2EF2B">
-    <w:name w:val="BD19EB6EA83146F1A2029FDCCCD2EF2B"/>
-    <w:rsid w:val="00A419A3"/>
-  </w:style>
-  <w:style w:type="paragraph" w:customStyle="1" w:styleId="30F810E089D04B5CA77D1FC118EE7C99">
-    <w:name w:val="30F810E089D04B5CA77D1FC118EE7C99"/>
-    <w:rsid w:val="00A419A3"/>
-  </w:style>
 </w:styles>
 </file>
 

</xml_diff>

<commit_message>
Updated the Engineering journal. Mechanical platform part now complete.
</commit_message>
<xml_diff>
--- a/WRO_2026_Team_Hot_Glue_Engineering_Journal.docx
+++ b/WRO_2026_Team_Hot_Glue_Engineering_Journal.docx
@@ -1,6 +1,6 @@
 
 <file path=word/document.xml><?xml version="1.0" encoding="utf-8"?>
-<w:document xmlns:wpc="http://schemas.microsoft.com/office/word/2010/wordprocessingCanvas" xmlns:cx="http://schemas.microsoft.com/office/drawing/2014/chartex" xmlns:cx1="http://schemas.microsoft.com/office/drawing/2015/9/8/chartex" xmlns:cx2="http://schemas.microsoft.com/office/drawing/2015/10/21/chartex" xmlns:cx3="http://schemas.microsoft.com/office/drawing/2016/5/9/chartex" xmlns:cx4="http://schemas.microsoft.com/office/drawing/2016/5/10/chartex" xmlns:cx5="http://schemas.microsoft.com/office/drawing/2016/5/11/chartex" xmlns:cx6="http://schemas.microsoft.com/office/drawing/2016/5/12/chartex" xmlns:cx7="http://schemas.microsoft.com/office/drawing/2016/5/13/chartex" xmlns:cx8="http://schemas.microsoft.com/office/drawing/2016/5/14/chartex" xmlns:mc="http://schemas.openxmlformats.org/markup-compatibility/2006" xmlns:aink="http://schemas.microsoft.com/office/drawing/2016/ink" xmlns:am3d="http://schemas.microsoft.com/office/drawing/2017/model3d" xmlns:o="urn:schemas-microsoft-com:office:office" xmlns:r="http://schemas.openxmlformats.org/officeDocument/2006/relationships" xmlns:m="http://schemas.openxmlformats.org/officeDocument/2006/math" xmlns:v="urn:schemas-microsoft-com:vml" xmlns:wp14="http://schemas.microsoft.com/office/word/2010/wordprocessingDrawing" xmlns:wp="http://schemas.openxmlformats.org/drawingml/2006/wordprocessingDrawing" xmlns:w10="urn:schemas-microsoft-com:office:word" xmlns:w="http://schemas.openxmlformats.org/wordprocessingml/2006/main" xmlns:w14="http://schemas.microsoft.com/office/word/2010/wordml" xmlns:w15="http://schemas.microsoft.com/office/word/2012/wordml" xmlns:w16cex="http://schemas.microsoft.com/office/word/2018/wordml/cex" xmlns:w16cid="http://schemas.microsoft.com/office/word/2016/wordml/cid" xmlns:w16="http://schemas.microsoft.com/office/word/2018/wordml" xmlns:w16sdtdh="http://schemas.microsoft.com/office/word/2020/wordml/sdtdatahash" xmlns:w16se="http://schemas.microsoft.com/office/word/2015/wordml/symex" xmlns:wpg="http://schemas.microsoft.com/office/word/2010/wordprocessingGroup" xmlns:wpi="http://schemas.microsoft.com/office/word/2010/wordprocessingInk" xmlns:wne="http://schemas.microsoft.com/office/word/2006/wordml" xmlns:wps="http://schemas.microsoft.com/office/word/2010/wordprocessingShape" mc:Ignorable="w14 w15 w16se w16cid w16 w16cex w16sdtdh wp14">
+<w:document xmlns:wpc="http://schemas.microsoft.com/office/word/2010/wordprocessingCanvas" xmlns:cx="http://schemas.microsoft.com/office/drawing/2014/chartex" xmlns:cx1="http://schemas.microsoft.com/office/drawing/2015/9/8/chartex" xmlns:cx2="http://schemas.microsoft.com/office/drawing/2015/10/21/chartex" xmlns:cx3="http://schemas.microsoft.com/office/drawing/2016/5/9/chartex" xmlns:cx4="http://schemas.microsoft.com/office/drawing/2016/5/10/chartex" xmlns:cx5="http://schemas.microsoft.com/office/drawing/2016/5/11/chartex" xmlns:cx6="http://schemas.microsoft.com/office/drawing/2016/5/12/chartex" xmlns:cx7="http://schemas.microsoft.com/office/drawing/2016/5/13/chartex" xmlns:cx8="http://schemas.microsoft.com/office/drawing/2016/5/14/chartex" xmlns:mc="http://schemas.openxmlformats.org/markup-compatibility/2006" xmlns:aink="http://schemas.microsoft.com/office/drawing/2016/ink" xmlns:am3d="http://schemas.microsoft.com/office/drawing/2017/model3d" xmlns:o="urn:schemas-microsoft-com:office:office" xmlns:r="http://schemas.openxmlformats.org/officeDocument/2006/relationships" xmlns:m="http://schemas.openxmlformats.org/officeDocument/2006/math" xmlns:v="urn:schemas-microsoft-com:vml" xmlns:wp14="http://schemas.microsoft.com/office/word/2010/wordprocessingDrawing" xmlns:wp="http://schemas.openxmlformats.org/drawingml/2006/wordprocessingDrawing" xmlns:w10="urn:schemas-microsoft-com:office:word" xmlns:w="http://schemas.openxmlformats.org/wordprocessingml/2006/main" xmlns:w14="http://schemas.microsoft.com/office/word/2010/wordml" xmlns:w15="http://schemas.microsoft.com/office/word/2012/wordml" xmlns:w16cex="http://schemas.microsoft.com/office/word/2018/wordml/cex" xmlns:w16cid="http://schemas.microsoft.com/office/word/2016/wordml/cid" xmlns:w16="http://schemas.microsoft.com/office/word/2018/wordml" xmlns:w16se="http://schemas.microsoft.com/office/word/2015/wordml/symex" xmlns:wpg="http://schemas.microsoft.com/office/word/2010/wordprocessingGroup" xmlns:wpi="http://schemas.microsoft.com/office/word/2010/wordprocessingInk" xmlns:wne="http://schemas.microsoft.com/office/word/2006/wordml" xmlns:wps="http://schemas.microsoft.com/office/word/2010/wordprocessingShape" mc:Ignorable="w14 w15 w16se w16cid w16 w16cex wp14">
   <w:body>
     <w:sdt>
       <w:sdtPr>
@@ -36,7 +36,7 @@
             <w:sdt>
               <w:sdtPr>
                 <w:rPr>
-                  <w:rStyle w:val="PavadinimasDiagrama"/>
+                  <w:rStyle w:val="TitleChar"/>
                 </w:rPr>
                 <w:alias w:val="Company"/>
                 <w:id w:val="13406915"/>
@@ -48,7 +48,7 @@
               </w:sdtPr>
               <w:sdtEndPr>
                 <w:rPr>
-                  <w:rStyle w:val="PavadinimasDiagrama"/>
+                  <w:rStyle w:val="TitleChar"/>
                 </w:rPr>
               </w:sdtEndPr>
               <w:sdtContent>
@@ -64,7 +64,7 @@
                   </w:tcPr>
                   <w:p>
                     <w:pPr>
-                      <w:pStyle w:val="Betarp"/>
+                      <w:pStyle w:val="NoSpacing"/>
                       <w:rPr>
                         <w:color w:val="000000" w:themeColor="text1"/>
                         <w:sz w:val="24"/>
@@ -72,7 +72,7 @@
                     </w:pPr>
                     <w:r>
                       <w:rPr>
-                        <w:rStyle w:val="PavadinimasDiagrama"/>
+                        <w:rStyle w:val="TitleChar"/>
                       </w:rPr>
                       <w:t>Team Hot Glue</w:t>
                     </w:r>
@@ -92,7 +92,7 @@
               <w:sdt>
                 <w:sdtPr>
                   <w:rPr>
-                    <w:rStyle w:val="Knygospavadinimas"/>
+                    <w:rStyle w:val="BookTitle"/>
                   </w:rPr>
                   <w:alias w:val="Title"/>
                   <w:id w:val="13406919"/>
@@ -104,13 +104,13 @@
                 </w:sdtPr>
                 <w:sdtEndPr>
                   <w:rPr>
-                    <w:rStyle w:val="Knygospavadinimas"/>
+                    <w:rStyle w:val="BookTitle"/>
                   </w:rPr>
                 </w:sdtEndPr>
                 <w:sdtContent>
                   <w:p>
                     <w:pPr>
-                      <w:pStyle w:val="Betarp"/>
+                      <w:pStyle w:val="NoSpacing"/>
                       <w:spacing w:line="216" w:lineRule="auto"/>
                       <w:rPr>
                         <w:rFonts w:asciiTheme="majorHAnsi" w:eastAsiaTheme="majorEastAsia" w:hAnsiTheme="majorHAnsi" w:cstheme="majorBidi"/>
@@ -121,7 +121,7 @@
                     </w:pPr>
                     <w:r>
                       <w:rPr>
-                        <w:rStyle w:val="Knygospavadinimas"/>
+                        <w:rStyle w:val="BookTitle"/>
                       </w:rPr>
                       <w:t>Engineering Journal</w:t>
                     </w:r>
@@ -137,7 +137,7 @@
             <w:sdt>
               <w:sdtPr>
                 <w:rPr>
-                  <w:rStyle w:val="PavadinimasDiagrama"/>
+                  <w:rStyle w:val="TitleChar"/>
                 </w:rPr>
                 <w:alias w:val="Subtitle"/>
                 <w:id w:val="13406923"/>
@@ -149,7 +149,7 @@
               </w:sdtPr>
               <w:sdtEndPr>
                 <w:rPr>
-                  <w:rStyle w:val="PavadinimasDiagrama"/>
+                  <w:rStyle w:val="TitleChar"/>
                 </w:rPr>
               </w:sdtEndPr>
               <w:sdtContent>
@@ -166,7 +166,7 @@
                   </w:tcPr>
                   <w:p>
                     <w:pPr>
-                      <w:pStyle w:val="Betarp"/>
+                      <w:pStyle w:val="NoSpacing"/>
                       <w:rPr>
                         <w:color w:val="000000" w:themeColor="text1"/>
                         <w:sz w:val="24"/>
@@ -174,7 +174,7 @@
                     </w:pPr>
                     <w:r>
                       <w:rPr>
-                        <w:rStyle w:val="PavadinimasDiagrama"/>
+                        <w:rStyle w:val="TitleChar"/>
                       </w:rPr>
                       <w:t>WRO 2026</w:t>
                     </w:r>
@@ -230,7 +230,7 @@
               </w:sdt>
               <w:p>
                 <w:pPr>
-                  <w:pStyle w:val="Betarp"/>
+                  <w:pStyle w:val="NoSpacing"/>
                   <w:rPr>
                     <w:color w:val="000000" w:themeColor="text1"/>
                     <w:sz w:val="28"/>
@@ -240,7 +240,7 @@
               </w:p>
               <w:p>
                 <w:pPr>
-                  <w:pStyle w:val="Betarp"/>
+                  <w:pStyle w:val="NoSpacing"/>
                   <w:rPr>
                     <w:color w:val="000000" w:themeColor="text1"/>
                   </w:rPr>
@@ -280,21 +280,21 @@
       <w:sdtContent>
         <w:p>
           <w:pPr>
-            <w:pStyle w:val="Turinioantrat"/>
+            <w:pStyle w:val="TOCHeading"/>
             <w:rPr>
-              <w:rStyle w:val="PavadinimasDiagrama"/>
+              <w:rStyle w:val="TitleChar"/>
             </w:rPr>
           </w:pPr>
           <w:r>
             <w:rPr>
-              <w:rStyle w:val="PavadinimasDiagrama"/>
+              <w:rStyle w:val="TitleChar"/>
             </w:rPr>
             <w:t>Table of Contents</w:t>
           </w:r>
         </w:p>
         <w:p>
           <w:pPr>
-            <w:pStyle w:val="Turinys1"/>
+            <w:pStyle w:val="TOC1"/>
             <w:tabs>
               <w:tab w:val="right" w:leader="dot" w:pos="9736"/>
             </w:tabs>
@@ -302,7 +302,6 @@
               <w:rFonts w:asciiTheme="minorHAnsi" w:hAnsiTheme="minorHAnsi"/>
               <w:noProof/>
               <w:sz w:val="22"/>
-              <w:lang w:val="lt-LT" w:eastAsia="lt-LT"/>
             </w:rPr>
           </w:pPr>
           <w:r>
@@ -314,10 +313,10 @@
           <w:r>
             <w:fldChar w:fldCharType="separate"/>
           </w:r>
-          <w:hyperlink w:anchor="_Toc227085051" w:history="1">
-            <w:r>
-              <w:rPr>
-                <w:rStyle w:val="Hipersaitas"/>
+          <w:hyperlink w:anchor="_Toc227112841" w:history="1">
+            <w:r>
+              <w:rPr>
+                <w:rStyle w:val="Hyperlink"/>
                 <w:noProof/>
               </w:rPr>
               <w:t>Preface</w:t>
@@ -341,7 +340,7 @@
                 <w:noProof/>
                 <w:webHidden/>
               </w:rPr>
-              <w:instrText xml:space="preserve"> PAGEREF _Toc227085051 \h </w:instrText>
+              <w:instrText xml:space="preserve"> PAGEREF _Toc227112841 \h </w:instrText>
             </w:r>
             <w:r>
               <w:rPr>
@@ -374,7 +373,7 @@
         </w:p>
         <w:p>
           <w:pPr>
-            <w:pStyle w:val="Turinys1"/>
+            <w:pStyle w:val="TOC1"/>
             <w:tabs>
               <w:tab w:val="right" w:leader="dot" w:pos="9736"/>
             </w:tabs>
@@ -382,13 +381,12 @@
               <w:rFonts w:asciiTheme="minorHAnsi" w:hAnsiTheme="minorHAnsi"/>
               <w:noProof/>
               <w:sz w:val="22"/>
-              <w:lang w:val="lt-LT" w:eastAsia="lt-LT"/>
             </w:rPr>
           </w:pPr>
-          <w:hyperlink w:anchor="_Toc227085052" w:history="1">
-            <w:r>
-              <w:rPr>
-                <w:rStyle w:val="Hipersaitas"/>
+          <w:hyperlink w:anchor="_Toc227112842" w:history="1">
+            <w:r>
+              <w:rPr>
+                <w:rStyle w:val="Hyperlink"/>
                 <w:noProof/>
               </w:rPr>
               <w:t>1. Structuring, workflow, concept</w:t>
@@ -412,7 +410,7 @@
                 <w:noProof/>
                 <w:webHidden/>
               </w:rPr>
-              <w:instrText xml:space="preserve"> PAGEREF _Toc227085052 \h </w:instrText>
+              <w:instrText xml:space="preserve"> PAGEREF _Toc227112842 \h </w:instrText>
             </w:r>
             <w:r>
               <w:rPr>
@@ -445,7 +443,7 @@
         </w:p>
         <w:p>
           <w:pPr>
-            <w:pStyle w:val="Turinys2"/>
+            <w:pStyle w:val="TOC2"/>
             <w:tabs>
               <w:tab w:val="right" w:leader="dot" w:pos="9736"/>
             </w:tabs>
@@ -453,13 +451,12 @@
               <w:rFonts w:asciiTheme="minorHAnsi" w:hAnsiTheme="minorHAnsi"/>
               <w:noProof/>
               <w:sz w:val="22"/>
-              <w:lang w:val="lt-LT" w:eastAsia="lt-LT"/>
             </w:rPr>
           </w:pPr>
-          <w:hyperlink w:anchor="_Toc227085053" w:history="1">
-            <w:r>
-              <w:rPr>
-                <w:rStyle w:val="Hipersaitas"/>
+          <w:hyperlink w:anchor="_Toc227112843" w:history="1">
+            <w:r>
+              <w:rPr>
+                <w:rStyle w:val="Hyperlink"/>
                 <w:noProof/>
               </w:rPr>
               <w:t>1.1. Team structure and workflow</w:t>
@@ -483,7 +480,7 @@
                 <w:noProof/>
                 <w:webHidden/>
               </w:rPr>
-              <w:instrText xml:space="preserve"> PAGEREF _Toc227085053 \h </w:instrText>
+              <w:instrText xml:space="preserve"> PAGEREF _Toc227112843 \h </w:instrText>
             </w:r>
             <w:r>
               <w:rPr>
@@ -516,7 +513,7 @@
         </w:p>
         <w:p>
           <w:pPr>
-            <w:pStyle w:val="Turinys2"/>
+            <w:pStyle w:val="TOC2"/>
             <w:tabs>
               <w:tab w:val="right" w:leader="dot" w:pos="9736"/>
             </w:tabs>
@@ -524,13 +521,12 @@
               <w:rFonts w:asciiTheme="minorHAnsi" w:hAnsiTheme="minorHAnsi"/>
               <w:noProof/>
               <w:sz w:val="22"/>
-              <w:lang w:val="lt-LT" w:eastAsia="lt-LT"/>
             </w:rPr>
           </w:pPr>
-          <w:hyperlink w:anchor="_Toc227085054" w:history="1">
-            <w:r>
-              <w:rPr>
-                <w:rStyle w:val="Hipersaitas"/>
+          <w:hyperlink w:anchor="_Toc227112844" w:history="1">
+            <w:r>
+              <w:rPr>
+                <w:rStyle w:val="Hyperlink"/>
                 <w:noProof/>
               </w:rPr>
               <w:t>1.2. Design process</w:t>
@@ -554,7 +550,7 @@
                 <w:noProof/>
                 <w:webHidden/>
               </w:rPr>
-              <w:instrText xml:space="preserve"> PAGEREF _Toc227085054 \h </w:instrText>
+              <w:instrText xml:space="preserve"> PAGEREF _Toc227112844 \h </w:instrText>
             </w:r>
             <w:r>
               <w:rPr>
@@ -587,7 +583,7 @@
         </w:p>
         <w:p>
           <w:pPr>
-            <w:pStyle w:val="Turinys2"/>
+            <w:pStyle w:val="TOC2"/>
             <w:tabs>
               <w:tab w:val="right" w:leader="dot" w:pos="9736"/>
             </w:tabs>
@@ -595,13 +591,12 @@
               <w:rFonts w:asciiTheme="minorHAnsi" w:hAnsiTheme="minorHAnsi"/>
               <w:noProof/>
               <w:sz w:val="22"/>
-              <w:lang w:val="lt-LT" w:eastAsia="lt-LT"/>
             </w:rPr>
           </w:pPr>
-          <w:hyperlink w:anchor="_Toc227085055" w:history="1">
-            <w:r>
-              <w:rPr>
-                <w:rStyle w:val="Hipersaitas"/>
+          <w:hyperlink w:anchor="_Toc227112845" w:history="1">
+            <w:r>
+              <w:rPr>
+                <w:rStyle w:val="Hyperlink"/>
                 <w:noProof/>
               </w:rPr>
               <w:t>1.3. Physical assembly</w:t>
@@ -625,7 +620,7 @@
                 <w:noProof/>
                 <w:webHidden/>
               </w:rPr>
-              <w:instrText xml:space="preserve"> PAGEREF _Toc227085055 \h </w:instrText>
+              <w:instrText xml:space="preserve"> PAGEREF _Toc227112845 \h </w:instrText>
             </w:r>
             <w:r>
               <w:rPr>
@@ -658,7 +653,7 @@
         </w:p>
         <w:p>
           <w:pPr>
-            <w:pStyle w:val="Turinys2"/>
+            <w:pStyle w:val="TOC2"/>
             <w:tabs>
               <w:tab w:val="right" w:leader="dot" w:pos="9736"/>
             </w:tabs>
@@ -666,13 +661,12 @@
               <w:rFonts w:asciiTheme="minorHAnsi" w:hAnsiTheme="minorHAnsi"/>
               <w:noProof/>
               <w:sz w:val="22"/>
-              <w:lang w:val="lt-LT" w:eastAsia="lt-LT"/>
             </w:rPr>
           </w:pPr>
-          <w:hyperlink w:anchor="_Toc227085056" w:history="1">
-            <w:r>
-              <w:rPr>
-                <w:rStyle w:val="Hipersaitas"/>
+          <w:hyperlink w:anchor="_Toc227112846" w:history="1">
+            <w:r>
+              <w:rPr>
+                <w:rStyle w:val="Hyperlink"/>
                 <w:noProof/>
               </w:rPr>
               <w:t>1.4. Design software</w:t>
@@ -696,7 +690,7 @@
                 <w:noProof/>
                 <w:webHidden/>
               </w:rPr>
-              <w:instrText xml:space="preserve"> PAGEREF _Toc227085056 \h </w:instrText>
+              <w:instrText xml:space="preserve"> PAGEREF _Toc227112846 \h </w:instrText>
             </w:r>
             <w:r>
               <w:rPr>
@@ -729,7 +723,7 @@
         </w:p>
         <w:p>
           <w:pPr>
-            <w:pStyle w:val="Turinys2"/>
+            <w:pStyle w:val="TOC2"/>
             <w:tabs>
               <w:tab w:val="right" w:leader="dot" w:pos="9736"/>
             </w:tabs>
@@ -737,13 +731,12 @@
               <w:rFonts w:asciiTheme="minorHAnsi" w:hAnsiTheme="minorHAnsi"/>
               <w:noProof/>
               <w:sz w:val="22"/>
-              <w:lang w:val="lt-LT" w:eastAsia="lt-LT"/>
             </w:rPr>
           </w:pPr>
-          <w:hyperlink w:anchor="_Toc227085057" w:history="1">
-            <w:r>
-              <w:rPr>
-                <w:rStyle w:val="Hipersaitas"/>
+          <w:hyperlink w:anchor="_Toc227112847" w:history="1">
+            <w:r>
+              <w:rPr>
+                <w:rStyle w:val="Hyperlink"/>
                 <w:noProof/>
               </w:rPr>
               <w:t>1.5. Design philosophy</w:t>
@@ -767,7 +760,7 @@
                 <w:noProof/>
                 <w:webHidden/>
               </w:rPr>
-              <w:instrText xml:space="preserve"> PAGEREF _Toc227085057 \h </w:instrText>
+              <w:instrText xml:space="preserve"> PAGEREF _Toc227112847 \h </w:instrText>
             </w:r>
             <w:r>
               <w:rPr>
@@ -800,7 +793,7 @@
         </w:p>
         <w:p>
           <w:pPr>
-            <w:pStyle w:val="Turinys1"/>
+            <w:pStyle w:val="TOC1"/>
             <w:tabs>
               <w:tab w:val="right" w:leader="dot" w:pos="9736"/>
             </w:tabs>
@@ -808,13 +801,12 @@
               <w:rFonts w:asciiTheme="minorHAnsi" w:hAnsiTheme="minorHAnsi"/>
               <w:noProof/>
               <w:sz w:val="22"/>
-              <w:lang w:val="lt-LT" w:eastAsia="lt-LT"/>
             </w:rPr>
           </w:pPr>
-          <w:hyperlink w:anchor="_Toc227085058" w:history="1">
-            <w:r>
-              <w:rPr>
-                <w:rStyle w:val="Hipersaitas"/>
+          <w:hyperlink w:anchor="_Toc227112848" w:history="1">
+            <w:r>
+              <w:rPr>
+                <w:rStyle w:val="Hyperlink"/>
                 <w:noProof/>
               </w:rPr>
               <w:t>2. List of stock components used</w:t>
@@ -838,7 +830,7 @@
                 <w:noProof/>
                 <w:webHidden/>
               </w:rPr>
-              <w:instrText xml:space="preserve"> PAGEREF _Toc227085058 \h </w:instrText>
+              <w:instrText xml:space="preserve"> PAGEREF _Toc227112848 \h </w:instrText>
             </w:r>
             <w:r>
               <w:rPr>
@@ -871,7 +863,7 @@
         </w:p>
         <w:p>
           <w:pPr>
-            <w:pStyle w:val="Turinys1"/>
+            <w:pStyle w:val="TOC1"/>
             <w:tabs>
               <w:tab w:val="right" w:leader="dot" w:pos="9736"/>
             </w:tabs>
@@ -879,13 +871,12 @@
               <w:rFonts w:asciiTheme="minorHAnsi" w:hAnsiTheme="minorHAnsi"/>
               <w:noProof/>
               <w:sz w:val="22"/>
-              <w:lang w:val="lt-LT" w:eastAsia="lt-LT"/>
             </w:rPr>
           </w:pPr>
-          <w:hyperlink w:anchor="_Toc227085059" w:history="1">
-            <w:r>
-              <w:rPr>
-                <w:rStyle w:val="Hipersaitas"/>
+          <w:hyperlink w:anchor="_Toc227112849" w:history="1">
+            <w:r>
+              <w:rPr>
+                <w:rStyle w:val="Hyperlink"/>
                 <w:noProof/>
               </w:rPr>
               <w:t>3. Mechanical platform</w:t>
@@ -909,7 +900,7 @@
                 <w:noProof/>
                 <w:webHidden/>
               </w:rPr>
-              <w:instrText xml:space="preserve"> PAGEREF _Toc227085059 \h </w:instrText>
+              <w:instrText xml:space="preserve"> PAGEREF _Toc227112849 \h </w:instrText>
             </w:r>
             <w:r>
               <w:rPr>
@@ -929,7 +920,7 @@
                 <w:noProof/>
                 <w:webHidden/>
               </w:rPr>
-              <w:t>6</w:t>
+              <w:t>7</w:t>
             </w:r>
             <w:r>
               <w:rPr>
@@ -942,7 +933,7 @@
         </w:p>
         <w:p>
           <w:pPr>
-            <w:pStyle w:val="Turinys2"/>
+            <w:pStyle w:val="TOC2"/>
             <w:tabs>
               <w:tab w:val="right" w:leader="dot" w:pos="9736"/>
             </w:tabs>
@@ -950,13 +941,12 @@
               <w:rFonts w:asciiTheme="minorHAnsi" w:hAnsiTheme="minorHAnsi"/>
               <w:noProof/>
               <w:sz w:val="22"/>
-              <w:lang w:val="lt-LT" w:eastAsia="lt-LT"/>
             </w:rPr>
           </w:pPr>
-          <w:hyperlink w:anchor="_Toc227085060" w:history="1">
-            <w:r>
-              <w:rPr>
-                <w:rStyle w:val="Hipersaitas"/>
+          <w:hyperlink w:anchor="_Toc227112850" w:history="1">
+            <w:r>
+              <w:rPr>
+                <w:rStyle w:val="Hyperlink"/>
                 <w:noProof/>
               </w:rPr>
               <w:t>3.1. Overview</w:t>
@@ -980,7 +970,7 @@
                 <w:noProof/>
                 <w:webHidden/>
               </w:rPr>
-              <w:instrText xml:space="preserve"> PAGEREF _Toc227085060 \h </w:instrText>
+              <w:instrText xml:space="preserve"> PAGEREF _Toc227112850 \h </w:instrText>
             </w:r>
             <w:r>
               <w:rPr>
@@ -1000,7 +990,7 @@
                 <w:noProof/>
                 <w:webHidden/>
               </w:rPr>
-              <w:t>6</w:t>
+              <w:t>7</w:t>
             </w:r>
             <w:r>
               <w:rPr>
@@ -1013,7 +1003,7 @@
         </w:p>
         <w:p>
           <w:pPr>
-            <w:pStyle w:val="Turinys2"/>
+            <w:pStyle w:val="TOC2"/>
             <w:tabs>
               <w:tab w:val="right" w:leader="dot" w:pos="9736"/>
             </w:tabs>
@@ -1021,13 +1011,12 @@
               <w:rFonts w:asciiTheme="minorHAnsi" w:hAnsiTheme="minorHAnsi"/>
               <w:noProof/>
               <w:sz w:val="22"/>
-              <w:lang w:val="lt-LT" w:eastAsia="lt-LT"/>
             </w:rPr>
           </w:pPr>
-          <w:hyperlink w:anchor="_Toc227085061" w:history="1">
-            <w:r>
-              <w:rPr>
-                <w:rStyle w:val="Hipersaitas"/>
+          <w:hyperlink w:anchor="_Toc227112851" w:history="1">
+            <w:r>
+              <w:rPr>
+                <w:rStyle w:val="Hyperlink"/>
                 <w:noProof/>
               </w:rPr>
               <w:t>3.2. Steering</w:t>
@@ -1051,7 +1040,7 @@
                 <w:noProof/>
                 <w:webHidden/>
               </w:rPr>
-              <w:instrText xml:space="preserve"> PAGEREF _Toc227085061 \h </w:instrText>
+              <w:instrText xml:space="preserve"> PAGEREF _Toc227112851 \h </w:instrText>
             </w:r>
             <w:r>
               <w:rPr>
@@ -1071,7 +1060,7 @@
                 <w:noProof/>
                 <w:webHidden/>
               </w:rPr>
-              <w:t>6</w:t>
+              <w:t>7</w:t>
             </w:r>
             <w:r>
               <w:rPr>
@@ -1084,7 +1073,7 @@
         </w:p>
         <w:p>
           <w:pPr>
-            <w:pStyle w:val="Turinys2"/>
+            <w:pStyle w:val="TOC2"/>
             <w:tabs>
               <w:tab w:val="right" w:leader="dot" w:pos="9736"/>
             </w:tabs>
@@ -1092,13 +1081,12 @@
               <w:rFonts w:asciiTheme="minorHAnsi" w:hAnsiTheme="minorHAnsi"/>
               <w:noProof/>
               <w:sz w:val="22"/>
-              <w:lang w:val="lt-LT" w:eastAsia="lt-LT"/>
             </w:rPr>
           </w:pPr>
-          <w:hyperlink w:anchor="_Toc227085062" w:history="1">
-            <w:r>
-              <w:rPr>
-                <w:rStyle w:val="Hipersaitas"/>
+          <w:hyperlink w:anchor="_Toc227112852" w:history="1">
+            <w:r>
+              <w:rPr>
+                <w:rStyle w:val="Hyperlink"/>
                 <w:noProof/>
               </w:rPr>
               <w:t>3.3. Chassis</w:t>
@@ -1122,7 +1110,7 @@
                 <w:noProof/>
                 <w:webHidden/>
               </w:rPr>
-              <w:instrText xml:space="preserve"> PAGEREF _Toc227085062 \h </w:instrText>
+              <w:instrText xml:space="preserve"> PAGEREF _Toc227112852 \h </w:instrText>
             </w:r>
             <w:r>
               <w:rPr>
@@ -1155,7 +1143,7 @@
         </w:p>
         <w:p>
           <w:pPr>
-            <w:pStyle w:val="Turinys2"/>
+            <w:pStyle w:val="TOC2"/>
             <w:tabs>
               <w:tab w:val="right" w:leader="dot" w:pos="9736"/>
             </w:tabs>
@@ -1163,13 +1151,12 @@
               <w:rFonts w:asciiTheme="minorHAnsi" w:hAnsiTheme="minorHAnsi"/>
               <w:noProof/>
               <w:sz w:val="22"/>
-              <w:lang w:val="lt-LT" w:eastAsia="lt-LT"/>
             </w:rPr>
           </w:pPr>
-          <w:hyperlink w:anchor="_Toc227085063" w:history="1">
-            <w:r>
-              <w:rPr>
-                <w:rStyle w:val="Hipersaitas"/>
+          <w:hyperlink w:anchor="_Toc227112853" w:history="1">
+            <w:r>
+              <w:rPr>
+                <w:rStyle w:val="Hyperlink"/>
                 <w:noProof/>
               </w:rPr>
               <w:t>3.4. Driven axle</w:t>
@@ -1193,7 +1180,7 @@
                 <w:noProof/>
                 <w:webHidden/>
               </w:rPr>
-              <w:instrText xml:space="preserve"> PAGEREF _Toc227085063 \h </w:instrText>
+              <w:instrText xml:space="preserve"> PAGEREF _Toc227112853 \h </w:instrText>
             </w:r>
             <w:r>
               <w:rPr>
@@ -1213,7 +1200,7 @@
                 <w:noProof/>
                 <w:webHidden/>
               </w:rPr>
-              <w:t>11</w:t>
+              <w:t>12</w:t>
             </w:r>
             <w:r>
               <w:rPr>
@@ -1226,7 +1213,7 @@
         </w:p>
         <w:p>
           <w:pPr>
-            <w:pStyle w:val="Turinys2"/>
+            <w:pStyle w:val="TOC2"/>
             <w:tabs>
               <w:tab w:val="right" w:leader="dot" w:pos="9736"/>
             </w:tabs>
@@ -1234,16 +1221,15 @@
               <w:rFonts w:asciiTheme="minorHAnsi" w:hAnsiTheme="minorHAnsi"/>
               <w:noProof/>
               <w:sz w:val="22"/>
-              <w:lang w:val="lt-LT" w:eastAsia="lt-LT"/>
             </w:rPr>
           </w:pPr>
-          <w:hyperlink w:anchor="_Toc227085064" w:history="1">
-            <w:r>
-              <w:rPr>
-                <w:rStyle w:val="Hipersaitas"/>
-                <w:noProof/>
-              </w:rPr>
-              <w:t>3.5. Overall design summary, tradeoffs</w:t>
+          <w:hyperlink w:anchor="_Toc227112854" w:history="1">
+            <w:r>
+              <w:rPr>
+                <w:rStyle w:val="Hyperlink"/>
+                <w:noProof/>
+              </w:rPr>
+              <w:t>3.5. Design summary, tradeoffs</w:t>
             </w:r>
             <w:r>
               <w:rPr>
@@ -1264,7 +1250,7 @@
                 <w:noProof/>
                 <w:webHidden/>
               </w:rPr>
-              <w:instrText xml:space="preserve"> PAGEREF _Toc227085064 \h </w:instrText>
+              <w:instrText xml:space="preserve"> PAGEREF _Toc227112854 \h </w:instrText>
             </w:r>
             <w:r>
               <w:rPr>
@@ -1284,7 +1270,7 @@
                 <w:noProof/>
                 <w:webHidden/>
               </w:rPr>
-              <w:t>12</w:t>
+              <w:t>13</w:t>
             </w:r>
             <w:r>
               <w:rPr>
@@ -1297,7 +1283,7 @@
         </w:p>
         <w:p>
           <w:pPr>
-            <w:pStyle w:val="Turinys1"/>
+            <w:pStyle w:val="TOC1"/>
             <w:tabs>
               <w:tab w:val="right" w:leader="dot" w:pos="9736"/>
             </w:tabs>
@@ -1305,13 +1291,12 @@
               <w:rFonts w:asciiTheme="minorHAnsi" w:hAnsiTheme="minorHAnsi"/>
               <w:noProof/>
               <w:sz w:val="22"/>
-              <w:lang w:val="lt-LT" w:eastAsia="lt-LT"/>
             </w:rPr>
           </w:pPr>
-          <w:hyperlink w:anchor="_Toc227085065" w:history="1">
-            <w:r>
-              <w:rPr>
-                <w:rStyle w:val="Hipersaitas"/>
+          <w:hyperlink w:anchor="_Toc227112855" w:history="1">
+            <w:r>
+              <w:rPr>
+                <w:rStyle w:val="Hyperlink"/>
                 <w:noProof/>
               </w:rPr>
               <w:t>4. Circuit design and sensors</w:t>
@@ -1335,7 +1320,7 @@
                 <w:noProof/>
                 <w:webHidden/>
               </w:rPr>
-              <w:instrText xml:space="preserve"> PAGEREF _Toc227085065 \h </w:instrText>
+              <w:instrText xml:space="preserve"> PAGEREF _Toc227112855 \h </w:instrText>
             </w:r>
             <w:r>
               <w:rPr>
@@ -1355,7 +1340,7 @@
                 <w:noProof/>
                 <w:webHidden/>
               </w:rPr>
-              <w:t>13</w:t>
+              <w:t>14</w:t>
             </w:r>
             <w:r>
               <w:rPr>
@@ -1368,7 +1353,7 @@
         </w:p>
         <w:p>
           <w:pPr>
-            <w:pStyle w:val="Turinys1"/>
+            <w:pStyle w:val="TOC2"/>
             <w:tabs>
               <w:tab w:val="right" w:leader="dot" w:pos="9736"/>
             </w:tabs>
@@ -1376,13 +1361,432 @@
               <w:rFonts w:asciiTheme="minorHAnsi" w:hAnsiTheme="minorHAnsi"/>
               <w:noProof/>
               <w:sz w:val="22"/>
-              <w:lang w:val="lt-LT" w:eastAsia="lt-LT"/>
             </w:rPr>
           </w:pPr>
-          <w:hyperlink w:anchor="_Toc227085066" w:history="1">
-            <w:r>
-              <w:rPr>
-                <w:rStyle w:val="Hipersaitas"/>
+          <w:hyperlink w:anchor="_Toc227112856" w:history="1">
+            <w:r>
+              <w:rPr>
+                <w:rStyle w:val="Hyperlink"/>
+                <w:noProof/>
+              </w:rPr>
+              <w:t>4.1. Overview</w:t>
+            </w:r>
+            <w:r>
+              <w:rPr>
+                <w:noProof/>
+                <w:webHidden/>
+              </w:rPr>
+              <w:tab/>
+            </w:r>
+            <w:r>
+              <w:rPr>
+                <w:noProof/>
+                <w:webHidden/>
+              </w:rPr>
+              <w:fldChar w:fldCharType="begin"/>
+            </w:r>
+            <w:r>
+              <w:rPr>
+                <w:noProof/>
+                <w:webHidden/>
+              </w:rPr>
+              <w:instrText xml:space="preserve"> PAGEREF _Toc227112856 \h </w:instrText>
+            </w:r>
+            <w:r>
+              <w:rPr>
+                <w:noProof/>
+                <w:webHidden/>
+              </w:rPr>
+            </w:r>
+            <w:r>
+              <w:rPr>
+                <w:noProof/>
+                <w:webHidden/>
+              </w:rPr>
+              <w:fldChar w:fldCharType="separate"/>
+            </w:r>
+            <w:r>
+              <w:rPr>
+                <w:noProof/>
+                <w:webHidden/>
+              </w:rPr>
+              <w:t>14</w:t>
+            </w:r>
+            <w:r>
+              <w:rPr>
+                <w:noProof/>
+                <w:webHidden/>
+              </w:rPr>
+              <w:fldChar w:fldCharType="end"/>
+            </w:r>
+          </w:hyperlink>
+        </w:p>
+        <w:p>
+          <w:pPr>
+            <w:pStyle w:val="TOC2"/>
+            <w:tabs>
+              <w:tab w:val="right" w:leader="dot" w:pos="9736"/>
+            </w:tabs>
+            <w:rPr>
+              <w:rFonts w:asciiTheme="minorHAnsi" w:hAnsiTheme="minorHAnsi"/>
+              <w:noProof/>
+              <w:sz w:val="22"/>
+            </w:rPr>
+          </w:pPr>
+          <w:hyperlink w:anchor="_Toc227112857" w:history="1">
+            <w:r>
+              <w:rPr>
+                <w:rStyle w:val="Hyperlink"/>
+                <w:noProof/>
+              </w:rPr>
+              <w:t>4.2. Processing units</w:t>
+            </w:r>
+            <w:r>
+              <w:rPr>
+                <w:noProof/>
+                <w:webHidden/>
+              </w:rPr>
+              <w:tab/>
+            </w:r>
+            <w:r>
+              <w:rPr>
+                <w:noProof/>
+                <w:webHidden/>
+              </w:rPr>
+              <w:fldChar w:fldCharType="begin"/>
+            </w:r>
+            <w:r>
+              <w:rPr>
+                <w:noProof/>
+                <w:webHidden/>
+              </w:rPr>
+              <w:instrText xml:space="preserve"> PAGEREF _Toc227112857 \h </w:instrText>
+            </w:r>
+            <w:r>
+              <w:rPr>
+                <w:noProof/>
+                <w:webHidden/>
+              </w:rPr>
+            </w:r>
+            <w:r>
+              <w:rPr>
+                <w:noProof/>
+                <w:webHidden/>
+              </w:rPr>
+              <w:fldChar w:fldCharType="separate"/>
+            </w:r>
+            <w:r>
+              <w:rPr>
+                <w:noProof/>
+                <w:webHidden/>
+              </w:rPr>
+              <w:t>14</w:t>
+            </w:r>
+            <w:r>
+              <w:rPr>
+                <w:noProof/>
+                <w:webHidden/>
+              </w:rPr>
+              <w:fldChar w:fldCharType="end"/>
+            </w:r>
+          </w:hyperlink>
+        </w:p>
+        <w:p>
+          <w:pPr>
+            <w:pStyle w:val="TOC2"/>
+            <w:tabs>
+              <w:tab w:val="right" w:leader="dot" w:pos="9736"/>
+            </w:tabs>
+            <w:rPr>
+              <w:rFonts w:asciiTheme="minorHAnsi" w:hAnsiTheme="minorHAnsi"/>
+              <w:noProof/>
+              <w:sz w:val="22"/>
+            </w:rPr>
+          </w:pPr>
+          <w:hyperlink w:anchor="_Toc227112858" w:history="1">
+            <w:r>
+              <w:rPr>
+                <w:rStyle w:val="Hyperlink"/>
+                <w:noProof/>
+              </w:rPr>
+              <w:t>4.3. Sensors and their placement</w:t>
+            </w:r>
+            <w:r>
+              <w:rPr>
+                <w:noProof/>
+                <w:webHidden/>
+              </w:rPr>
+              <w:tab/>
+            </w:r>
+            <w:r>
+              <w:rPr>
+                <w:noProof/>
+                <w:webHidden/>
+              </w:rPr>
+              <w:fldChar w:fldCharType="begin"/>
+            </w:r>
+            <w:r>
+              <w:rPr>
+                <w:noProof/>
+                <w:webHidden/>
+              </w:rPr>
+              <w:instrText xml:space="preserve"> PAGEREF _Toc227112858 \h </w:instrText>
+            </w:r>
+            <w:r>
+              <w:rPr>
+                <w:noProof/>
+                <w:webHidden/>
+              </w:rPr>
+            </w:r>
+            <w:r>
+              <w:rPr>
+                <w:noProof/>
+                <w:webHidden/>
+              </w:rPr>
+              <w:fldChar w:fldCharType="separate"/>
+            </w:r>
+            <w:r>
+              <w:rPr>
+                <w:noProof/>
+                <w:webHidden/>
+              </w:rPr>
+              <w:t>14</w:t>
+            </w:r>
+            <w:r>
+              <w:rPr>
+                <w:noProof/>
+                <w:webHidden/>
+              </w:rPr>
+              <w:fldChar w:fldCharType="end"/>
+            </w:r>
+          </w:hyperlink>
+        </w:p>
+        <w:p>
+          <w:pPr>
+            <w:pStyle w:val="TOC2"/>
+            <w:tabs>
+              <w:tab w:val="right" w:leader="dot" w:pos="9736"/>
+            </w:tabs>
+            <w:rPr>
+              <w:rFonts w:asciiTheme="minorHAnsi" w:hAnsiTheme="minorHAnsi"/>
+              <w:noProof/>
+              <w:sz w:val="22"/>
+            </w:rPr>
+          </w:pPr>
+          <w:hyperlink w:anchor="_Toc227112859" w:history="1">
+            <w:r>
+              <w:rPr>
+                <w:rStyle w:val="Hyperlink"/>
+                <w:noProof/>
+              </w:rPr>
+              <w:t>4.4. Battery and power budget</w:t>
+            </w:r>
+            <w:r>
+              <w:rPr>
+                <w:noProof/>
+                <w:webHidden/>
+              </w:rPr>
+              <w:tab/>
+            </w:r>
+            <w:r>
+              <w:rPr>
+                <w:noProof/>
+                <w:webHidden/>
+              </w:rPr>
+              <w:fldChar w:fldCharType="begin"/>
+            </w:r>
+            <w:r>
+              <w:rPr>
+                <w:noProof/>
+                <w:webHidden/>
+              </w:rPr>
+              <w:instrText xml:space="preserve"> PAGEREF _Toc227112859 \h </w:instrText>
+            </w:r>
+            <w:r>
+              <w:rPr>
+                <w:noProof/>
+                <w:webHidden/>
+              </w:rPr>
+            </w:r>
+            <w:r>
+              <w:rPr>
+                <w:noProof/>
+                <w:webHidden/>
+              </w:rPr>
+              <w:fldChar w:fldCharType="separate"/>
+            </w:r>
+            <w:r>
+              <w:rPr>
+                <w:noProof/>
+                <w:webHidden/>
+              </w:rPr>
+              <w:t>14</w:t>
+            </w:r>
+            <w:r>
+              <w:rPr>
+                <w:noProof/>
+                <w:webHidden/>
+              </w:rPr>
+              <w:fldChar w:fldCharType="end"/>
+            </w:r>
+          </w:hyperlink>
+        </w:p>
+        <w:p>
+          <w:pPr>
+            <w:pStyle w:val="TOC2"/>
+            <w:tabs>
+              <w:tab w:val="right" w:leader="dot" w:pos="9736"/>
+            </w:tabs>
+            <w:rPr>
+              <w:rFonts w:asciiTheme="minorHAnsi" w:hAnsiTheme="minorHAnsi"/>
+              <w:noProof/>
+              <w:sz w:val="22"/>
+            </w:rPr>
+          </w:pPr>
+          <w:hyperlink w:anchor="_Toc227112860" w:history="1">
+            <w:r>
+              <w:rPr>
+                <w:rStyle w:val="Hyperlink"/>
+                <w:noProof/>
+              </w:rPr>
+              <w:t>4.5. Circuits and packaging</w:t>
+            </w:r>
+            <w:r>
+              <w:rPr>
+                <w:noProof/>
+                <w:webHidden/>
+              </w:rPr>
+              <w:tab/>
+            </w:r>
+            <w:r>
+              <w:rPr>
+                <w:noProof/>
+                <w:webHidden/>
+              </w:rPr>
+              <w:fldChar w:fldCharType="begin"/>
+            </w:r>
+            <w:r>
+              <w:rPr>
+                <w:noProof/>
+                <w:webHidden/>
+              </w:rPr>
+              <w:instrText xml:space="preserve"> PAGEREF _Toc227112860 \h </w:instrText>
+            </w:r>
+            <w:r>
+              <w:rPr>
+                <w:noProof/>
+                <w:webHidden/>
+              </w:rPr>
+            </w:r>
+            <w:r>
+              <w:rPr>
+                <w:noProof/>
+                <w:webHidden/>
+              </w:rPr>
+              <w:fldChar w:fldCharType="separate"/>
+            </w:r>
+            <w:r>
+              <w:rPr>
+                <w:noProof/>
+                <w:webHidden/>
+              </w:rPr>
+              <w:t>14</w:t>
+            </w:r>
+            <w:r>
+              <w:rPr>
+                <w:noProof/>
+                <w:webHidden/>
+              </w:rPr>
+              <w:fldChar w:fldCharType="end"/>
+            </w:r>
+          </w:hyperlink>
+        </w:p>
+        <w:p>
+          <w:pPr>
+            <w:pStyle w:val="TOC2"/>
+            <w:tabs>
+              <w:tab w:val="right" w:leader="dot" w:pos="9736"/>
+            </w:tabs>
+            <w:rPr>
+              <w:rFonts w:asciiTheme="minorHAnsi" w:hAnsiTheme="minorHAnsi"/>
+              <w:noProof/>
+              <w:sz w:val="22"/>
+            </w:rPr>
+          </w:pPr>
+          <w:hyperlink w:anchor="_Toc227112861" w:history="1">
+            <w:r>
+              <w:rPr>
+                <w:rStyle w:val="Hyperlink"/>
+                <w:noProof/>
+              </w:rPr>
+              <w:t>4.6. Design summary, tradeoffs</w:t>
+            </w:r>
+            <w:r>
+              <w:rPr>
+                <w:noProof/>
+                <w:webHidden/>
+              </w:rPr>
+              <w:tab/>
+            </w:r>
+            <w:r>
+              <w:rPr>
+                <w:noProof/>
+                <w:webHidden/>
+              </w:rPr>
+              <w:fldChar w:fldCharType="begin"/>
+            </w:r>
+            <w:r>
+              <w:rPr>
+                <w:noProof/>
+                <w:webHidden/>
+              </w:rPr>
+              <w:instrText xml:space="preserve"> PAGEREF _Toc227112861 \h </w:instrText>
+            </w:r>
+            <w:r>
+              <w:rPr>
+                <w:noProof/>
+                <w:webHidden/>
+              </w:rPr>
+            </w:r>
+            <w:r>
+              <w:rPr>
+                <w:noProof/>
+                <w:webHidden/>
+              </w:rPr>
+              <w:fldChar w:fldCharType="separate"/>
+            </w:r>
+            <w:r>
+              <w:rPr>
+                <w:noProof/>
+                <w:webHidden/>
+              </w:rPr>
+              <w:t>14</w:t>
+            </w:r>
+            <w:r>
+              <w:rPr>
+                <w:noProof/>
+                <w:webHidden/>
+              </w:rPr>
+              <w:fldChar w:fldCharType="end"/>
+            </w:r>
+          </w:hyperlink>
+        </w:p>
+        <w:p>
+          <w:pPr>
+            <w:pStyle w:val="TOC1"/>
+            <w:tabs>
+              <w:tab w:val="right" w:leader="dot" w:pos="9736"/>
+            </w:tabs>
+            <w:rPr>
+              <w:rFonts w:asciiTheme="minorHAnsi" w:hAnsiTheme="minorHAnsi"/>
+              <w:noProof/>
+              <w:sz w:val="22"/>
+            </w:rPr>
+          </w:pPr>
+          <w:hyperlink w:anchor="_Toc227112862" w:history="1">
+            <w:r>
+              <w:rPr>
+                <w:rStyle w:val="Hyperlink"/>
                 <w:noProof/>
               </w:rPr>
               <w:t>5. Software</w:t>
@@ -1406,7 +1810,7 @@
                 <w:noProof/>
                 <w:webHidden/>
               </w:rPr>
-              <w:instrText xml:space="preserve"> PAGEREF _Toc227085066 \h </w:instrText>
+              <w:instrText xml:space="preserve"> PAGEREF _Toc227112862 \h </w:instrText>
             </w:r>
             <w:r>
               <w:rPr>
@@ -1426,7 +1830,7 @@
                 <w:noProof/>
                 <w:webHidden/>
               </w:rPr>
-              <w:t>14</w:t>
+              <w:t>15</w:t>
             </w:r>
             <w:r>
               <w:rPr>
@@ -1465,9 +1869,9 @@
     </w:p>
     <w:p>
       <w:pPr>
-        <w:pStyle w:val="Antrat1"/>
+        <w:pStyle w:val="Heading1"/>
       </w:pPr>
-      <w:bookmarkStart w:id="0" w:name="_Toc227085051"/>
+      <w:bookmarkStart w:id="0" w:name="_Toc227112841"/>
       <w:r>
         <w:lastRenderedPageBreak/>
         <w:t>Preface</w:t>
@@ -1490,7 +1894,7 @@
       <w:hyperlink w:anchor="_1.2._Design_process" w:history="1">
         <w:r>
           <w:rPr>
-            <w:rStyle w:val="Hipersaitas"/>
+            <w:rStyle w:val="Hyperlink"/>
           </w:rPr>
           <w:t>chapter 1</w:t>
         </w:r>
@@ -1506,10 +1910,10 @@
     </w:p>
     <w:p>
       <w:pPr>
-        <w:pStyle w:val="Antrat1"/>
+        <w:pStyle w:val="Heading1"/>
       </w:pPr>
       <w:bookmarkStart w:id="1" w:name="_1._Structuring_the"/>
-      <w:bookmarkStart w:id="2" w:name="_Toc227085052"/>
+      <w:bookmarkStart w:id="2" w:name="_Toc227112842"/>
       <w:bookmarkEnd w:id="1"/>
       <w:r>
         <w:lastRenderedPageBreak/>
@@ -1531,9 +1935,9 @@
     </w:p>
     <w:p>
       <w:pPr>
-        <w:pStyle w:val="Antrat2"/>
+        <w:pStyle w:val="Heading2"/>
       </w:pPr>
-      <w:bookmarkStart w:id="3" w:name="_Toc227085053"/>
+      <w:bookmarkStart w:id="3" w:name="_Toc227112843"/>
       <w:r>
         <w:t>1.1. Team structure and workflow</w:t>
       </w:r>
@@ -1627,10 +2031,10 @@
     </w:p>
     <w:p>
       <w:pPr>
-        <w:pStyle w:val="Antrat2"/>
+        <w:pStyle w:val="Heading2"/>
       </w:pPr>
       <w:bookmarkStart w:id="4" w:name="_1.2._Design_process"/>
-      <w:bookmarkStart w:id="5" w:name="_Toc227085054"/>
+      <w:bookmarkStart w:id="5" w:name="_Toc227112844"/>
       <w:bookmarkEnd w:id="4"/>
       <w:r>
         <w:t>1.2. Design process</w:t>
@@ -1650,7 +2054,7 @@
       <w:hyperlink w:anchor="_3._Circuit_design" w:history="1">
         <w:r>
           <w:rPr>
-            <w:rStyle w:val="Hipersaitas"/>
+            <w:rStyle w:val="Hyperlink"/>
           </w:rPr>
           <w:t>chapter 3</w:t>
         </w:r>
@@ -1721,9 +2125,9 @@
     </w:p>
     <w:p>
       <w:pPr>
-        <w:pStyle w:val="Antrat2"/>
+        <w:pStyle w:val="Heading2"/>
       </w:pPr>
-      <w:bookmarkStart w:id="6" w:name="_Toc227085055"/>
+      <w:bookmarkStart w:id="6" w:name="_Toc227112845"/>
       <w:r>
         <w:t>1.3. Physical assembly</w:t>
       </w:r>
@@ -1745,7 +2149,7 @@
       </w:r>
       <w:r>
         <w:rPr>
-          <w:rStyle w:val="Hipersaitas"/>
+          <w:rStyle w:val="Hyperlink"/>
           <w:i/>
           <w:iCs/>
         </w:rPr>
@@ -1754,7 +2158,7 @@
       <w:proofErr w:type="spellEnd"/>
       <w:r>
         <w:rPr>
-          <w:rStyle w:val="Hipersaitas"/>
+          <w:rStyle w:val="Hyperlink"/>
           <w:i/>
           <w:iCs/>
         </w:rPr>
@@ -1763,7 +2167,7 @@
       <w:proofErr w:type="spellStart"/>
       <w:r>
         <w:rPr>
-          <w:rStyle w:val="Hipersaitas"/>
+          <w:rStyle w:val="Hyperlink"/>
           <w:i/>
           <w:iCs/>
         </w:rPr>
@@ -1772,7 +2176,7 @@
       <w:proofErr w:type="spellEnd"/>
       <w:r>
         <w:rPr>
-          <w:rStyle w:val="Hipersaitas"/>
+          <w:rStyle w:val="Hyperlink"/>
           <w:i/>
           <w:iCs/>
         </w:rPr>
@@ -1781,7 +2185,7 @@
       <w:proofErr w:type="spellStart"/>
       <w:r>
         <w:rPr>
-          <w:rStyle w:val="Hipersaitas"/>
+          <w:rStyle w:val="Hyperlink"/>
           <w:i/>
           <w:iCs/>
         </w:rPr>
@@ -1790,7 +2194,7 @@
       <w:proofErr w:type="spellEnd"/>
       <w:r>
         <w:rPr>
-          <w:rStyle w:val="Hipersaitas"/>
+          <w:rStyle w:val="Hyperlink"/>
           <w:i/>
           <w:iCs/>
         </w:rPr>
@@ -1799,7 +2203,7 @@
       <w:proofErr w:type="spellStart"/>
       <w:r>
         <w:rPr>
-          <w:rStyle w:val="Hipersaitas"/>
+          <w:rStyle w:val="Hyperlink"/>
           <w:i/>
           <w:iCs/>
         </w:rPr>
@@ -1808,7 +2212,7 @@
       <w:proofErr w:type="spellEnd"/>
       <w:r>
         <w:rPr>
-          <w:rStyle w:val="Hipersaitas"/>
+          <w:rStyle w:val="Hyperlink"/>
           <w:i/>
           <w:iCs/>
         </w:rPr>
@@ -1817,7 +2221,7 @@
       <w:proofErr w:type="spellStart"/>
       <w:r>
         <w:rPr>
-          <w:rStyle w:val="Hipersaitas"/>
+          <w:rStyle w:val="Hyperlink"/>
           <w:i/>
           <w:iCs/>
         </w:rPr>
@@ -1826,15 +2230,25 @@
       <w:proofErr w:type="spellEnd"/>
       <w:r>
         <w:rPr>
-          <w:rStyle w:val="Hipersaitas"/>
+          <w:rStyle w:val="Hyperlink"/>
           <w:i/>
           <w:iCs/>
         </w:rPr>
-        <w:t xml:space="preserve"> centras</w:t>
-      </w:r>
+        <w:t xml:space="preserve"> </w:t>
+      </w:r>
+      <w:proofErr w:type="spellStart"/>
       <w:r>
         <w:rPr>
-          <w:rStyle w:val="Hipersaitas"/>
+          <w:rStyle w:val="Hyperlink"/>
+          <w:i/>
+          <w:iCs/>
+        </w:rPr>
+        <w:t>centras</w:t>
+      </w:r>
+      <w:proofErr w:type="spellEnd"/>
+      <w:r>
+        <w:rPr>
+          <w:rStyle w:val="Hyperlink"/>
           <w:i/>
           <w:iCs/>
         </w:rPr>
@@ -1852,9 +2266,9 @@
     </w:p>
     <w:p>
       <w:pPr>
-        <w:pStyle w:val="Antrat2"/>
+        <w:pStyle w:val="Heading2"/>
       </w:pPr>
-      <w:bookmarkStart w:id="7" w:name="_Toc227085056"/>
+      <w:bookmarkStart w:id="7" w:name="_Toc227112846"/>
       <w:r>
         <w:t>1.</w:t>
       </w:r>
@@ -1888,7 +2302,7 @@
       <w:hyperlink r:id="rId9" w:history="1">
         <w:r>
           <w:rPr>
-            <w:rStyle w:val="Hipersaitas"/>
+            <w:rStyle w:val="Hyperlink"/>
           </w:rPr>
           <w:t>Autodesk Fusion</w:t>
         </w:r>
@@ -1952,14 +2366,14 @@
         <w:proofErr w:type="spellStart"/>
         <w:r>
           <w:rPr>
-            <w:rStyle w:val="Hipersaitas"/>
+            <w:rStyle w:val="Hyperlink"/>
           </w:rPr>
           <w:t>Ultimaker</w:t>
         </w:r>
         <w:proofErr w:type="spellEnd"/>
         <w:r>
           <w:rPr>
-            <w:rStyle w:val="Hipersaitas"/>
+            <w:rStyle w:val="Hyperlink"/>
           </w:rPr>
           <w:t xml:space="preserve"> Cura</w:t>
         </w:r>
@@ -1971,9 +2385,9 @@
     <w:p/>
     <w:p>
       <w:pPr>
-        <w:pStyle w:val="Antrat2"/>
+        <w:pStyle w:val="Heading2"/>
       </w:pPr>
-      <w:bookmarkStart w:id="8" w:name="_Toc227085057"/>
+      <w:bookmarkStart w:id="8" w:name="_Toc227112847"/>
       <w:r>
         <w:t>1.</w:t>
       </w:r>
@@ -2048,10 +2462,10 @@
     </w:p>
     <w:p>
       <w:pPr>
-        <w:pStyle w:val="Antrat1"/>
+        <w:pStyle w:val="Heading1"/>
       </w:pPr>
       <w:bookmarkStart w:id="9" w:name="_2._List_of"/>
-      <w:bookmarkStart w:id="10" w:name="_Toc227085058"/>
+      <w:bookmarkStart w:id="10" w:name="_Toc227112848"/>
       <w:bookmarkEnd w:id="9"/>
       <w:r>
         <w:lastRenderedPageBreak/>
@@ -2061,34 +2475,25 @@
         <w:t>List of stock components used</w:t>
       </w:r>
       <w:bookmarkEnd w:id="10"/>
-    </w:p>
-    <w:p>
-      <w:r>
-        <w:t>The reasoning behind each choice will be explained later</w:t>
-      </w:r>
-      <w:r>
-        <w:t xml:space="preserve"> </w:t>
-      </w:r>
-      <w:r>
-        <w:t>(see provided links)</w:t>
-      </w:r>
     </w:p>
     <w:tbl>
       <w:tblPr>
-        <w:tblStyle w:val="Lentelstinklelis"/>
-        <w:tblW w:w="10201" w:type="dxa"/>
+        <w:tblStyle w:val="TableGrid"/>
+        <w:tblW w:w="10167" w:type="dxa"/>
         <w:tblLook w:val="04A0" w:firstRow="1" w:lastRow="0" w:firstColumn="1" w:lastColumn="0" w:noHBand="0" w:noVBand="1"/>
       </w:tblPr>
       <w:tblGrid>
-        <w:gridCol w:w="1413"/>
-        <w:gridCol w:w="3118"/>
-        <w:gridCol w:w="2268"/>
-        <w:gridCol w:w="3402"/>
+        <w:gridCol w:w="2113"/>
+        <w:gridCol w:w="4663"/>
+        <w:gridCol w:w="3391"/>
       </w:tblGrid>
       <w:tr>
+        <w:trPr>
+          <w:trHeight w:val="864"/>
+        </w:trPr>
         <w:tc>
           <w:tcPr>
-            <w:tcW w:w="1413" w:type="dxa"/>
+            <w:tcW w:w="2113" w:type="dxa"/>
             <w:vAlign w:val="center"/>
           </w:tcPr>
           <w:p>
@@ -2110,21 +2515,13 @@
         </w:tc>
         <w:tc>
           <w:tcPr>
-            <w:tcW w:w="3118" w:type="dxa"/>
+            <w:tcW w:w="4663" w:type="dxa"/>
             <w:vAlign w:val="center"/>
           </w:tcPr>
           <w:p>
             <w:pPr>
               <w:jc w:val="center"/>
               <w:rPr>
-                <w:noProof/>
-              </w:rPr>
-            </w:pPr>
-          </w:p>
-          <w:p>
-            <w:pPr>
-              <w:jc w:val="center"/>
-              <w:rPr>
                 <w:i/>
                 <w:iCs/>
               </w:rPr>
@@ -2140,7 +2537,7 @@
         </w:tc>
         <w:tc>
           <w:tcPr>
-            <w:tcW w:w="2268" w:type="dxa"/>
+            <w:tcW w:w="3391" w:type="dxa"/>
             <w:vAlign w:val="center"/>
           </w:tcPr>
           <w:p>
@@ -2160,33 +2557,14 @@
             </w:r>
           </w:p>
         </w:tc>
+      </w:tr>
+      <w:tr>
+        <w:trPr>
+          <w:trHeight w:val="1933"/>
+        </w:trPr>
         <w:tc>
           <w:tcPr>
-            <w:tcW w:w="3402" w:type="dxa"/>
-            <w:vAlign w:val="center"/>
-          </w:tcPr>
-          <w:p>
-            <w:pPr>
-              <w:jc w:val="center"/>
-              <w:rPr>
-                <w:i/>
-                <w:iCs/>
-              </w:rPr>
-            </w:pPr>
-            <w:r>
-              <w:rPr>
-                <w:i/>
-                <w:iCs/>
-              </w:rPr>
-              <w:t>Reason for choosing</w:t>
-            </w:r>
-          </w:p>
-        </w:tc>
-      </w:tr>
-      <w:tr>
-        <w:tc>
-          <w:tcPr>
-            <w:tcW w:w="1413" w:type="dxa"/>
+            <w:tcW w:w="2113" w:type="dxa"/>
             <w:vAlign w:val="center"/>
           </w:tcPr>
           <w:p>
@@ -2200,7 +2578,7 @@
         </w:tc>
         <w:tc>
           <w:tcPr>
-            <w:tcW w:w="3118" w:type="dxa"/>
+            <w:tcW w:w="4663" w:type="dxa"/>
             <w:vAlign w:val="center"/>
           </w:tcPr>
           <w:p>
@@ -2212,9 +2590,9 @@
                 <w:noProof/>
               </w:rPr>
               <w:drawing>
-                <wp:inline distT="0" distB="0" distL="0" distR="0" wp14:anchorId="69FA784B" wp14:editId="7AE9D3B0">
-                  <wp:extent cx="1076400" cy="1080000"/>
-                  <wp:effectExtent l="0" t="0" r="0" b="6350"/>
+                <wp:inline distT="0" distB="0" distL="0" distR="0" wp14:anchorId="69FA784B" wp14:editId="650A97B3">
+                  <wp:extent cx="1796400" cy="1800000"/>
+                  <wp:effectExtent l="0" t="0" r="0" b="0"/>
                   <wp:docPr id="1" name="Picture 1"/>
                   <wp:cNvGraphicFramePr>
                     <a:graphicFrameLocks xmlns:a="http://schemas.openxmlformats.org/drawingml/2006/main" noChangeAspect="1"/>
@@ -2242,7 +2620,7 @@
                         <pic:spPr bwMode="auto">
                           <a:xfrm>
                             <a:off x="0" y="0"/>
-                            <a:ext cx="1076400" cy="1080000"/>
+                            <a:ext cx="1796400" cy="1800000"/>
                           </a:xfrm>
                           <a:prstGeom prst="rect">
                             <a:avLst/>
@@ -2267,7 +2645,7 @@
         </w:tc>
         <w:tc>
           <w:tcPr>
-            <w:tcW w:w="2268" w:type="dxa"/>
+            <w:tcW w:w="3391" w:type="dxa"/>
             <w:vAlign w:val="center"/>
           </w:tcPr>
           <w:p>
@@ -2283,7 +2661,7 @@
             <w:hyperlink r:id="rId12" w:anchor="T=C" w:history="1">
               <w:r>
                 <w:rPr>
-                  <w:rStyle w:val="Hipersaitas"/>
+                  <w:rStyle w:val="Hyperlink"/>
                 </w:rPr>
                 <w:t>44309</w:t>
               </w:r>
@@ -2293,30 +2671,28 @@
             </w:r>
           </w:p>
         </w:tc>
+      </w:tr>
+      <w:tr>
+        <w:trPr>
+          <w:trHeight w:val="1933"/>
+        </w:trPr>
         <w:tc>
           <w:tcPr>
-            <w:tcW w:w="3402" w:type="dxa"/>
+            <w:tcW w:w="2113" w:type="dxa"/>
             <w:vAlign w:val="center"/>
           </w:tcPr>
           <w:p>
             <w:pPr>
               <w:jc w:val="center"/>
             </w:pPr>
-            <w:hyperlink w:anchor="_3.2._Steering" w:history="1">
-              <w:r>
-                <w:rPr>
-                  <w:rStyle w:val="Hipersaitas"/>
-                </w:rPr>
-                <w:t>See chapter 3</w:t>
-              </w:r>
-            </w:hyperlink>
+            <w:r>
+              <w:t xml:space="preserve">Chassis </w:t>
+            </w:r>
           </w:p>
         </w:tc>
-      </w:tr>
-      <w:tr>
         <w:tc>
           <w:tcPr>
-            <w:tcW w:w="1413" w:type="dxa"/>
+            <w:tcW w:w="4663" w:type="dxa"/>
             <w:vAlign w:val="center"/>
           </w:tcPr>
           <w:p>
@@ -2324,27 +2700,13 @@
               <w:jc w:val="center"/>
             </w:pPr>
             <w:r>
-              <w:t xml:space="preserve">Chassis </w:t>
-            </w:r>
-          </w:p>
-        </w:tc>
-        <w:tc>
-          <w:tcPr>
-            <w:tcW w:w="3118" w:type="dxa"/>
-            <w:vAlign w:val="center"/>
-          </w:tcPr>
-          <w:p>
-            <w:pPr>
-              <w:jc w:val="center"/>
-            </w:pPr>
-            <w:r>
               <w:rPr>
                 <w:noProof/>
               </w:rPr>
               <w:drawing>
-                <wp:inline distT="0" distB="0" distL="0" distR="0" wp14:anchorId="07833E5A" wp14:editId="05A15518">
-                  <wp:extent cx="1342800" cy="1080000"/>
-                  <wp:effectExtent l="0" t="0" r="0" b="6350"/>
+                <wp:inline distT="0" distB="0" distL="0" distR="0" wp14:anchorId="07833E5A" wp14:editId="626AAC34">
+                  <wp:extent cx="2239200" cy="1800000"/>
+                  <wp:effectExtent l="0" t="0" r="8890" b="0"/>
                   <wp:docPr id="2" name="Picture 2"/>
                   <wp:cNvGraphicFramePr>
                     <a:graphicFrameLocks xmlns:a="http://schemas.openxmlformats.org/drawingml/2006/main" noChangeAspect="1"/>
@@ -2374,7 +2736,7 @@
                         <pic:spPr bwMode="auto">
                           <a:xfrm>
                             <a:off x="0" y="0"/>
-                            <a:ext cx="1342800" cy="1080000"/>
+                            <a:ext cx="2239200" cy="1800000"/>
                           </a:xfrm>
                           <a:prstGeom prst="rect">
                             <a:avLst/>
@@ -2394,7 +2756,7 @@
         </w:tc>
         <w:tc>
           <w:tcPr>
-            <w:tcW w:w="2268" w:type="dxa"/>
+            <w:tcW w:w="3391" w:type="dxa"/>
             <w:vAlign w:val="center"/>
           </w:tcPr>
           <w:p>
@@ -2404,63 +2766,35 @@
             <w:hyperlink r:id="rId14" w:anchor="nav-specification" w:history="1">
               <w:r>
                 <w:rPr>
-                  <w:rStyle w:val="Hipersaitas"/>
+                  <w:rStyle w:val="Hyperlink"/>
                 </w:rPr>
                 <w:t xml:space="preserve">Metal chassis for </w:t>
               </w:r>
               <w:proofErr w:type="spellStart"/>
               <w:r>
                 <w:rPr>
-                  <w:rStyle w:val="Hipersaitas"/>
+                  <w:rStyle w:val="Hyperlink"/>
                 </w:rPr>
-                <w:t>M</w:t>
-              </w:r>
-              <w:r>
-                <w:rPr>
-                  <w:rStyle w:val="Hipersaitas"/>
-                </w:rPr>
-                <w:t>a</w:t>
-              </w:r>
-              <w:r>
-                <w:rPr>
-                  <w:rStyle w:val="Hipersaitas"/>
-                </w:rPr>
-                <w:t>keblock</w:t>
+                <w:t>Makeblock</w:t>
               </w:r>
               <w:proofErr w:type="spellEnd"/>
               <w:r>
                 <w:rPr>
-                  <w:rStyle w:val="Hipersaitas"/>
+                  <w:rStyle w:val="Hyperlink"/>
                 </w:rPr>
                 <w:t xml:space="preserve"> mBot2</w:t>
               </w:r>
             </w:hyperlink>
           </w:p>
         </w:tc>
+      </w:tr>
+      <w:tr>
+        <w:trPr>
+          <w:trHeight w:val="423"/>
+        </w:trPr>
         <w:tc>
           <w:tcPr>
-            <w:tcW w:w="3402" w:type="dxa"/>
-            <w:vAlign w:val="center"/>
-          </w:tcPr>
-          <w:p>
-            <w:pPr>
-              <w:jc w:val="center"/>
-            </w:pPr>
-            <w:hyperlink w:anchor="_3.3._Chassis" w:history="1">
-              <w:r>
-                <w:rPr>
-                  <w:rStyle w:val="Hipersaitas"/>
-                </w:rPr>
-                <w:t>See chapter 3</w:t>
-              </w:r>
-            </w:hyperlink>
-          </w:p>
-        </w:tc>
-      </w:tr>
-      <w:tr>
-        <w:tc>
-          <w:tcPr>
-            <w:tcW w:w="1413" w:type="dxa"/>
+            <w:tcW w:w="2113" w:type="dxa"/>
             <w:vAlign w:val="center"/>
           </w:tcPr>
           <w:p>
@@ -2471,7 +2805,7 @@
         </w:tc>
         <w:tc>
           <w:tcPr>
-            <w:tcW w:w="3118" w:type="dxa"/>
+            <w:tcW w:w="4663" w:type="dxa"/>
             <w:vAlign w:val="center"/>
           </w:tcPr>
           <w:p>
@@ -2482,7 +2816,23 @@
         </w:tc>
         <w:tc>
           <w:tcPr>
-            <w:tcW w:w="2268" w:type="dxa"/>
+            <w:tcW w:w="3391" w:type="dxa"/>
+            <w:vAlign w:val="center"/>
+          </w:tcPr>
+          <w:p>
+            <w:pPr>
+              <w:jc w:val="center"/>
+            </w:pPr>
+          </w:p>
+        </w:tc>
+      </w:tr>
+      <w:tr>
+        <w:trPr>
+          <w:trHeight w:val="440"/>
+        </w:trPr>
+        <w:tc>
+          <w:tcPr>
+            <w:tcW w:w="2113" w:type="dxa"/>
             <w:vAlign w:val="center"/>
           </w:tcPr>
           <w:p>
@@ -2493,7 +2843,18 @@
         </w:tc>
         <w:tc>
           <w:tcPr>
-            <w:tcW w:w="3402" w:type="dxa"/>
+            <w:tcW w:w="4663" w:type="dxa"/>
+            <w:vAlign w:val="center"/>
+          </w:tcPr>
+          <w:p>
+            <w:pPr>
+              <w:jc w:val="center"/>
+            </w:pPr>
+          </w:p>
+        </w:tc>
+        <w:tc>
+          <w:tcPr>
+            <w:tcW w:w="3391" w:type="dxa"/>
             <w:vAlign w:val="center"/>
           </w:tcPr>
           <w:p>
@@ -2504,9 +2865,12 @@
         </w:tc>
       </w:tr>
       <w:tr>
+        <w:trPr>
+          <w:trHeight w:val="423"/>
+        </w:trPr>
         <w:tc>
           <w:tcPr>
-            <w:tcW w:w="1413" w:type="dxa"/>
+            <w:tcW w:w="2113" w:type="dxa"/>
             <w:vAlign w:val="center"/>
           </w:tcPr>
           <w:p>
@@ -2517,7 +2881,7 @@
         </w:tc>
         <w:tc>
           <w:tcPr>
-            <w:tcW w:w="3118" w:type="dxa"/>
+            <w:tcW w:w="4663" w:type="dxa"/>
             <w:vAlign w:val="center"/>
           </w:tcPr>
           <w:p>
@@ -2528,7 +2892,23 @@
         </w:tc>
         <w:tc>
           <w:tcPr>
-            <w:tcW w:w="2268" w:type="dxa"/>
+            <w:tcW w:w="3391" w:type="dxa"/>
+            <w:vAlign w:val="center"/>
+          </w:tcPr>
+          <w:p>
+            <w:pPr>
+              <w:jc w:val="center"/>
+            </w:pPr>
+          </w:p>
+        </w:tc>
+      </w:tr>
+      <w:tr>
+        <w:trPr>
+          <w:trHeight w:val="423"/>
+        </w:trPr>
+        <w:tc>
+          <w:tcPr>
+            <w:tcW w:w="2113" w:type="dxa"/>
             <w:vAlign w:val="center"/>
           </w:tcPr>
           <w:p>
@@ -2539,7 +2919,18 @@
         </w:tc>
         <w:tc>
           <w:tcPr>
-            <w:tcW w:w="3402" w:type="dxa"/>
+            <w:tcW w:w="4663" w:type="dxa"/>
+            <w:vAlign w:val="center"/>
+          </w:tcPr>
+          <w:p>
+            <w:pPr>
+              <w:jc w:val="center"/>
+            </w:pPr>
+          </w:p>
+        </w:tc>
+        <w:tc>
+          <w:tcPr>
+            <w:tcW w:w="3391" w:type="dxa"/>
             <w:vAlign w:val="center"/>
           </w:tcPr>
           <w:p>
@@ -2550,9 +2941,12 @@
         </w:tc>
       </w:tr>
       <w:tr>
+        <w:trPr>
+          <w:trHeight w:val="440"/>
+        </w:trPr>
         <w:tc>
           <w:tcPr>
-            <w:tcW w:w="1413" w:type="dxa"/>
+            <w:tcW w:w="2113" w:type="dxa"/>
             <w:vAlign w:val="center"/>
           </w:tcPr>
           <w:p>
@@ -2563,7 +2957,7 @@
         </w:tc>
         <w:tc>
           <w:tcPr>
-            <w:tcW w:w="3118" w:type="dxa"/>
+            <w:tcW w:w="4663" w:type="dxa"/>
             <w:vAlign w:val="center"/>
           </w:tcPr>
           <w:p>
@@ -2574,110 +2968,7 @@
         </w:tc>
         <w:tc>
           <w:tcPr>
-            <w:tcW w:w="2268" w:type="dxa"/>
-            <w:vAlign w:val="center"/>
-          </w:tcPr>
-          <w:p>
-            <w:pPr>
-              <w:jc w:val="center"/>
-            </w:pPr>
-          </w:p>
-        </w:tc>
-        <w:tc>
-          <w:tcPr>
-            <w:tcW w:w="3402" w:type="dxa"/>
-            <w:vAlign w:val="center"/>
-          </w:tcPr>
-          <w:p>
-            <w:pPr>
-              <w:jc w:val="center"/>
-            </w:pPr>
-          </w:p>
-        </w:tc>
-      </w:tr>
-      <w:tr>
-        <w:tc>
-          <w:tcPr>
-            <w:tcW w:w="1413" w:type="dxa"/>
-            <w:vAlign w:val="center"/>
-          </w:tcPr>
-          <w:p>
-            <w:pPr>
-              <w:jc w:val="center"/>
-            </w:pPr>
-          </w:p>
-        </w:tc>
-        <w:tc>
-          <w:tcPr>
-            <w:tcW w:w="3118" w:type="dxa"/>
-            <w:vAlign w:val="center"/>
-          </w:tcPr>
-          <w:p>
-            <w:pPr>
-              <w:jc w:val="center"/>
-            </w:pPr>
-          </w:p>
-        </w:tc>
-        <w:tc>
-          <w:tcPr>
-            <w:tcW w:w="2268" w:type="dxa"/>
-            <w:vAlign w:val="center"/>
-          </w:tcPr>
-          <w:p>
-            <w:pPr>
-              <w:jc w:val="center"/>
-            </w:pPr>
-          </w:p>
-        </w:tc>
-        <w:tc>
-          <w:tcPr>
-            <w:tcW w:w="3402" w:type="dxa"/>
-            <w:vAlign w:val="center"/>
-          </w:tcPr>
-          <w:p>
-            <w:pPr>
-              <w:jc w:val="center"/>
-            </w:pPr>
-          </w:p>
-        </w:tc>
-      </w:tr>
-      <w:tr>
-        <w:tc>
-          <w:tcPr>
-            <w:tcW w:w="1413" w:type="dxa"/>
-            <w:vAlign w:val="center"/>
-          </w:tcPr>
-          <w:p>
-            <w:pPr>
-              <w:jc w:val="center"/>
-            </w:pPr>
-          </w:p>
-        </w:tc>
-        <w:tc>
-          <w:tcPr>
-            <w:tcW w:w="3118" w:type="dxa"/>
-            <w:vAlign w:val="center"/>
-          </w:tcPr>
-          <w:p>
-            <w:pPr>
-              <w:jc w:val="center"/>
-            </w:pPr>
-          </w:p>
-        </w:tc>
-        <w:tc>
-          <w:tcPr>
-            <w:tcW w:w="2268" w:type="dxa"/>
-            <w:vAlign w:val="center"/>
-          </w:tcPr>
-          <w:p>
-            <w:pPr>
-              <w:jc w:val="center"/>
-            </w:pPr>
-          </w:p>
-        </w:tc>
-        <w:tc>
-          <w:tcPr>
-            <w:tcW w:w="3402" w:type="dxa"/>
+            <w:tcW w:w="3391" w:type="dxa"/>
             <w:vAlign w:val="center"/>
           </w:tcPr>
           <w:p>
@@ -2688,22 +2979,32 @@
         </w:tc>
       </w:tr>
     </w:tbl>
-    <w:p/>
+    <w:p>
+      <w:r>
+        <w:t>The reasoning behind each choice will be explained later on.</w:t>
+      </w:r>
+    </w:p>
+    <w:p>
+      <w:r>
+        <w:br w:type="page"/>
+      </w:r>
+    </w:p>
     <w:p>
       <w:pPr>
-        <w:pStyle w:val="Antrat1"/>
+        <w:pStyle w:val="Heading1"/>
       </w:pPr>
-      <w:bookmarkStart w:id="11" w:name="_Toc227085059"/>
-      <w:r>
+      <w:bookmarkStart w:id="11" w:name="_Toc227112849"/>
+      <w:r>
+        <w:lastRenderedPageBreak/>
         <w:t>3. Mechanical platform</w:t>
       </w:r>
       <w:bookmarkEnd w:id="11"/>
     </w:p>
     <w:p>
       <w:pPr>
-        <w:pStyle w:val="Antrat2"/>
+        <w:pStyle w:val="Heading2"/>
       </w:pPr>
-      <w:bookmarkStart w:id="12" w:name="_Toc227085060"/>
+      <w:bookmarkStart w:id="12" w:name="_Toc227112850"/>
       <w:r>
         <w:t>3</w:t>
       </w:r>
@@ -2725,10 +3026,10 @@
     </w:p>
     <w:p>
       <w:pPr>
-        <w:pStyle w:val="Antrat2"/>
+        <w:pStyle w:val="Heading2"/>
       </w:pPr>
       <w:bookmarkStart w:id="13" w:name="_3.2._Steering"/>
-      <w:bookmarkStart w:id="14" w:name="_Toc227085061"/>
+      <w:bookmarkStart w:id="14" w:name="_Toc227112851"/>
       <w:bookmarkEnd w:id="13"/>
       <w:r>
         <w:t>3</w:t>
@@ -2758,11 +3059,7 @@
         <w:t xml:space="preserve"> </w:t>
       </w:r>
       <w:r>
-        <w:t xml:space="preserve">requirements that we had for our steering were compactness and high steering angles. High steering angles allow </w:t>
-      </w:r>
-      <w:r>
-        <w:lastRenderedPageBreak/>
-        <w:t>for smaller turning radius, which is of utmost importance</w:t>
+        <w:t>requirements that we had for our steering were compactness and high steering angles. High steering angles allow for smaller turning radius, which is of utmost importance</w:t>
       </w:r>
       <w:r>
         <w:t xml:space="preserve"> in the challenge for optimal navigation </w:t>
@@ -2771,7 +3068,10 @@
         <w:t>around</w:t>
       </w:r>
       <w:r>
-        <w:t xml:space="preserve"> circuit and good parking performance. Compactness allows for a smaller overall footprint of the robot and also leaves space for future drivetrain, sensor and electronics placement.</w:t>
+        <w:t xml:space="preserve"> circuit and good parking performance. Compactness allows for a smaller overall footprint of the robot and also leaves space for future drivetrain, sensor and electronics placement</w:t>
+      </w:r>
+      <w:r>
+        <w:t>.</w:t>
       </w:r>
     </w:p>
     <w:p>
@@ -2787,7 +3087,7 @@
     </w:p>
     <w:tbl>
       <w:tblPr>
-        <w:tblStyle w:val="Lentelstinklelis"/>
+        <w:tblStyle w:val="TableGrid"/>
         <w:tblW w:w="10060" w:type="dxa"/>
         <w:tblLook w:val="04A0" w:firstRow="1" w:lastRow="0" w:firstColumn="1" w:lastColumn="0" w:noHBand="0" w:noVBand="1"/>
       </w:tblPr>
@@ -3050,6 +3350,7 @@
                 <w:b/>
                 <w:bCs/>
               </w:rPr>
+              <w:lastRenderedPageBreak/>
               <w:t>V2</w:t>
             </w:r>
           </w:p>
@@ -3542,6 +3843,7 @@
                 <w:b/>
                 <w:bCs/>
               </w:rPr>
+              <w:lastRenderedPageBreak/>
               <w:t>V5</w:t>
             </w:r>
           </w:p>
@@ -3692,7 +3994,6 @@
               <w:t xml:space="preserve"> </w:t>
             </w:r>
             <w:r>
-              <w:lastRenderedPageBreak/>
               <w:t>(control arm attachment “ears” would break off)</w:t>
             </w:r>
             <w:r>
@@ -3734,7 +4035,6 @@
                 <w:b/>
                 <w:bCs/>
               </w:rPr>
-              <w:lastRenderedPageBreak/>
               <w:t>V6</w:t>
             </w:r>
           </w:p>
@@ -3888,6 +4188,7 @@
                 <w:b/>
                 <w:bCs/>
               </w:rPr>
+              <w:lastRenderedPageBreak/>
               <w:t>V7</w:t>
             </w:r>
           </w:p>
@@ -4028,7 +4329,7 @@
             <w:hyperlink w:anchor="_2.3._Chassis" w:history="1">
               <w:r>
                 <w:rPr>
-                  <w:rStyle w:val="Hipersaitas"/>
+                  <w:rStyle w:val="Hyperlink"/>
                 </w:rPr>
                 <w:t>chassis</w:t>
               </w:r>
@@ -4059,11 +4360,7 @@
         <w:t>V5</w:t>
       </w:r>
       <w:r>
-        <w:t xml:space="preserve">, the tire specification to be used was decided. We wanted simple tires, that are abundant on the market. For steering, wide tires were required, as there had to be sufficient grip for sharp turning </w:t>
-      </w:r>
-      <w:r>
-        <w:lastRenderedPageBreak/>
-        <w:t>maneuvers. Also, the tires had to have a small vertical footprint. That is because the front wheels weren’t going to be driven, so the wheel size was inconsequential in this regard, but smaller wheels allowed for a more compact design, which is one of the princip</w:t>
+        <w:t>, the tire specification to be used was decided. We wanted simple tires, that are abundant on the market. For steering, wide tires were required, as there had to be sufficient grip for sharp turning maneuvers. Also, the tires had to have a small vertical footprint. That is because the front wheels weren’t going to be driven, so the wheel size was inconsequential in this regard, but smaller wheels allowed for a more compact design, which is one of the princip</w:t>
       </w:r>
       <w:r>
         <w:t>al</w:t>
@@ -4084,7 +4381,7 @@
       <w:hyperlink w:anchor="_2._List_of" w:history="1">
         <w:r>
           <w:rPr>
-            <w:rStyle w:val="Hipersaitas"/>
+            <w:rStyle w:val="Hyperlink"/>
           </w:rPr>
           <w:t>tire 43.2 x 22 ZR</w:t>
         </w:r>
@@ -4108,7 +4405,7 @@
     </w:p>
     <w:tbl>
       <w:tblPr>
-        <w:tblStyle w:val="Lentelstinklelis"/>
+        <w:tblStyle w:val="TableGrid"/>
         <w:tblW w:w="10060" w:type="dxa"/>
         <w:tblLook w:val="04A0" w:firstRow="1" w:lastRow="0" w:firstColumn="1" w:lastColumn="0" w:noHBand="0" w:noVBand="1"/>
       </w:tblPr>
@@ -4136,6 +4433,7 @@
                 <w:i/>
                 <w:iCs/>
               </w:rPr>
+              <w:lastRenderedPageBreak/>
               <w:t>Designed for steering version</w:t>
             </w:r>
           </w:p>
@@ -4406,15 +4704,14 @@
     <w:p/>
     <w:p>
       <w:pPr>
-        <w:pStyle w:val="Antrat2"/>
+        <w:pStyle w:val="Heading2"/>
       </w:pPr>
       <w:bookmarkStart w:id="15" w:name="_2.3._Chassis"/>
       <w:bookmarkStart w:id="16" w:name="_3.3._Chassis"/>
-      <w:bookmarkStart w:id="17" w:name="_Toc227085062"/>
+      <w:bookmarkStart w:id="17" w:name="_Toc227112852"/>
       <w:bookmarkEnd w:id="15"/>
       <w:bookmarkEnd w:id="16"/>
       <w:r>
-        <w:lastRenderedPageBreak/>
         <w:t>3</w:t>
       </w:r>
       <w:r>
@@ -4482,10 +4779,11 @@
     </w:p>
     <w:p>
       <w:pPr>
-        <w:pStyle w:val="Antrat2"/>
+        <w:pStyle w:val="Heading2"/>
       </w:pPr>
-      <w:bookmarkStart w:id="18" w:name="_Toc227085063"/>
-      <w:r>
+      <w:bookmarkStart w:id="18" w:name="_Toc227112853"/>
+      <w:r>
+        <w:lastRenderedPageBreak/>
         <w:t>3</w:t>
       </w:r>
       <w:r>
@@ -4518,11 +4816,7 @@
         <w:t xml:space="preserve">is needed for the wheels not to slip. Therefore, in our situation, having as narrow rear axle as possible is beneficial, due to the fact, that </w:t>
       </w:r>
       <w:r>
-        <w:t xml:space="preserve">there will be less of a speed difference between the rear wheels, so less slip, so the axle will be more predictable and under control. The downside of such a configuration is that the platform will be vulnerable to falling on its </w:t>
-      </w:r>
-      <w:r>
-        <w:lastRenderedPageBreak/>
-        <w:t>side if the turn is to</w:t>
+        <w:t>there will be less of a speed difference between the rear wheels, so less slip, so the axle will be more predictable and under control. The downside of such a configuration is that the platform will be vulnerable to falling on its side if the turn is to</w:t>
       </w:r>
       <w:r>
         <w:t>o</w:t>
@@ -4552,7 +4846,7 @@
       <w:hyperlink r:id="rId32" w:history="1">
         <w:r>
           <w:rPr>
-            <w:rStyle w:val="Hipersaitas"/>
+            <w:rStyle w:val="Hyperlink"/>
           </w:rPr>
           <w:t>an N30 dual shaft motor</w:t>
         </w:r>
@@ -4586,7 +4880,7 @@
       <w:hyperlink r:id="rId33" w:anchor="T=C" w:history="1">
         <w:r>
           <w:rPr>
-            <w:rStyle w:val="Hipersaitas"/>
+            <w:rStyle w:val="Hyperlink"/>
           </w:rPr>
           <w:t>Tire Technic Wedge Belt Wheel</w:t>
         </w:r>
@@ -4602,10 +4896,16 @@
       </w:r>
     </w:p>
     <w:p>
+      <w:r>
+        <w:lastRenderedPageBreak/>
+        <w:t>In order to improve packaging, we decided to use the motor as a stressed member of the chassis. A simple attachment that mimicked the shape of the motor’s outer shell was made to connect the metal frame with the motor. Due to the dimensions of the steering system, the motor had to be placed in a vertical orientation in order for the chassis to be level with the ground. The attachment also features a screw driven clamp for securing the motor in place. It must be said, that although simple and effective, the attachment has a minor flaw – tightening the clamp screw too tight will permanently damage the motor. This, thankfully can be easily avoided and the clamp still holds the motor in place securely.</w:t>
+      </w:r>
+    </w:p>
+    <w:p>
       <w:pPr>
-        <w:pStyle w:val="Antrat2"/>
+        <w:pStyle w:val="Heading2"/>
       </w:pPr>
-      <w:bookmarkStart w:id="19" w:name="_Toc227085064"/>
+      <w:bookmarkStart w:id="19" w:name="_Toc227112854"/>
       <w:r>
         <w:t>3</w:t>
       </w:r>
@@ -4619,7 +4919,10 @@
         <w:t xml:space="preserve">. </w:t>
       </w:r>
       <w:r>
-        <w:t>Overall design summary, tradeoffs</w:t>
+        <w:t>D</w:t>
+      </w:r>
+      <w:r>
+        <w:t>esign summary, tradeoffs</w:t>
       </w:r>
       <w:bookmarkEnd w:id="19"/>
     </w:p>
@@ -4627,7 +4930,30 @@
       <w:r>
         <w:t>Finally, we want to take one last look at overall design of the mechanical platform that we made and its main features as well as tradeoffs.</w:t>
       </w:r>
+      <w:r>
+        <w:t xml:space="preserve"> </w:t>
+      </w:r>
     </w:p>
+    <w:p>
+      <w:r>
+        <w:t>The goal</w:t>
+      </w:r>
+      <w:r>
+        <w:t xml:space="preserve"> of having</w:t>
+      </w:r>
+      <w:r>
+        <w:t xml:space="preserve"> extremely high steering angles was achieved</w:t>
+      </w:r>
+      <w:r>
+        <w:t>. Both the design of the front and rear axles enhances this feature, as the rear axle is so narrow and its wheels so slim that it effectively works like one center-mounted rear wheel.</w:t>
+      </w:r>
+    </w:p>
+    <w:p>
+      <w:r>
+        <w:t>This agility, though, comes at a cost. The inherent stability of the robot isn’t great, and it may be prone to falling over in sharp turns if the center of mass is put too high up. Therefore, an additional challenge of designing electrical circuits is lowering all the heavy components as low as possible.</w:t>
+      </w:r>
+    </w:p>
+    <w:p/>
     <w:p>
       <w:r>
         <w:br w:type="page"/>
@@ -4636,10 +4962,10 @@
     <w:p/>
     <w:p>
       <w:pPr>
-        <w:pStyle w:val="Antrat1"/>
+        <w:pStyle w:val="Heading1"/>
       </w:pPr>
       <w:bookmarkStart w:id="20" w:name="_3._Circuit_design"/>
-      <w:bookmarkStart w:id="21" w:name="_Toc227085065"/>
+      <w:bookmarkStart w:id="21" w:name="_Toc227112855"/>
       <w:bookmarkEnd w:id="20"/>
       <w:r>
         <w:t>4</w:t>
@@ -4651,18 +4977,142 @@
         <w:t>Circuit design and sensors</w:t>
       </w:r>
       <w:bookmarkEnd w:id="21"/>
+    </w:p>
+    <w:p>
+      <w:pPr>
+        <w:pStyle w:val="Heading2"/>
+      </w:pPr>
+      <w:bookmarkStart w:id="22" w:name="_Toc227112856"/>
+      <w:r>
+        <w:t>4</w:t>
+      </w:r>
+      <w:r>
+        <w:t>.1. Overview</w:t>
+      </w:r>
+      <w:bookmarkEnd w:id="22"/>
     </w:p>
     <w:p/>
     <w:p>
+      <w:pPr>
+        <w:pStyle w:val="Heading2"/>
+      </w:pPr>
+      <w:bookmarkStart w:id="23" w:name="_Toc227112857"/>
+      <w:r>
+        <w:t>4</w:t>
+      </w:r>
+      <w:r>
+        <w:t>.</w:t>
+      </w:r>
+      <w:r>
+        <w:t>2</w:t>
+      </w:r>
+      <w:r>
+        <w:t xml:space="preserve">. </w:t>
+      </w:r>
+      <w:r>
+        <w:t>Processing units</w:t>
+      </w:r>
+      <w:bookmarkEnd w:id="23"/>
+    </w:p>
+    <w:p/>
+    <w:p>
+      <w:pPr>
+        <w:pStyle w:val="Heading2"/>
+      </w:pPr>
+      <w:bookmarkStart w:id="24" w:name="_Toc227112858"/>
+      <w:r>
+        <w:t>4</w:t>
+      </w:r>
+      <w:r>
+        <w:t>.</w:t>
+      </w:r>
+      <w:r>
+        <w:t>3</w:t>
+      </w:r>
+      <w:r>
+        <w:t xml:space="preserve">. </w:t>
+      </w:r>
+      <w:r>
+        <w:t>Sensors and their placement</w:t>
+      </w:r>
+      <w:bookmarkEnd w:id="24"/>
+    </w:p>
+    <w:p/>
+    <w:p>
+      <w:pPr>
+        <w:pStyle w:val="Heading2"/>
+      </w:pPr>
+      <w:bookmarkStart w:id="25" w:name="_Toc227112859"/>
+      <w:r>
+        <w:t>4</w:t>
+      </w:r>
+      <w:r>
+        <w:t>.</w:t>
+      </w:r>
+      <w:r>
+        <w:t>4</w:t>
+      </w:r>
+      <w:r>
+        <w:t xml:space="preserve">. </w:t>
+      </w:r>
+      <w:r>
+        <w:t>Battery and power budget</w:t>
+      </w:r>
+      <w:bookmarkEnd w:id="25"/>
+    </w:p>
+    <w:p/>
+    <w:p>
+      <w:pPr>
+        <w:pStyle w:val="Heading2"/>
+      </w:pPr>
+      <w:bookmarkStart w:id="26" w:name="_Toc227112860"/>
+      <w:r>
+        <w:t>4</w:t>
+      </w:r>
+      <w:r>
+        <w:t>.</w:t>
+      </w:r>
+      <w:r>
+        <w:t>5</w:t>
+      </w:r>
+      <w:r>
+        <w:t>.</w:t>
+      </w:r>
+      <w:r>
+        <w:t xml:space="preserve"> Circuits and packaging</w:t>
+      </w:r>
+      <w:bookmarkEnd w:id="26"/>
+    </w:p>
+    <w:p/>
+    <w:p>
+      <w:pPr>
+        <w:pStyle w:val="Heading2"/>
+      </w:pPr>
+      <w:bookmarkStart w:id="27" w:name="_Toc227112861"/>
+      <w:r>
+        <w:t>4.6</w:t>
+      </w:r>
+      <w:r>
+        <w:t>. Design summary, tradeoffs</w:t>
+      </w:r>
+      <w:bookmarkEnd w:id="27"/>
+    </w:p>
+    <w:p/>
+    <w:p/>
+    <w:p/>
+    <w:p/>
+    <w:p/>
+    <w:p/>
+    <w:p>
       <w:r>
         <w:br w:type="page"/>
       </w:r>
     </w:p>
     <w:p>
       <w:pPr>
-        <w:pStyle w:val="Antrat1"/>
+        <w:pStyle w:val="Heading1"/>
       </w:pPr>
-      <w:bookmarkStart w:id="22" w:name="_Toc227085066"/>
+      <w:bookmarkStart w:id="28" w:name="_Toc227112862"/>
       <w:r>
         <w:lastRenderedPageBreak/>
         <w:t>5</w:t>
@@ -4676,7 +5126,7 @@
       <w:r>
         <w:t>Software</w:t>
       </w:r>
-      <w:bookmarkEnd w:id="22"/>
+      <w:bookmarkEnd w:id="28"/>
     </w:p>
     <w:p/>
     <w:sectPr>
@@ -4693,7 +5143,7 @@
 </file>
 
 <file path=word/endnotes.xml><?xml version="1.0" encoding="utf-8"?>
-<w:endnotes xmlns:wpc="http://schemas.microsoft.com/office/word/2010/wordprocessingCanvas" xmlns:cx="http://schemas.microsoft.com/office/drawing/2014/chartex" xmlns:cx1="http://schemas.microsoft.com/office/drawing/2015/9/8/chartex" xmlns:cx2="http://schemas.microsoft.com/office/drawing/2015/10/21/chartex" xmlns:cx3="http://schemas.microsoft.com/office/drawing/2016/5/9/chartex" xmlns:cx4="http://schemas.microsoft.com/office/drawing/2016/5/10/chartex" xmlns:cx5="http://schemas.microsoft.com/office/drawing/2016/5/11/chartex" xmlns:cx6="http://schemas.microsoft.com/office/drawing/2016/5/12/chartex" xmlns:cx7="http://schemas.microsoft.com/office/drawing/2016/5/13/chartex" xmlns:cx8="http://schemas.microsoft.com/office/drawing/2016/5/14/chartex" xmlns:mc="http://schemas.openxmlformats.org/markup-compatibility/2006" xmlns:aink="http://schemas.microsoft.com/office/drawing/2016/ink" xmlns:am3d="http://schemas.microsoft.com/office/drawing/2017/model3d" xmlns:o="urn:schemas-microsoft-com:office:office" xmlns:r="http://schemas.openxmlformats.org/officeDocument/2006/relationships" xmlns:m="http://schemas.openxmlformats.org/officeDocument/2006/math" xmlns:v="urn:schemas-microsoft-com:vml" xmlns:wp14="http://schemas.microsoft.com/office/word/2010/wordprocessingDrawing" xmlns:wp="http://schemas.openxmlformats.org/drawingml/2006/wordprocessingDrawing" xmlns:w10="urn:schemas-microsoft-com:office:word" xmlns:w="http://schemas.openxmlformats.org/wordprocessingml/2006/main" xmlns:w14="http://schemas.microsoft.com/office/word/2010/wordml" xmlns:w15="http://schemas.microsoft.com/office/word/2012/wordml" xmlns:w16cex="http://schemas.microsoft.com/office/word/2018/wordml/cex" xmlns:w16cid="http://schemas.microsoft.com/office/word/2016/wordml/cid" xmlns:w16="http://schemas.microsoft.com/office/word/2018/wordml" xmlns:w16sdtdh="http://schemas.microsoft.com/office/word/2020/wordml/sdtdatahash" xmlns:w16se="http://schemas.microsoft.com/office/word/2015/wordml/symex" xmlns:wpg="http://schemas.microsoft.com/office/word/2010/wordprocessingGroup" xmlns:wpi="http://schemas.microsoft.com/office/word/2010/wordprocessingInk" xmlns:wne="http://schemas.microsoft.com/office/word/2006/wordml" xmlns:wps="http://schemas.microsoft.com/office/word/2010/wordprocessingShape" mc:Ignorable="w14 w15 w16se w16cid w16 w16cex w16sdtdh wp14">
+<w:endnotes xmlns:wpc="http://schemas.microsoft.com/office/word/2010/wordprocessingCanvas" xmlns:cx="http://schemas.microsoft.com/office/drawing/2014/chartex" xmlns:cx1="http://schemas.microsoft.com/office/drawing/2015/9/8/chartex" xmlns:cx2="http://schemas.microsoft.com/office/drawing/2015/10/21/chartex" xmlns:cx3="http://schemas.microsoft.com/office/drawing/2016/5/9/chartex" xmlns:cx4="http://schemas.microsoft.com/office/drawing/2016/5/10/chartex" xmlns:cx5="http://schemas.microsoft.com/office/drawing/2016/5/11/chartex" xmlns:cx6="http://schemas.microsoft.com/office/drawing/2016/5/12/chartex" xmlns:cx7="http://schemas.microsoft.com/office/drawing/2016/5/13/chartex" xmlns:cx8="http://schemas.microsoft.com/office/drawing/2016/5/14/chartex" xmlns:mc="http://schemas.openxmlformats.org/markup-compatibility/2006" xmlns:aink="http://schemas.microsoft.com/office/drawing/2016/ink" xmlns:am3d="http://schemas.microsoft.com/office/drawing/2017/model3d" xmlns:o="urn:schemas-microsoft-com:office:office" xmlns:r="http://schemas.openxmlformats.org/officeDocument/2006/relationships" xmlns:m="http://schemas.openxmlformats.org/officeDocument/2006/math" xmlns:v="urn:schemas-microsoft-com:vml" xmlns:wp14="http://schemas.microsoft.com/office/word/2010/wordprocessingDrawing" xmlns:wp="http://schemas.openxmlformats.org/drawingml/2006/wordprocessingDrawing" xmlns:w10="urn:schemas-microsoft-com:office:word" xmlns:w="http://schemas.openxmlformats.org/wordprocessingml/2006/main" xmlns:w14="http://schemas.microsoft.com/office/word/2010/wordml" xmlns:w15="http://schemas.microsoft.com/office/word/2012/wordml" xmlns:w16cex="http://schemas.microsoft.com/office/word/2018/wordml/cex" xmlns:w16cid="http://schemas.microsoft.com/office/word/2016/wordml/cid" xmlns:w16="http://schemas.microsoft.com/office/word/2018/wordml" xmlns:w16se="http://schemas.microsoft.com/office/word/2015/wordml/symex" xmlns:wpg="http://schemas.microsoft.com/office/word/2010/wordprocessingGroup" xmlns:wpi="http://schemas.microsoft.com/office/word/2010/wordprocessingInk" xmlns:wne="http://schemas.microsoft.com/office/word/2006/wordml" xmlns:wps="http://schemas.microsoft.com/office/word/2010/wordprocessingShape" mc:Ignorable="w14 w15 w16se w16cid w16 w16cex wp14">
   <w:endnote w:type="separator" w:id="-1">
     <w:p>
       <w:pPr>
@@ -4718,7 +5168,7 @@
 </file>
 
 <file path=word/footer1.xml><?xml version="1.0" encoding="utf-8"?>
-<w:ftr xmlns:wpc="http://schemas.microsoft.com/office/word/2010/wordprocessingCanvas" xmlns:cx="http://schemas.microsoft.com/office/drawing/2014/chartex" xmlns:cx1="http://schemas.microsoft.com/office/drawing/2015/9/8/chartex" xmlns:cx2="http://schemas.microsoft.com/office/drawing/2015/10/21/chartex" xmlns:cx3="http://schemas.microsoft.com/office/drawing/2016/5/9/chartex" xmlns:cx4="http://schemas.microsoft.com/office/drawing/2016/5/10/chartex" xmlns:cx5="http://schemas.microsoft.com/office/drawing/2016/5/11/chartex" xmlns:cx6="http://schemas.microsoft.com/office/drawing/2016/5/12/chartex" xmlns:cx7="http://schemas.microsoft.com/office/drawing/2016/5/13/chartex" xmlns:cx8="http://schemas.microsoft.com/office/drawing/2016/5/14/chartex" xmlns:mc="http://schemas.openxmlformats.org/markup-compatibility/2006" xmlns:aink="http://schemas.microsoft.com/office/drawing/2016/ink" xmlns:am3d="http://schemas.microsoft.com/office/drawing/2017/model3d" xmlns:o="urn:schemas-microsoft-com:office:office" xmlns:r="http://schemas.openxmlformats.org/officeDocument/2006/relationships" xmlns:m="http://schemas.openxmlformats.org/officeDocument/2006/math" xmlns:v="urn:schemas-microsoft-com:vml" xmlns:wp14="http://schemas.microsoft.com/office/word/2010/wordprocessingDrawing" xmlns:wp="http://schemas.openxmlformats.org/drawingml/2006/wordprocessingDrawing" xmlns:w10="urn:schemas-microsoft-com:office:word" xmlns:w="http://schemas.openxmlformats.org/wordprocessingml/2006/main" xmlns:w14="http://schemas.microsoft.com/office/word/2010/wordml" xmlns:w15="http://schemas.microsoft.com/office/word/2012/wordml" xmlns:w16cex="http://schemas.microsoft.com/office/word/2018/wordml/cex" xmlns:w16cid="http://schemas.microsoft.com/office/word/2016/wordml/cid" xmlns:w16="http://schemas.microsoft.com/office/word/2018/wordml" xmlns:w16sdtdh="http://schemas.microsoft.com/office/word/2020/wordml/sdtdatahash" xmlns:w16se="http://schemas.microsoft.com/office/word/2015/wordml/symex" xmlns:wpg="http://schemas.microsoft.com/office/word/2010/wordprocessingGroup" xmlns:wpi="http://schemas.microsoft.com/office/word/2010/wordprocessingInk" xmlns:wne="http://schemas.microsoft.com/office/word/2006/wordml" xmlns:wps="http://schemas.microsoft.com/office/word/2010/wordprocessingShape" mc:Ignorable="w14 w15 w16se w16cid w16 w16cex w16sdtdh wp14">
+<w:ftr xmlns:wpc="http://schemas.microsoft.com/office/word/2010/wordprocessingCanvas" xmlns:cx="http://schemas.microsoft.com/office/drawing/2014/chartex" xmlns:cx1="http://schemas.microsoft.com/office/drawing/2015/9/8/chartex" xmlns:cx2="http://schemas.microsoft.com/office/drawing/2015/10/21/chartex" xmlns:cx3="http://schemas.microsoft.com/office/drawing/2016/5/9/chartex" xmlns:cx4="http://schemas.microsoft.com/office/drawing/2016/5/10/chartex" xmlns:cx5="http://schemas.microsoft.com/office/drawing/2016/5/11/chartex" xmlns:cx6="http://schemas.microsoft.com/office/drawing/2016/5/12/chartex" xmlns:cx7="http://schemas.microsoft.com/office/drawing/2016/5/13/chartex" xmlns:cx8="http://schemas.microsoft.com/office/drawing/2016/5/14/chartex" xmlns:mc="http://schemas.openxmlformats.org/markup-compatibility/2006" xmlns:aink="http://schemas.microsoft.com/office/drawing/2016/ink" xmlns:am3d="http://schemas.microsoft.com/office/drawing/2017/model3d" xmlns:o="urn:schemas-microsoft-com:office:office" xmlns:r="http://schemas.openxmlformats.org/officeDocument/2006/relationships" xmlns:m="http://schemas.openxmlformats.org/officeDocument/2006/math" xmlns:v="urn:schemas-microsoft-com:vml" xmlns:wp14="http://schemas.microsoft.com/office/word/2010/wordprocessingDrawing" xmlns:wp="http://schemas.openxmlformats.org/drawingml/2006/wordprocessingDrawing" xmlns:w10="urn:schemas-microsoft-com:office:word" xmlns:w="http://schemas.openxmlformats.org/wordprocessingml/2006/main" xmlns:w14="http://schemas.microsoft.com/office/word/2010/wordml" xmlns:w15="http://schemas.microsoft.com/office/word/2012/wordml" xmlns:w16cex="http://schemas.microsoft.com/office/word/2018/wordml/cex" xmlns:w16cid="http://schemas.microsoft.com/office/word/2016/wordml/cid" xmlns:w16="http://schemas.microsoft.com/office/word/2018/wordml" xmlns:w16se="http://schemas.microsoft.com/office/word/2015/wordml/symex" xmlns:wpg="http://schemas.microsoft.com/office/word/2010/wordprocessingGroup" xmlns:wpi="http://schemas.microsoft.com/office/word/2010/wordprocessingInk" xmlns:wne="http://schemas.microsoft.com/office/word/2006/wordml" xmlns:wps="http://schemas.microsoft.com/office/word/2010/wordprocessingShape" mc:Ignorable="w14 w15 w16se w16cid w16 w16cex wp14">
   <w:sdt>
     <w:sdtPr>
       <w:id w:val="961919925"/>
@@ -4735,7 +5185,7 @@
     <w:sdtContent>
       <w:p>
         <w:pPr>
-          <w:pStyle w:val="Porat"/>
+          <w:pStyle w:val="Footer"/>
           <w:jc w:val="center"/>
         </w:pPr>
         <w:r>
@@ -4764,14 +5214,14 @@
   </w:sdt>
   <w:p>
     <w:pPr>
-      <w:pStyle w:val="Porat"/>
+      <w:pStyle w:val="Footer"/>
     </w:pPr>
   </w:p>
 </w:ftr>
 </file>
 
 <file path=word/footnotes.xml><?xml version="1.0" encoding="utf-8"?>
-<w:footnotes xmlns:wpc="http://schemas.microsoft.com/office/word/2010/wordprocessingCanvas" xmlns:cx="http://schemas.microsoft.com/office/drawing/2014/chartex" xmlns:cx1="http://schemas.microsoft.com/office/drawing/2015/9/8/chartex" xmlns:cx2="http://schemas.microsoft.com/office/drawing/2015/10/21/chartex" xmlns:cx3="http://schemas.microsoft.com/office/drawing/2016/5/9/chartex" xmlns:cx4="http://schemas.microsoft.com/office/drawing/2016/5/10/chartex" xmlns:cx5="http://schemas.microsoft.com/office/drawing/2016/5/11/chartex" xmlns:cx6="http://schemas.microsoft.com/office/drawing/2016/5/12/chartex" xmlns:cx7="http://schemas.microsoft.com/office/drawing/2016/5/13/chartex" xmlns:cx8="http://schemas.microsoft.com/office/drawing/2016/5/14/chartex" xmlns:mc="http://schemas.openxmlformats.org/markup-compatibility/2006" xmlns:aink="http://schemas.microsoft.com/office/drawing/2016/ink" xmlns:am3d="http://schemas.microsoft.com/office/drawing/2017/model3d" xmlns:o="urn:schemas-microsoft-com:office:office" xmlns:r="http://schemas.openxmlformats.org/officeDocument/2006/relationships" xmlns:m="http://schemas.openxmlformats.org/officeDocument/2006/math" xmlns:v="urn:schemas-microsoft-com:vml" xmlns:wp14="http://schemas.microsoft.com/office/word/2010/wordprocessingDrawing" xmlns:wp="http://schemas.openxmlformats.org/drawingml/2006/wordprocessingDrawing" xmlns:w10="urn:schemas-microsoft-com:office:word" xmlns:w="http://schemas.openxmlformats.org/wordprocessingml/2006/main" xmlns:w14="http://schemas.microsoft.com/office/word/2010/wordml" xmlns:w15="http://schemas.microsoft.com/office/word/2012/wordml" xmlns:w16cex="http://schemas.microsoft.com/office/word/2018/wordml/cex" xmlns:w16cid="http://schemas.microsoft.com/office/word/2016/wordml/cid" xmlns:w16="http://schemas.microsoft.com/office/word/2018/wordml" xmlns:w16sdtdh="http://schemas.microsoft.com/office/word/2020/wordml/sdtdatahash" xmlns:w16se="http://schemas.microsoft.com/office/word/2015/wordml/symex" xmlns:wpg="http://schemas.microsoft.com/office/word/2010/wordprocessingGroup" xmlns:wpi="http://schemas.microsoft.com/office/word/2010/wordprocessingInk" xmlns:wne="http://schemas.microsoft.com/office/word/2006/wordml" xmlns:wps="http://schemas.microsoft.com/office/word/2010/wordprocessingShape" mc:Ignorable="w14 w15 w16se w16cid w16 w16cex w16sdtdh wp14">
+<w:footnotes xmlns:wpc="http://schemas.microsoft.com/office/word/2010/wordprocessingCanvas" xmlns:cx="http://schemas.microsoft.com/office/drawing/2014/chartex" xmlns:cx1="http://schemas.microsoft.com/office/drawing/2015/9/8/chartex" xmlns:cx2="http://schemas.microsoft.com/office/drawing/2015/10/21/chartex" xmlns:cx3="http://schemas.microsoft.com/office/drawing/2016/5/9/chartex" xmlns:cx4="http://schemas.microsoft.com/office/drawing/2016/5/10/chartex" xmlns:cx5="http://schemas.microsoft.com/office/drawing/2016/5/11/chartex" xmlns:cx6="http://schemas.microsoft.com/office/drawing/2016/5/12/chartex" xmlns:cx7="http://schemas.microsoft.com/office/drawing/2016/5/13/chartex" xmlns:cx8="http://schemas.microsoft.com/office/drawing/2016/5/14/chartex" xmlns:mc="http://schemas.openxmlformats.org/markup-compatibility/2006" xmlns:aink="http://schemas.microsoft.com/office/drawing/2016/ink" xmlns:am3d="http://schemas.microsoft.com/office/drawing/2017/model3d" xmlns:o="urn:schemas-microsoft-com:office:office" xmlns:r="http://schemas.openxmlformats.org/officeDocument/2006/relationships" xmlns:m="http://schemas.openxmlformats.org/officeDocument/2006/math" xmlns:v="urn:schemas-microsoft-com:vml" xmlns:wp14="http://schemas.microsoft.com/office/word/2010/wordprocessingDrawing" xmlns:wp="http://schemas.openxmlformats.org/drawingml/2006/wordprocessingDrawing" xmlns:w10="urn:schemas-microsoft-com:office:word" xmlns:w="http://schemas.openxmlformats.org/wordprocessingml/2006/main" xmlns:w14="http://schemas.microsoft.com/office/word/2010/wordml" xmlns:w15="http://schemas.microsoft.com/office/word/2012/wordml" xmlns:w16cex="http://schemas.microsoft.com/office/word/2018/wordml/cex" xmlns:w16cid="http://schemas.microsoft.com/office/word/2016/wordml/cid" xmlns:w16="http://schemas.microsoft.com/office/word/2018/wordml" xmlns:w16se="http://schemas.microsoft.com/office/word/2015/wordml/symex" xmlns:wpg="http://schemas.microsoft.com/office/word/2010/wordprocessingGroup" xmlns:wpi="http://schemas.microsoft.com/office/word/2010/wordprocessingInk" xmlns:wne="http://schemas.microsoft.com/office/word/2006/wordml" xmlns:wps="http://schemas.microsoft.com/office/word/2010/wordprocessingShape" mc:Ignorable="w14 w15 w16se w16cid w16 w16cex wp14">
   <w:footnote w:type="separator" w:id="-1">
     <w:p>
       <w:pPr>
@@ -4796,7 +5246,7 @@
 </file>
 
 <file path=word/numbering.xml><?xml version="1.0" encoding="utf-8"?>
-<w:numbering xmlns:wpc="http://schemas.microsoft.com/office/word/2010/wordprocessingCanvas" xmlns:cx="http://schemas.microsoft.com/office/drawing/2014/chartex" xmlns:cx1="http://schemas.microsoft.com/office/drawing/2015/9/8/chartex" xmlns:cx2="http://schemas.microsoft.com/office/drawing/2015/10/21/chartex" xmlns:cx3="http://schemas.microsoft.com/office/drawing/2016/5/9/chartex" xmlns:cx4="http://schemas.microsoft.com/office/drawing/2016/5/10/chartex" xmlns:cx5="http://schemas.microsoft.com/office/drawing/2016/5/11/chartex" xmlns:cx6="http://schemas.microsoft.com/office/drawing/2016/5/12/chartex" xmlns:cx7="http://schemas.microsoft.com/office/drawing/2016/5/13/chartex" xmlns:cx8="http://schemas.microsoft.com/office/drawing/2016/5/14/chartex" xmlns:mc="http://schemas.openxmlformats.org/markup-compatibility/2006" xmlns:aink="http://schemas.microsoft.com/office/drawing/2016/ink" xmlns:am3d="http://schemas.microsoft.com/office/drawing/2017/model3d" xmlns:o="urn:schemas-microsoft-com:office:office" xmlns:r="http://schemas.openxmlformats.org/officeDocument/2006/relationships" xmlns:m="http://schemas.openxmlformats.org/officeDocument/2006/math" xmlns:v="urn:schemas-microsoft-com:vml" xmlns:wp14="http://schemas.microsoft.com/office/word/2010/wordprocessingDrawing" xmlns:wp="http://schemas.openxmlformats.org/drawingml/2006/wordprocessingDrawing" xmlns:w10="urn:schemas-microsoft-com:office:word" xmlns:w="http://schemas.openxmlformats.org/wordprocessingml/2006/main" xmlns:w14="http://schemas.microsoft.com/office/word/2010/wordml" xmlns:w15="http://schemas.microsoft.com/office/word/2012/wordml" xmlns:w16cex="http://schemas.microsoft.com/office/word/2018/wordml/cex" xmlns:w16cid="http://schemas.microsoft.com/office/word/2016/wordml/cid" xmlns:w16="http://schemas.microsoft.com/office/word/2018/wordml" xmlns:w16sdtdh="http://schemas.microsoft.com/office/word/2020/wordml/sdtdatahash" xmlns:w16se="http://schemas.microsoft.com/office/word/2015/wordml/symex" xmlns:wpg="http://schemas.microsoft.com/office/word/2010/wordprocessingGroup" xmlns:wpi="http://schemas.microsoft.com/office/word/2010/wordprocessingInk" xmlns:wne="http://schemas.microsoft.com/office/word/2006/wordml" xmlns:wps="http://schemas.microsoft.com/office/word/2010/wordprocessingShape" mc:Ignorable="w14 w15 w16se w16cid w16 w16cex w16sdtdh wp14">
+<w:numbering xmlns:wpc="http://schemas.microsoft.com/office/word/2010/wordprocessingCanvas" xmlns:cx="http://schemas.microsoft.com/office/drawing/2014/chartex" xmlns:cx1="http://schemas.microsoft.com/office/drawing/2015/9/8/chartex" xmlns:cx2="http://schemas.microsoft.com/office/drawing/2015/10/21/chartex" xmlns:cx3="http://schemas.microsoft.com/office/drawing/2016/5/9/chartex" xmlns:cx4="http://schemas.microsoft.com/office/drawing/2016/5/10/chartex" xmlns:cx5="http://schemas.microsoft.com/office/drawing/2016/5/11/chartex" xmlns:cx6="http://schemas.microsoft.com/office/drawing/2016/5/12/chartex" xmlns:cx7="http://schemas.microsoft.com/office/drawing/2016/5/13/chartex" xmlns:cx8="http://schemas.microsoft.com/office/drawing/2016/5/14/chartex" xmlns:mc="http://schemas.openxmlformats.org/markup-compatibility/2006" xmlns:aink="http://schemas.microsoft.com/office/drawing/2016/ink" xmlns:am3d="http://schemas.microsoft.com/office/drawing/2017/model3d" xmlns:o="urn:schemas-microsoft-com:office:office" xmlns:r="http://schemas.openxmlformats.org/officeDocument/2006/relationships" xmlns:m="http://schemas.openxmlformats.org/officeDocument/2006/math" xmlns:v="urn:schemas-microsoft-com:vml" xmlns:wp14="http://schemas.microsoft.com/office/word/2010/wordprocessingDrawing" xmlns:wp="http://schemas.openxmlformats.org/drawingml/2006/wordprocessingDrawing" xmlns:w10="urn:schemas-microsoft-com:office:word" xmlns:w="http://schemas.openxmlformats.org/wordprocessingml/2006/main" xmlns:w14="http://schemas.microsoft.com/office/word/2010/wordml" xmlns:w15="http://schemas.microsoft.com/office/word/2012/wordml" xmlns:w16cex="http://schemas.microsoft.com/office/word/2018/wordml/cex" xmlns:w16cid="http://schemas.microsoft.com/office/word/2016/wordml/cid" xmlns:w16="http://schemas.microsoft.com/office/word/2018/wordml" xmlns:w16se="http://schemas.microsoft.com/office/word/2015/wordml/symex" xmlns:wpg="http://schemas.microsoft.com/office/word/2010/wordprocessingGroup" xmlns:wpi="http://schemas.microsoft.com/office/word/2010/wordprocessingInk" xmlns:wne="http://schemas.microsoft.com/office/word/2006/wordml" xmlns:wps="http://schemas.microsoft.com/office/word/2010/wordprocessingShape" mc:Ignorable="w14 w15 w16se w16cid w16 w16cex wp14">
   <w:abstractNum w:abstractNumId="0" w15:restartNumberingAfterBreak="0">
     <w:nsid w:val="32576C21"/>
     <w:multiLevelType w:val="hybridMultilevel"/>
@@ -4985,7 +5435,7 @@
 </file>
 
 <file path=word/styles.xml><?xml version="1.0" encoding="utf-8"?>
-<w:styles xmlns:mc="http://schemas.openxmlformats.org/markup-compatibility/2006" xmlns:r="http://schemas.openxmlformats.org/officeDocument/2006/relationships" xmlns:w="http://schemas.openxmlformats.org/wordprocessingml/2006/main" xmlns:w14="http://schemas.microsoft.com/office/word/2010/wordml" xmlns:w15="http://schemas.microsoft.com/office/word/2012/wordml" xmlns:w16cex="http://schemas.microsoft.com/office/word/2018/wordml/cex" xmlns:w16cid="http://schemas.microsoft.com/office/word/2016/wordml/cid" xmlns:w16="http://schemas.microsoft.com/office/word/2018/wordml" xmlns:w16sdtdh="http://schemas.microsoft.com/office/word/2020/wordml/sdtdatahash" xmlns:w16se="http://schemas.microsoft.com/office/word/2015/wordml/symex" mc:Ignorable="w14 w15 w16se w16cid w16 w16cex w16sdtdh">
+<w:styles xmlns:mc="http://schemas.openxmlformats.org/markup-compatibility/2006" xmlns:r="http://schemas.openxmlformats.org/officeDocument/2006/relationships" xmlns:w="http://schemas.openxmlformats.org/wordprocessingml/2006/main" xmlns:w14="http://schemas.microsoft.com/office/word/2010/wordml" xmlns:w15="http://schemas.microsoft.com/office/word/2012/wordml" xmlns:w16cex="http://schemas.microsoft.com/office/word/2018/wordml/cex" xmlns:w16cid="http://schemas.microsoft.com/office/word/2016/wordml/cid" xmlns:w16="http://schemas.microsoft.com/office/word/2018/wordml" xmlns:w16se="http://schemas.microsoft.com/office/word/2015/wordml/symex" mc:Ignorable="w14 w15 w16se w16cid w16 w16cex">
   <w:docDefaults>
     <w:rPrDefault>
       <w:rPr>
@@ -5379,7 +5829,7 @@
     <w:lsdException w:name="Unresolved Mention" w:semiHidden="1" w:unhideWhenUsed="1"/>
     <w:lsdException w:name="Smart Link" w:semiHidden="1" w:unhideWhenUsed="1"/>
   </w:latentStyles>
-  <w:style w:type="paragraph" w:default="1" w:styleId="prastasis">
+  <w:style w:type="paragraph" w:default="1" w:styleId="Normal">
     <w:name w:val="Normal"/>
     <w:qFormat/>
     <w:rsid w:val="00552461"/>
@@ -5388,11 +5838,11 @@
       <w:sz w:val="32"/>
     </w:rPr>
   </w:style>
-  <w:style w:type="paragraph" w:styleId="Antrat1">
+  <w:style w:type="paragraph" w:styleId="Heading1">
     <w:name w:val="heading 1"/>
-    <w:basedOn w:val="prastasis"/>
-    <w:next w:val="prastasis"/>
-    <w:link w:val="Antrat1Diagrama"/>
+    <w:basedOn w:val="Normal"/>
+    <w:next w:val="Normal"/>
+    <w:link w:val="Heading1Char"/>
     <w:uiPriority w:val="9"/>
     <w:qFormat/>
     <w:rsid w:val="00552461"/>
@@ -5410,11 +5860,11 @@
       <w:szCs w:val="32"/>
     </w:rPr>
   </w:style>
-  <w:style w:type="paragraph" w:styleId="Antrat2">
+  <w:style w:type="paragraph" w:styleId="Heading2">
     <w:name w:val="heading 2"/>
-    <w:basedOn w:val="prastasis"/>
-    <w:next w:val="prastasis"/>
-    <w:link w:val="Antrat2Diagrama"/>
+    <w:basedOn w:val="Normal"/>
+    <w:next w:val="Normal"/>
+    <w:link w:val="Heading2Char"/>
     <w:uiPriority w:val="9"/>
     <w:unhideWhenUsed/>
     <w:qFormat/>
@@ -5433,13 +5883,13 @@
       <w:szCs w:val="26"/>
     </w:rPr>
   </w:style>
-  <w:style w:type="character" w:default="1" w:styleId="Numatytasispastraiposriftas">
+  <w:style w:type="character" w:default="1" w:styleId="DefaultParagraphFont">
     <w:name w:val="Default Paragraph Font"/>
     <w:uiPriority w:val="1"/>
     <w:semiHidden/>
     <w:unhideWhenUsed/>
   </w:style>
-  <w:style w:type="table" w:default="1" w:styleId="prastojilentel">
+  <w:style w:type="table" w:default="1" w:styleId="TableNormal">
     <w:name w:val="Normal Table"/>
     <w:uiPriority w:val="99"/>
     <w:semiHidden/>
@@ -5454,16 +5904,16 @@
       </w:tblCellMar>
     </w:tblPr>
   </w:style>
-  <w:style w:type="numbering" w:default="1" w:styleId="Sraonra">
+  <w:style w:type="numbering" w:default="1" w:styleId="NoList">
     <w:name w:val="No List"/>
     <w:uiPriority w:val="99"/>
     <w:semiHidden/>
     <w:unhideWhenUsed/>
   </w:style>
-  <w:style w:type="character" w:customStyle="1" w:styleId="Antrat1Diagrama">
-    <w:name w:val="Antraštė 1 Diagrama"/>
-    <w:basedOn w:val="Numatytasispastraiposriftas"/>
-    <w:link w:val="Antrat1"/>
+  <w:style w:type="character" w:customStyle="1" w:styleId="Heading1Char">
+    <w:name w:val="Heading 1 Char"/>
+    <w:basedOn w:val="DefaultParagraphFont"/>
+    <w:link w:val="Heading1"/>
     <w:uiPriority w:val="9"/>
     <w:rsid w:val="00552461"/>
     <w:rPr>
@@ -5474,9 +5924,9 @@
       <w:szCs w:val="32"/>
     </w:rPr>
   </w:style>
-  <w:style w:type="paragraph" w:styleId="Sraopastraipa">
+  <w:style w:type="paragraph" w:styleId="ListParagraph">
     <w:name w:val="List Paragraph"/>
-    <w:basedOn w:val="prastasis"/>
+    <w:basedOn w:val="Normal"/>
     <w:uiPriority w:val="34"/>
     <w:qFormat/>
     <w:rsid w:val="00552461"/>
@@ -5485,10 +5935,10 @@
       <w:contextualSpacing/>
     </w:pPr>
   </w:style>
-  <w:style w:type="paragraph" w:styleId="Antrats">
+  <w:style w:type="paragraph" w:styleId="Header">
     <w:name w:val="header"/>
-    <w:basedOn w:val="prastasis"/>
-    <w:link w:val="AntratsDiagrama"/>
+    <w:basedOn w:val="Normal"/>
+    <w:link w:val="HeaderChar"/>
     <w:uiPriority w:val="99"/>
     <w:unhideWhenUsed/>
     <w:rsid w:val="00A72255"/>
@@ -5500,10 +5950,10 @@
       <w:spacing w:after="0" w:line="240" w:lineRule="auto"/>
     </w:pPr>
   </w:style>
-  <w:style w:type="character" w:customStyle="1" w:styleId="AntratsDiagrama">
-    <w:name w:val="Antraštės Diagrama"/>
-    <w:basedOn w:val="Numatytasispastraiposriftas"/>
-    <w:link w:val="Antrats"/>
+  <w:style w:type="character" w:customStyle="1" w:styleId="HeaderChar">
+    <w:name w:val="Header Char"/>
+    <w:basedOn w:val="DefaultParagraphFont"/>
+    <w:link w:val="Header"/>
     <w:uiPriority w:val="99"/>
     <w:rsid w:val="00A72255"/>
     <w:rPr>
@@ -5511,10 +5961,10 @@
       <w:sz w:val="32"/>
     </w:rPr>
   </w:style>
-  <w:style w:type="paragraph" w:styleId="Porat">
+  <w:style w:type="paragraph" w:styleId="Footer">
     <w:name w:val="footer"/>
-    <w:basedOn w:val="prastasis"/>
-    <w:link w:val="PoratDiagrama"/>
+    <w:basedOn w:val="Normal"/>
+    <w:link w:val="FooterChar"/>
     <w:uiPriority w:val="99"/>
     <w:unhideWhenUsed/>
     <w:rsid w:val="00A72255"/>
@@ -5526,10 +5976,10 @@
       <w:spacing w:after="0" w:line="240" w:lineRule="auto"/>
     </w:pPr>
   </w:style>
-  <w:style w:type="character" w:customStyle="1" w:styleId="PoratDiagrama">
-    <w:name w:val="Poraštė Diagrama"/>
-    <w:basedOn w:val="Numatytasispastraiposriftas"/>
-    <w:link w:val="Porat"/>
+  <w:style w:type="character" w:customStyle="1" w:styleId="FooterChar">
+    <w:name w:val="Footer Char"/>
+    <w:basedOn w:val="DefaultParagraphFont"/>
+    <w:link w:val="Footer"/>
     <w:uiPriority w:val="99"/>
     <w:rsid w:val="00A72255"/>
     <w:rPr>
@@ -5537,10 +5987,10 @@
       <w:sz w:val="32"/>
     </w:rPr>
   </w:style>
-  <w:style w:type="paragraph" w:styleId="Turinioantrat">
+  <w:style w:type="paragraph" w:styleId="TOCHeading">
     <w:name w:val="TOC Heading"/>
-    <w:basedOn w:val="Antrat1"/>
-    <w:next w:val="prastasis"/>
+    <w:basedOn w:val="Heading1"/>
+    <w:next w:val="Normal"/>
     <w:uiPriority w:val="39"/>
     <w:unhideWhenUsed/>
     <w:qFormat/>
@@ -5556,10 +6006,10 @@
       <w:lang w:eastAsia="en-US"/>
     </w:rPr>
   </w:style>
-  <w:style w:type="paragraph" w:styleId="Turinys1">
+  <w:style w:type="paragraph" w:styleId="TOC1">
     <w:name w:val="toc 1"/>
-    <w:basedOn w:val="prastasis"/>
-    <w:next w:val="prastasis"/>
+    <w:basedOn w:val="Normal"/>
+    <w:next w:val="Normal"/>
     <w:autoRedefine/>
     <w:uiPriority w:val="39"/>
     <w:unhideWhenUsed/>
@@ -5568,9 +6018,9 @@
       <w:spacing w:after="100"/>
     </w:pPr>
   </w:style>
-  <w:style w:type="character" w:styleId="Hipersaitas">
+  <w:style w:type="character" w:styleId="Hyperlink">
     <w:name w:val="Hyperlink"/>
-    <w:basedOn w:val="Numatytasispastraiposriftas"/>
+    <w:basedOn w:val="DefaultParagraphFont"/>
     <w:uiPriority w:val="99"/>
     <w:unhideWhenUsed/>
     <w:rsid w:val="00A72255"/>
@@ -5579,11 +6029,11 @@
       <w:u w:val="single"/>
     </w:rPr>
   </w:style>
-  <w:style w:type="paragraph" w:styleId="Pavadinimas">
+  <w:style w:type="paragraph" w:styleId="Title">
     <w:name w:val="Title"/>
-    <w:basedOn w:val="prastasis"/>
-    <w:next w:val="prastasis"/>
-    <w:link w:val="PavadinimasDiagrama"/>
+    <w:basedOn w:val="Normal"/>
+    <w:next w:val="Normal"/>
+    <w:link w:val="TitleChar"/>
     <w:uiPriority w:val="10"/>
     <w:qFormat/>
     <w:rsid w:val="00A72255"/>
@@ -5595,10 +6045,10 @@
       <w:sz w:val="60"/>
     </w:rPr>
   </w:style>
-  <w:style w:type="character" w:customStyle="1" w:styleId="PavadinimasDiagrama">
-    <w:name w:val="Pavadinimas Diagrama"/>
-    <w:basedOn w:val="Numatytasispastraiposriftas"/>
-    <w:link w:val="Pavadinimas"/>
+  <w:style w:type="character" w:customStyle="1" w:styleId="TitleChar">
+    <w:name w:val="Title Char"/>
+    <w:basedOn w:val="DefaultParagraphFont"/>
+    <w:link w:val="Title"/>
     <w:uiPriority w:val="10"/>
     <w:rsid w:val="00A72255"/>
     <w:rPr>
@@ -5609,9 +6059,9 @@
       <w:sz w:val="60"/>
     </w:rPr>
   </w:style>
-  <w:style w:type="paragraph" w:styleId="Betarp">
+  <w:style w:type="paragraph" w:styleId="NoSpacing">
     <w:name w:val="No Spacing"/>
-    <w:link w:val="BetarpDiagrama"/>
+    <w:link w:val="NoSpacingChar"/>
     <w:uiPriority w:val="1"/>
     <w:qFormat/>
     <w:rsid w:val="00A72255"/>
@@ -5622,19 +6072,19 @@
       <w:lang w:eastAsia="en-US"/>
     </w:rPr>
   </w:style>
-  <w:style w:type="character" w:customStyle="1" w:styleId="BetarpDiagrama">
-    <w:name w:val="Be tarpų Diagrama"/>
-    <w:basedOn w:val="Numatytasispastraiposriftas"/>
-    <w:link w:val="Betarp"/>
+  <w:style w:type="character" w:customStyle="1" w:styleId="NoSpacingChar">
+    <w:name w:val="No Spacing Char"/>
+    <w:basedOn w:val="DefaultParagraphFont"/>
+    <w:link w:val="NoSpacing"/>
     <w:uiPriority w:val="1"/>
     <w:rsid w:val="00A72255"/>
     <w:rPr>
       <w:lang w:eastAsia="en-US"/>
     </w:rPr>
   </w:style>
-  <w:style w:type="character" w:styleId="Knygospavadinimas">
+  <w:style w:type="character" w:styleId="BookTitle">
     <w:name w:val="Book Title"/>
-    <w:basedOn w:val="Numatytasispastraiposriftas"/>
+    <w:basedOn w:val="DefaultParagraphFont"/>
     <w:uiPriority w:val="33"/>
     <w:qFormat/>
     <w:rsid w:val="008841A1"/>
@@ -5649,9 +6099,9 @@
       <w:sz w:val="100"/>
     </w:rPr>
   </w:style>
-  <w:style w:type="character" w:styleId="Neapdorotaspaminjimas">
+  <w:style w:type="character" w:styleId="UnresolvedMention">
     <w:name w:val="Unresolved Mention"/>
-    <w:basedOn w:val="Numatytasispastraiposriftas"/>
+    <w:basedOn w:val="DefaultParagraphFont"/>
     <w:uiPriority w:val="99"/>
     <w:semiHidden/>
     <w:unhideWhenUsed/>
@@ -5661,9 +6111,9 @@
       <w:shd w:val="clear" w:color="auto" w:fill="E1DFDD"/>
     </w:rPr>
   </w:style>
-  <w:style w:type="character" w:styleId="Perirtashipersaitas">
+  <w:style w:type="character" w:styleId="FollowedHyperlink">
     <w:name w:val="FollowedHyperlink"/>
-    <w:basedOn w:val="Numatytasispastraiposriftas"/>
+    <w:basedOn w:val="DefaultParagraphFont"/>
     <w:uiPriority w:val="99"/>
     <w:semiHidden/>
     <w:unhideWhenUsed/>
@@ -5673,10 +6123,10 @@
       <w:u w:val="single"/>
     </w:rPr>
   </w:style>
-  <w:style w:type="character" w:customStyle="1" w:styleId="Antrat2Diagrama">
-    <w:name w:val="Antraštė 2 Diagrama"/>
-    <w:basedOn w:val="Numatytasispastraiposriftas"/>
-    <w:link w:val="Antrat2"/>
+  <w:style w:type="character" w:customStyle="1" w:styleId="Heading2Char">
+    <w:name w:val="Heading 2 Char"/>
+    <w:basedOn w:val="DefaultParagraphFont"/>
+    <w:link w:val="Heading2"/>
     <w:uiPriority w:val="9"/>
     <w:rsid w:val="001F316F"/>
     <w:rPr>
@@ -5687,10 +6137,10 @@
       <w:szCs w:val="26"/>
     </w:rPr>
   </w:style>
-  <w:style w:type="paragraph" w:styleId="Turinys2">
+  <w:style w:type="paragraph" w:styleId="TOC2">
     <w:name w:val="toc 2"/>
-    <w:basedOn w:val="prastasis"/>
-    <w:next w:val="prastasis"/>
+    <w:basedOn w:val="Normal"/>
+    <w:next w:val="Normal"/>
     <w:autoRedefine/>
     <w:uiPriority w:val="39"/>
     <w:unhideWhenUsed/>
@@ -5700,10 +6150,10 @@
       <w:ind w:left="320"/>
     </w:pPr>
   </w:style>
-  <w:style w:type="paragraph" w:styleId="Antrat">
+  <w:style w:type="paragraph" w:styleId="Caption">
     <w:name w:val="caption"/>
-    <w:basedOn w:val="prastasis"/>
-    <w:next w:val="prastasis"/>
+    <w:basedOn w:val="Normal"/>
+    <w:next w:val="Normal"/>
     <w:uiPriority w:val="35"/>
     <w:unhideWhenUsed/>
     <w:qFormat/>
@@ -5719,9 +6169,9 @@
       <w:szCs w:val="18"/>
     </w:rPr>
   </w:style>
-  <w:style w:type="table" w:styleId="Lentelstinklelis">
+  <w:style w:type="table" w:styleId="TableGrid">
     <w:name w:val="Table Grid"/>
-    <w:basedOn w:val="prastojilentel"/>
+    <w:basedOn w:val="TableNormal"/>
     <w:uiPriority w:val="39"/>
     <w:rsid w:val="00900767"/>
     <w:pPr>
@@ -5738,9 +6188,9 @@
       </w:tblBorders>
     </w:tblPr>
   </w:style>
-  <w:style w:type="table" w:styleId="5paprastojilentel">
+  <w:style w:type="table" w:styleId="PlainTable5">
     <w:name w:val="Plain Table 5"/>
-    <w:basedOn w:val="prastojilentel"/>
+    <w:basedOn w:val="TableNormal"/>
     <w:uiPriority w:val="45"/>
     <w:rsid w:val="005763A5"/>
     <w:pPr>
@@ -5858,9 +6308,9 @@
       </w:tcPr>
     </w:tblStylePr>
   </w:style>
-  <w:style w:type="table" w:styleId="3paprastojilentel">
+  <w:style w:type="table" w:styleId="PlainTable3">
     <w:name w:val="Plain Table 3"/>
-    <w:basedOn w:val="prastojilentel"/>
+    <w:basedOn w:val="TableNormal"/>
     <w:uiPriority w:val="43"/>
     <w:rsid w:val="005763A5"/>
     <w:pPr>
@@ -5951,9 +6401,9 @@
       </w:tcPr>
     </w:tblStylePr>
   </w:style>
-  <w:style w:type="table" w:styleId="1paprastojilentel">
+  <w:style w:type="table" w:styleId="PlainTable1">
     <w:name w:val="Plain Table 1"/>
-    <w:basedOn w:val="prastojilentel"/>
+    <w:basedOn w:val="TableNormal"/>
     <w:uiPriority w:val="41"/>
     <w:rsid w:val="005763A5"/>
     <w:pPr>
@@ -6014,9 +6464,9 @@
       </w:tcPr>
     </w:tblStylePr>
   </w:style>
-  <w:style w:type="table" w:styleId="Lentelstinklelisviesus">
+  <w:style w:type="table" w:styleId="TableGridLight">
     <w:name w:val="Grid Table Light"/>
-    <w:basedOn w:val="prastojilentel"/>
+    <w:basedOn w:val="TableNormal"/>
     <w:uiPriority w:val="40"/>
     <w:rsid w:val="005763A5"/>
     <w:pPr>
@@ -6037,7 +6487,7 @@
 </file>
 
 <file path=word/glossary/document.xml><?xml version="1.0" encoding="utf-8"?>
-<w:glossaryDocument xmlns:wpc="http://schemas.microsoft.com/office/word/2010/wordprocessingCanvas" xmlns:cx="http://schemas.microsoft.com/office/drawing/2014/chartex" xmlns:cx1="http://schemas.microsoft.com/office/drawing/2015/9/8/chartex" xmlns:cx2="http://schemas.microsoft.com/office/drawing/2015/10/21/chartex" xmlns:cx3="http://schemas.microsoft.com/office/drawing/2016/5/9/chartex" xmlns:cx4="http://schemas.microsoft.com/office/drawing/2016/5/10/chartex" xmlns:cx5="http://schemas.microsoft.com/office/drawing/2016/5/11/chartex" xmlns:cx6="http://schemas.microsoft.com/office/drawing/2016/5/12/chartex" xmlns:cx7="http://schemas.microsoft.com/office/drawing/2016/5/13/chartex" xmlns:cx8="http://schemas.microsoft.com/office/drawing/2016/5/14/chartex" xmlns:mc="http://schemas.openxmlformats.org/markup-compatibility/2006" xmlns:aink="http://schemas.microsoft.com/office/drawing/2016/ink" xmlns:am3d="http://schemas.microsoft.com/office/drawing/2017/model3d" xmlns:o="urn:schemas-microsoft-com:office:office" xmlns:r="http://schemas.openxmlformats.org/officeDocument/2006/relationships" xmlns:m="http://schemas.openxmlformats.org/officeDocument/2006/math" xmlns:v="urn:schemas-microsoft-com:vml" xmlns:wp14="http://schemas.microsoft.com/office/word/2010/wordprocessingDrawing" xmlns:wp="http://schemas.openxmlformats.org/drawingml/2006/wordprocessingDrawing" xmlns:w10="urn:schemas-microsoft-com:office:word" xmlns:w="http://schemas.openxmlformats.org/wordprocessingml/2006/main" xmlns:w14="http://schemas.microsoft.com/office/word/2010/wordml" xmlns:w15="http://schemas.microsoft.com/office/word/2012/wordml" xmlns:w16cex="http://schemas.microsoft.com/office/word/2018/wordml/cex" xmlns:w16cid="http://schemas.microsoft.com/office/word/2016/wordml/cid" xmlns:w16="http://schemas.microsoft.com/office/word/2018/wordml" xmlns:w16sdtdh="http://schemas.microsoft.com/office/word/2020/wordml/sdtdatahash" xmlns:w16se="http://schemas.microsoft.com/office/word/2015/wordml/symex" xmlns:wpg="http://schemas.microsoft.com/office/word/2010/wordprocessingGroup" xmlns:wpi="http://schemas.microsoft.com/office/word/2010/wordprocessingInk" xmlns:wne="http://schemas.microsoft.com/office/word/2006/wordml" xmlns:wps="http://schemas.microsoft.com/office/word/2010/wordprocessingShape" mc:Ignorable="w14 w15 w16se w16cid w16 w16cex w16sdtdh wp14">
+<w:glossaryDocument xmlns:wpc="http://schemas.microsoft.com/office/word/2010/wordprocessingCanvas" xmlns:cx="http://schemas.microsoft.com/office/drawing/2014/chartex" xmlns:cx1="http://schemas.microsoft.com/office/drawing/2015/9/8/chartex" xmlns:cx2="http://schemas.microsoft.com/office/drawing/2015/10/21/chartex" xmlns:cx3="http://schemas.microsoft.com/office/drawing/2016/5/9/chartex" xmlns:cx4="http://schemas.microsoft.com/office/drawing/2016/5/10/chartex" xmlns:cx5="http://schemas.microsoft.com/office/drawing/2016/5/11/chartex" xmlns:cx6="http://schemas.microsoft.com/office/drawing/2016/5/12/chartex" xmlns:cx7="http://schemas.microsoft.com/office/drawing/2016/5/13/chartex" xmlns:cx8="http://schemas.microsoft.com/office/drawing/2016/5/14/chartex" xmlns:mc="http://schemas.openxmlformats.org/markup-compatibility/2006" xmlns:aink="http://schemas.microsoft.com/office/drawing/2016/ink" xmlns:am3d="http://schemas.microsoft.com/office/drawing/2017/model3d" xmlns:o="urn:schemas-microsoft-com:office:office" xmlns:r="http://schemas.openxmlformats.org/officeDocument/2006/relationships" xmlns:m="http://schemas.openxmlformats.org/officeDocument/2006/math" xmlns:v="urn:schemas-microsoft-com:vml" xmlns:wp14="http://schemas.microsoft.com/office/word/2010/wordprocessingDrawing" xmlns:wp="http://schemas.openxmlformats.org/drawingml/2006/wordprocessingDrawing" xmlns:w10="urn:schemas-microsoft-com:office:word" xmlns:w="http://schemas.openxmlformats.org/wordprocessingml/2006/main" xmlns:w14="http://schemas.microsoft.com/office/word/2010/wordml" xmlns:w15="http://schemas.microsoft.com/office/word/2012/wordml" xmlns:w16cex="http://schemas.microsoft.com/office/word/2018/wordml/cex" xmlns:w16cid="http://schemas.microsoft.com/office/word/2016/wordml/cid" xmlns:w16="http://schemas.microsoft.com/office/word/2018/wordml" xmlns:w16se="http://schemas.microsoft.com/office/word/2015/wordml/symex" xmlns:wpg="http://schemas.microsoft.com/office/word/2010/wordprocessingGroup" xmlns:wpi="http://schemas.microsoft.com/office/word/2010/wordprocessingInk" xmlns:wne="http://schemas.microsoft.com/office/word/2006/wordml" xmlns:wps="http://schemas.microsoft.com/office/word/2010/wordprocessingShape" mc:Ignorable="w14 w15 w16se w16cid w16 w16cex wp14">
   <w:docParts>
     <w:docPart>
       <w:docPartPr>
@@ -6169,7 +6619,7 @@
 </file>
 
 <file path=word/glossary/fontTable.xml><?xml version="1.0" encoding="utf-8"?>
-<w:fonts xmlns:mc="http://schemas.openxmlformats.org/markup-compatibility/2006" xmlns:r="http://schemas.openxmlformats.org/officeDocument/2006/relationships" xmlns:w="http://schemas.openxmlformats.org/wordprocessingml/2006/main" xmlns:w14="http://schemas.microsoft.com/office/word/2010/wordml" xmlns:w15="http://schemas.microsoft.com/office/word/2012/wordml" xmlns:w16cex="http://schemas.microsoft.com/office/word/2018/wordml/cex" xmlns:w16cid="http://schemas.microsoft.com/office/word/2016/wordml/cid" xmlns:w16="http://schemas.microsoft.com/office/word/2018/wordml" xmlns:w16sdtdh="http://schemas.microsoft.com/office/word/2020/wordml/sdtdatahash" xmlns:w16se="http://schemas.microsoft.com/office/word/2015/wordml/symex" mc:Ignorable="w14 w15 w16se w16cid w16 w16cex w16sdtdh">
+<w:fonts xmlns:mc="http://schemas.openxmlformats.org/markup-compatibility/2006" xmlns:r="http://schemas.openxmlformats.org/officeDocument/2006/relationships" xmlns:w="http://schemas.openxmlformats.org/wordprocessingml/2006/main" xmlns:w14="http://schemas.microsoft.com/office/word/2010/wordml" xmlns:w15="http://schemas.microsoft.com/office/word/2012/wordml" xmlns:w16cex="http://schemas.microsoft.com/office/word/2018/wordml/cex" xmlns:w16cid="http://schemas.microsoft.com/office/word/2016/wordml/cid" xmlns:w16="http://schemas.microsoft.com/office/word/2018/wordml" xmlns:w16se="http://schemas.microsoft.com/office/word/2015/wordml/symex" mc:Ignorable="w14 w15 w16se w16cid w16 w16cex">
   <w:font w:name="Times New Roman">
     <w:panose1 w:val="02020603050405020304"/>
     <w:charset w:val="00"/>
@@ -6186,6 +6636,7 @@
   </w:font>
   <w:font w:name="Yu Mincho">
     <w:altName w:val="游明朝"/>
+    <w:panose1 w:val="02020400000000000000"/>
     <w:charset w:val="80"/>
     <w:family w:val="roman"/>
     <w:pitch w:val="variable"/>
@@ -6231,7 +6682,7 @@
 </file>
 
 <file path=word/glossary/settings.xml><?xml version="1.0" encoding="utf-8"?>
-<w:settings xmlns:mc="http://schemas.openxmlformats.org/markup-compatibility/2006" xmlns:o="urn:schemas-microsoft-com:office:office" xmlns:r="http://schemas.openxmlformats.org/officeDocument/2006/relationships" xmlns:m="http://schemas.openxmlformats.org/officeDocument/2006/math" xmlns:v="urn:schemas-microsoft-com:vml" xmlns:w10="urn:schemas-microsoft-com:office:word" xmlns:w="http://schemas.openxmlformats.org/wordprocessingml/2006/main" xmlns:w14="http://schemas.microsoft.com/office/word/2010/wordml" xmlns:w15="http://schemas.microsoft.com/office/word/2012/wordml" xmlns:w16cex="http://schemas.microsoft.com/office/word/2018/wordml/cex" xmlns:w16cid="http://schemas.microsoft.com/office/word/2016/wordml/cid" xmlns:w16="http://schemas.microsoft.com/office/word/2018/wordml" xmlns:w16sdtdh="http://schemas.microsoft.com/office/word/2020/wordml/sdtdatahash" xmlns:w16se="http://schemas.microsoft.com/office/word/2015/wordml/symex" xmlns:sl="http://schemas.openxmlformats.org/schemaLibrary/2006/main" mc:Ignorable="w14 w15 w16se w16cid w16 w16cex w16sdtdh">
+<w:settings xmlns:mc="http://schemas.openxmlformats.org/markup-compatibility/2006" xmlns:o="urn:schemas-microsoft-com:office:office" xmlns:r="http://schemas.openxmlformats.org/officeDocument/2006/relationships" xmlns:m="http://schemas.openxmlformats.org/officeDocument/2006/math" xmlns:v="urn:schemas-microsoft-com:vml" xmlns:w10="urn:schemas-microsoft-com:office:word" xmlns:w="http://schemas.openxmlformats.org/wordprocessingml/2006/main" xmlns:w14="http://schemas.microsoft.com/office/word/2010/wordml" xmlns:w15="http://schemas.microsoft.com/office/word/2012/wordml" xmlns:w16cex="http://schemas.microsoft.com/office/word/2018/wordml/cex" xmlns:w16cid="http://schemas.microsoft.com/office/word/2016/wordml/cid" xmlns:w16="http://schemas.microsoft.com/office/word/2018/wordml" xmlns:w16se="http://schemas.microsoft.com/office/word/2015/wordml/symex" xmlns:sl="http://schemas.openxmlformats.org/schemaLibrary/2006/main" mc:Ignorable="w14 w15 w16se w16cid w16 w16cex">
   <w:view w:val="normal"/>
   <w:defaultTabStop w:val="720"/>
   <w:hyphenationZone w:val="396"/>
@@ -6247,6 +6698,7 @@
   </w:compat>
   <w:rsids>
     <w:rsidRoot w:val="00A419A3"/>
+    <w:rsid w:val="000D54AA"/>
     <w:rsid w:val="001128BE"/>
     <w:rsid w:val="002C06E3"/>
     <w:rsid w:val="00524538"/>
@@ -6273,14 +6725,14 @@
   </m:mathPr>
   <w:themeFontLang w:val="en-US" w:eastAsia="ja-JP"/>
   <w:clrSchemeMapping w:bg1="light1" w:t1="dark1" w:bg2="light2" w:t2="dark2" w:accent1="accent1" w:accent2="accent2" w:accent3="accent3" w:accent4="accent4" w:accent5="accent5" w:accent6="accent6" w:hyperlink="hyperlink" w:followedHyperlink="followedHyperlink"/>
-  <w:decimalSymbol w:val=","/>
-  <w:listSeparator w:val=";"/>
+  <w:decimalSymbol w:val="."/>
+  <w:listSeparator w:val=","/>
   <w15:chartTrackingRefBased/>
 </w:settings>
 </file>
 
 <file path=word/glossary/styles.xml><?xml version="1.0" encoding="utf-8"?>
-<w:styles xmlns:mc="http://schemas.openxmlformats.org/markup-compatibility/2006" xmlns:r="http://schemas.openxmlformats.org/officeDocument/2006/relationships" xmlns:w="http://schemas.openxmlformats.org/wordprocessingml/2006/main" xmlns:w14="http://schemas.microsoft.com/office/word/2010/wordml" xmlns:w15="http://schemas.microsoft.com/office/word/2012/wordml" xmlns:w16cex="http://schemas.microsoft.com/office/word/2018/wordml/cex" xmlns:w16cid="http://schemas.microsoft.com/office/word/2016/wordml/cid" xmlns:w16="http://schemas.microsoft.com/office/word/2018/wordml" xmlns:w16sdtdh="http://schemas.microsoft.com/office/word/2020/wordml/sdtdatahash" xmlns:w16se="http://schemas.microsoft.com/office/word/2015/wordml/symex" mc:Ignorable="w14 w15 w16se w16cid w16 w16cex w16sdtdh">
+<w:styles xmlns:mc="http://schemas.openxmlformats.org/markup-compatibility/2006" xmlns:r="http://schemas.openxmlformats.org/officeDocument/2006/relationships" xmlns:w="http://schemas.openxmlformats.org/wordprocessingml/2006/main" xmlns:w14="http://schemas.microsoft.com/office/word/2010/wordml" xmlns:w15="http://schemas.microsoft.com/office/word/2012/wordml" xmlns:w16cex="http://schemas.microsoft.com/office/word/2018/wordml/cex" xmlns:w16cid="http://schemas.microsoft.com/office/word/2016/wordml/cid" xmlns:w16="http://schemas.microsoft.com/office/word/2018/wordml" xmlns:w16se="http://schemas.microsoft.com/office/word/2015/wordml/symex" mc:Ignorable="w14 w15 w16se w16cid w16 w16cex">
   <w:docDefaults>
     <w:rPrDefault>
       <w:rPr>
@@ -6674,17 +7126,17 @@
     <w:lsdException w:name="Unresolved Mention" w:semiHidden="1" w:unhideWhenUsed="1"/>
     <w:lsdException w:name="Smart Link" w:semiHidden="1" w:unhideWhenUsed="1"/>
   </w:latentStyles>
-  <w:style w:type="paragraph" w:default="1" w:styleId="prastasis">
+  <w:style w:type="paragraph" w:default="1" w:styleId="Normal">
     <w:name w:val="Normal"/>
     <w:qFormat/>
   </w:style>
-  <w:style w:type="character" w:default="1" w:styleId="Numatytasispastraiposriftas">
+  <w:style w:type="character" w:default="1" w:styleId="DefaultParagraphFont">
     <w:name w:val="Default Paragraph Font"/>
     <w:uiPriority w:val="1"/>
     <w:semiHidden/>
     <w:unhideWhenUsed/>
   </w:style>
-  <w:style w:type="table" w:default="1" w:styleId="prastojilentel">
+  <w:style w:type="table" w:default="1" w:styleId="TableNormal">
     <w:name w:val="Normal Table"/>
     <w:uiPriority w:val="99"/>
     <w:semiHidden/>
@@ -6699,7 +7151,7 @@
       </w:tblCellMar>
     </w:tblPr>
   </w:style>
-  <w:style w:type="numbering" w:default="1" w:styleId="Sraonra">
+  <w:style w:type="numbering" w:default="1" w:styleId="NoList">
     <w:name w:val="No List"/>
     <w:uiPriority w:val="99"/>
     <w:semiHidden/>
@@ -6725,7 +7177,7 @@
 </file>
 
 <file path=word/glossary/webSettings.xml><?xml version="1.0" encoding="utf-8"?>
-<w:webSettings xmlns:mc="http://schemas.openxmlformats.org/markup-compatibility/2006" xmlns:r="http://schemas.openxmlformats.org/officeDocument/2006/relationships" xmlns:w="http://schemas.openxmlformats.org/wordprocessingml/2006/main" xmlns:w14="http://schemas.microsoft.com/office/word/2010/wordml" xmlns:w15="http://schemas.microsoft.com/office/word/2012/wordml" xmlns:w16cex="http://schemas.microsoft.com/office/word/2018/wordml/cex" xmlns:w16cid="http://schemas.microsoft.com/office/word/2016/wordml/cid" xmlns:w16="http://schemas.microsoft.com/office/word/2018/wordml" xmlns:w16sdtdh="http://schemas.microsoft.com/office/word/2020/wordml/sdtdatahash" xmlns:w16se="http://schemas.microsoft.com/office/word/2015/wordml/symex" mc:Ignorable="w14 w15 w16se w16cid w16 w16cex w16sdtdh">
+<w:webSettings xmlns:mc="http://schemas.openxmlformats.org/markup-compatibility/2006" xmlns:r="http://schemas.openxmlformats.org/officeDocument/2006/relationships" xmlns:w="http://schemas.openxmlformats.org/wordprocessingml/2006/main" xmlns:w14="http://schemas.microsoft.com/office/word/2010/wordml" xmlns:w15="http://schemas.microsoft.com/office/word/2012/wordml" xmlns:w16cex="http://schemas.microsoft.com/office/word/2018/wordml/cex" xmlns:w16cid="http://schemas.microsoft.com/office/word/2016/wordml/cid" xmlns:w16="http://schemas.microsoft.com/office/word/2018/wordml" xmlns:w16se="http://schemas.microsoft.com/office/word/2015/wordml/symex" mc:Ignorable="w14 w15 w16se w16cid w16 w16cex">
   <w:optimizeForBrowser/>
   <w:allowPNG/>
 </w:webSettings>

</xml_diff>